<commit_message>
Expand manuscript with verified literature: scCRISPR generative models (DEGAS, scLAMBDA, PerturbNet), GNN/topology methods (EPGAT, FluxGAT, DeepHEN, LeAP), benchmarks (Project Score, CCLE, DRIVE, Keio, Hart/BEAN, Perturb-seq)
</commit_message>
<xml_diff>
--- a/manuscript_review.docx
+++ b/manuscript_review.docx
@@ -23,7 +23,7 @@
         <w:pStyle w:val="Date"/>
       </w:pPr>
       <w:r>
-        <w:t xml:space="preserve">2026-08-16</w:t>
+        <w:t xml:space="preserve">2026-08-18</w:t>
       </w:r>
     </w:p>
     <w:p>
@@ -81,55 +81,67 @@
         <w:t xml:space="preserve"> </w:t>
       </w:r>
       <w:r>
-        <w:t xml:space="preserve">(ii) functional-essentiality methods (DepMap, CoRe, ADAM) that measure the</w:t>
-      </w:r>
-      <w:r>
-        <w:t xml:space="preserve"> </w:t>
-      </w:r>
-      <w:r>
-        <w:t xml:space="preserve">phenotypic consequence of gene knockout. This review formalises the data</w:t>
-      </w:r>
-      <w:r>
-        <w:t xml:space="preserve"> </w:t>
-      </w:r>
-      <w:r>
-        <w:t xml:space="preserve">requirements of each approach, surveys and benchmarks the current state of the</w:t>
-      </w:r>
-      <w:r>
-        <w:t xml:space="preserve"> </w:t>
-      </w:r>
-      <w:r>
-        <w:t xml:space="preserve">art — including deep-learning predictors (DeepHE, EssTFNet, DeepVul, XGEP) — and</w:t>
-      </w:r>
-      <w:r>
-        <w:t xml:space="preserve"> </w:t>
-      </w:r>
-      <w:r>
-        <w:t xml:space="preserve">critically compares the two paradigms. We argue that the most promising direction</w:t>
-      </w:r>
-      <w:r>
-        <w:t xml:space="preserve"> </w:t>
-      </w:r>
-      <w:r>
-        <w:t xml:space="preserve">is a supervised, context-aware synthesis that uses functional CRISPR labels</w:t>
-      </w:r>
-      <w:r>
-        <w:t xml:space="preserve"> </w:t>
-      </w:r>
-      <w:r>
-        <w:t xml:space="preserve">(DepMap) to learn and reweight the expression-derived essentiality score, extended</w:t>
-      </w:r>
-      <w:r>
-        <w:t xml:space="preserve"> </w:t>
-      </w:r>
-      <w:r>
-        <w:t xml:space="preserve">by sequence / DNA-language-model features for unexpressed genes and cross-species</w:t>
-      </w:r>
-      <w:r>
-        <w:t xml:space="preserve"> </w:t>
-      </w:r>
-      <w:r>
-        <w:t xml:space="preserve">transfer, and delivered as co-essentiality modules rather than flat gene lists.</w:t>
+        <w:t xml:space="preserve">(ii) functional-essentiality methods (DepMap, Project Score, CoRe, ADAM) that</w:t>
+      </w:r>
+      <w:r>
+        <w:t xml:space="preserve"> </w:t>
+      </w:r>
+      <w:r>
+        <w:t xml:space="preserve">measure the phenotypic consequence of gene knockout. This review formalises the</w:t>
+      </w:r>
+      <w:r>
+        <w:t xml:space="preserve"> </w:t>
+      </w:r>
+      <w:r>
+        <w:t xml:space="preserve">data requirements of each approach, surveys and benchmarks the current state of</w:t>
+      </w:r>
+      <w:r>
+        <w:t xml:space="preserve"> </w:t>
+      </w:r>
+      <w:r>
+        <w:t xml:space="preserve">the art — including a rapidly growing family of deep-learning predictors (DeepHE,</w:t>
+      </w:r>
+      <w:r>
+        <w:t xml:space="preserve"> </w:t>
+      </w:r>
+      <w:r>
+        <w:t xml:space="preserve">EPGAT, FluxGAT, LeAP, EssentialGIN, DeepHEM, DeepVul, XGEP) and scCRISPR</w:t>
+      </w:r>
+      <w:r>
+        <w:t xml:space="preserve"> </w:t>
+      </w:r>
+      <w:r>
+        <w:t xml:space="preserve">generative models (DEGAS, scLAMBDA, PerturbNet) — and critically compares the two</w:t>
+      </w:r>
+      <w:r>
+        <w:t xml:space="preserve"> </w:t>
+      </w:r>
+      <w:r>
+        <w:t xml:space="preserve">paradigms. We argue that the most promising direction is a supervised,</w:t>
+      </w:r>
+      <w:r>
+        <w:t xml:space="preserve"> </w:t>
+      </w:r>
+      <w:r>
+        <w:t xml:space="preserve">context-aware synthesis that uses functional CRISPR labels (DepMap) to learn and</w:t>
+      </w:r>
+      <w:r>
+        <w:t xml:space="preserve"> </w:t>
+      </w:r>
+      <w:r>
+        <w:t xml:space="preserve">reweight the expression-derived essentiality score, extended by sequence /</w:t>
+      </w:r>
+      <w:r>
+        <w:t xml:space="preserve"> </w:t>
+      </w:r>
+      <w:r>
+        <w:t xml:space="preserve">DNA-language-model features for unexpressed genes and cross-species transfer, and</w:t>
+      </w:r>
+      <w:r>
+        <w:t xml:space="preserve"> </w:t>
+      </w:r>
+      <w:r>
+        <w:t xml:space="preserve">delivered as co-essentiality modules rather than flat gene lists.</w:t>
       </w:r>
     </w:p>
     <w:bookmarkStart w:id="9" w:name="introduction"/>
@@ -186,7 +198,7 @@
         <w:t xml:space="preserve"> </w:t>
       </w:r>
       <w:r>
-        <w:t xml:space="preserve">conservation and single-gene deletion studies in microbes (DEG, OGEE). The</w:t>
+        <w:t xml:space="preserve">conservation and single-gene deletion studies in microbes (DEG, OGEE, Keio). The</w:t>
       </w:r>
       <w:r>
         <w:t xml:space="preserve"> </w:t>
@@ -364,13 +376,13 @@
         <w:t xml:space="preserve"> </w:t>
       </w:r>
       <w:r>
-        <w:t xml:space="preserve">scores (e.g. DepMap CERES). This is the</w:t>
-      </w:r>
-      <w:r>
-        <w:t xml:space="preserve"> </w:t>
-      </w:r>
-      <w:r>
-        <w:t xml:space="preserve">operational gold standard for</w:t>
+        <w:t xml:space="preserve">scores (e.g. DepMap CERES, Project Score). This is</w:t>
+      </w:r>
+      <w:r>
+        <w:t xml:space="preserve"> </w:t>
+      </w:r>
+      <w:r>
+        <w:t xml:space="preserve">the operational gold standard for</w:t>
       </w:r>
       <w:r>
         <w:t xml:space="preserve"> </w:t>
@@ -384,41 +396,78 @@
     </w:p>
     <w:p>
       <w:pPr>
-        <w:pStyle w:val="FirstParagraph"/>
-      </w:pPr>
-      <w:r>
-        <w:t xml:space="preserve">The two definitions are related but</w:t>
-      </w:r>
-      <w:r>
-        <w:t xml:space="preserve"> </w:t>
-      </w:r>
+        <w:pStyle w:val="Compact"/>
+        <w:numPr>
+          <w:ilvl w:val="0"/>
+          <w:numId w:val="1001"/>
+        </w:numPr>
+      </w:pPr>
       <w:r>
         <w:rPr>
           <w:b/>
           <w:bCs/>
         </w:rPr>
-        <w:t xml:space="preserve">not identical</w:t>
-      </w:r>
-      <w:r>
-        <w:t xml:space="preserve">: expression-robust genes are</w:t>
-      </w:r>
-      <w:r>
-        <w:t xml:space="preserve"> </w:t>
-      </w:r>
-      <w:r>
-        <w:t xml:space="preserve">often functionally essential, but the reverse is not guaranteed, and highly</w:t>
-      </w:r>
-      <w:r>
-        <w:t xml:space="preserve"> </w:t>
-      </w:r>
-      <w:r>
-        <w:t xml:space="preserve">expressed genes can be dispensable. The central open question — and the subject of</w:t>
-      </w:r>
-      <w:r>
-        <w:t xml:space="preserve"> </w:t>
-      </w:r>
-      <w:r>
-        <w:t xml:space="preserve">this review — is how to reconcile and improve these paradigms.</w:t>
+        <w:t xml:space="preserve">Predictive deep-learning approach (emergent).</w:t>
+      </w:r>
+      <w:r>
+        <w:t xml:space="preserve"> </w:t>
+      </w:r>
+      <w:r>
+        <w:t xml:space="preserve">A third, rapidly growing</w:t>
+      </w:r>
+      <w:r>
+        <w:t xml:space="preserve"> </w:t>
+      </w:r>
+      <w:r>
+        <w:t xml:space="preserve">family uses machine learning — including graph neural networks (GNNs),</w:t>
+      </w:r>
+      <w:r>
+        <w:t xml:space="preserve"> </w:t>
+      </w:r>
+      <w:r>
+        <w:t xml:space="preserve">transformers, and generative models — to</w:t>
+      </w:r>
+      <w:r>
+        <w:t xml:space="preserve"> </w:t>
+      </w:r>
+      <w:r>
+        <w:rPr>
+          <w:i/>
+          <w:iCs/>
+        </w:rPr>
+        <w:t xml:space="preserve">predict</w:t>
+      </w:r>
+      <w:r>
+        <w:t xml:space="preserve"> </w:t>
+      </w:r>
+      <w:r>
+        <w:t xml:space="preserve">essentiality from features</w:t>
+      </w:r>
+      <w:r>
+        <w:t xml:space="preserve"> </w:t>
+      </w:r>
+      <w:r>
+        <w:t xml:space="preserve">(sequence, expression, networks, multi-omics), often trained against CRISPR</w:t>
+      </w:r>
+      <w:r>
+        <w:t xml:space="preserve"> </w:t>
+      </w:r>
+      <w:r>
+        <w:t xml:space="preserve">labels.</w:t>
+      </w:r>
+    </w:p>
+    <w:p>
+      <w:pPr>
+        <w:pStyle w:val="FirstParagraph"/>
+      </w:pPr>
+      <w:r>
+        <w:t xml:space="preserve">The central open question — the subject of this review — is how the expression,</w:t>
+      </w:r>
+      <w:r>
+        <w:t xml:space="preserve"> </w:t>
+      </w:r>
+      <w:r>
+        <w:t xml:space="preserve">functional, and predictive paradigms relate, and how they can be reconciled.</w:t>
       </w:r>
     </w:p>
     <w:p>
@@ -735,29 +784,29 @@
               <w:pStyle w:val="Compact"/>
             </w:pPr>
             <w:r>
-              <w:t xml:space="preserve">Protein–protein interaction</w:t>
-            </w:r>
-          </w:p>
-        </w:tc>
-        <w:tc>
-          <w:tcPr/>
-          <w:p>
-            <w:pPr>
-              <w:pStyle w:val="Compact"/>
-            </w:pPr>
-            <w:r>
-              <w:t xml:space="preserve">STRING, BioGRID</w:t>
-            </w:r>
-          </w:p>
-        </w:tc>
-        <w:tc>
-          <w:tcPr/>
-          <w:p>
-            <w:pPr>
-              <w:pStyle w:val="Compact"/>
-            </w:pPr>
-            <w:r>
-              <w:t xml:space="preserve">network centrality as importance feature</w:t>
+              <w:t xml:space="preserve">Protein–protein interaction / networks</w:t>
+            </w:r>
+          </w:p>
+        </w:tc>
+        <w:tc>
+          <w:tcPr/>
+          <w:p>
+            <w:pPr>
+              <w:pStyle w:val="Compact"/>
+            </w:pPr>
+            <w:r>
+              <w:t xml:space="preserve">STRING, BioGRID, metabolic networks</w:t>
+            </w:r>
+          </w:p>
+        </w:tc>
+        <w:tc>
+          <w:tcPr/>
+          <w:p>
+            <w:pPr>
+              <w:pStyle w:val="Compact"/>
+            </w:pPr>
+            <w:r>
+              <w:t xml:space="preserve">network centrality / topology features</w:t>
             </w:r>
           </w:p>
         </w:tc>
@@ -792,7 +841,7 @@
               <w:pStyle w:val="Compact"/>
             </w:pPr>
             <w:r>
-              <w:t xml:space="preserve">cover unexpressed genes</w:t>
+              <w:t xml:space="preserve">cover unexpressed genes; DNA-LLM</w:t>
             </w:r>
           </w:p>
         </w:tc>
@@ -828,6 +877,51 @@
             </w:pPr>
             <w:r>
               <w:t xml:space="preserve">transferable, cross-species embeddings</w:t>
+            </w:r>
+          </w:p>
+        </w:tc>
+      </w:tr>
+      <w:tr>
+        <w:tc>
+          <w:tcPr/>
+          <w:p>
+            <w:pPr>
+              <w:pStyle w:val="Compact"/>
+            </w:pPr>
+            <w:r>
+              <w:t xml:space="preserve">Multi-omics cancer covariates</w:t>
+            </w:r>
+          </w:p>
+        </w:tc>
+        <w:tc>
+          <w:tcPr/>
+          <w:p>
+            <w:pPr>
+              <w:pStyle w:val="Compact"/>
+            </w:pPr>
+            <w:r>
+              <w:rPr>
+                <w:b/>
+                <w:bCs/>
+              </w:rPr>
+              <w:t xml:space="preserve">CCLE</w:t>
+            </w:r>
+            <w:r>
+              <w:t xml:space="preserve"> </w:t>
+            </w:r>
+            <w:r>
+              <w:t xml:space="preserve">(expression, CNV, mutation, methylation)</w:t>
+            </w:r>
+          </w:p>
+        </w:tc>
+        <w:tc>
+          <w:tcPr/>
+          <w:p>
+            <w:pPr>
+              <w:pStyle w:val="Compact"/>
+            </w:pPr>
+            <w:r>
+              <w:t xml:space="preserve">context-specific dependency features</w:t>
             </w:r>
           </w:p>
         </w:tc>
@@ -922,7 +1016,23 @@
               <w:t xml:space="preserve"> </w:t>
             </w:r>
             <w:r>
-              <w:t xml:space="preserve">(~1000 lines × 18k genes)</w:t>
+              <w:t xml:space="preserve">(~1100 lines × 18k genes);</w:t>
+            </w:r>
+            <w:r>
+              <w:t xml:space="preserve"> </w:t>
+            </w:r>
+            <w:r>
+              <w:rPr>
+                <w:b/>
+                <w:bCs/>
+              </w:rPr>
+              <w:t xml:space="preserve">Project Score</w:t>
+            </w:r>
+            <w:r>
+              <w:t xml:space="preserve"> </w:t>
+            </w:r>
+            <w:r>
+              <w:t xml:space="preserve">(Sanger)</w:t>
             </w:r>
           </w:p>
         </w:tc>
@@ -946,18 +1056,46 @@
               <w:pStyle w:val="Compact"/>
             </w:pPr>
             <w:r>
-              <w:t xml:space="preserve">Core-fitness sets</w:t>
-            </w:r>
-          </w:p>
-        </w:tc>
-        <w:tc>
-          <w:tcPr/>
-          <w:p>
-            <w:pPr>
-              <w:pStyle w:val="Compact"/>
-            </w:pPr>
-            <w:r>
-              <w:t xml:space="preserve">DepMap-Analytics/CoRe</w:t>
+              <w:t xml:space="preserve">Core-fitness / true-essential sets</w:t>
+            </w:r>
+          </w:p>
+        </w:tc>
+        <w:tc>
+          <w:tcPr/>
+          <w:p>
+            <w:pPr>
+              <w:pStyle w:val="Compact"/>
+            </w:pPr>
+            <w:r>
+              <w:t xml:space="preserve">DepMap-Analytics/CoRe;</w:t>
+            </w:r>
+            <w:r>
+              <w:t xml:space="preserve"> </w:t>
+            </w:r>
+            <w:r>
+              <w:rPr>
+                <w:b/>
+                <w:bCs/>
+              </w:rPr>
+              <w:t xml:space="preserve">Hart/BEAN</w:t>
+            </w:r>
+            <w:r>
+              <w:t xml:space="preserve"> </w:t>
+            </w:r>
+            <w:r>
+              <w:t xml:space="preserve">curated</w:t>
+            </w:r>
+            <w:r>
+              <w:t xml:space="preserve"> </w:t>
+            </w:r>
+            <w:r>
+              <w:t xml:space="preserve">“true”</w:t>
+            </w:r>
+            <w:r>
+              <w:t xml:space="preserve"> </w:t>
+            </w:r>
+            <w:r>
+              <w:t xml:space="preserve">essential gene lists</w:t>
             </w:r>
           </w:p>
         </w:tc>
@@ -981,17 +1119,21 @@
               <w:pStyle w:val="Compact"/>
             </w:pPr>
             <w:r>
-              <w:t xml:space="preserve">Context-specific sets</w:t>
-            </w:r>
-          </w:p>
-        </w:tc>
-        <w:tc>
-          <w:tcPr/>
-          <w:p>
-            <w:pPr>
-              <w:pStyle w:val="Compact"/>
-            </w:pPr>
-            <w:r>
+              <w:t xml:space="preserve">Context-specific essentiality</w:t>
+            </w:r>
+          </w:p>
+        </w:tc>
+        <w:tc>
+          <w:tcPr/>
+          <w:p>
+            <w:pPr>
+              <w:pStyle w:val="Compact"/>
+            </w:pPr>
+            <w:r>
+              <w:rPr>
+                <w:b/>
+                <w:bCs/>
+              </w:rPr>
               <w:t xml:space="preserve">ADAM / ADAM2</w:t>
             </w:r>
           </w:p>
@@ -1016,29 +1158,59 @@
               <w:pStyle w:val="Compact"/>
             </w:pPr>
             <w:r>
-              <w:t xml:space="preserve">Essential-gene catalogs</w:t>
-            </w:r>
-          </w:p>
-        </w:tc>
-        <w:tc>
-          <w:tcPr/>
-          <w:p>
-            <w:pPr>
-              <w:pStyle w:val="Compact"/>
-            </w:pPr>
-            <w:r>
-              <w:t xml:space="preserve">DEG, OGEE</w:t>
-            </w:r>
-          </w:p>
-        </w:tc>
-        <w:tc>
-          <w:tcPr/>
-          <w:p>
-            <w:pPr>
-              <w:pStyle w:val="Compact"/>
-            </w:pPr>
-            <w:r>
-              <w:t xml:space="preserve">cross-species validation</w:t>
+              <w:t xml:space="preserve">RNAi cross-validation</w:t>
+            </w:r>
+          </w:p>
+        </w:tc>
+        <w:tc>
+          <w:tcPr/>
+          <w:p>
+            <w:pPr>
+              <w:pStyle w:val="Compact"/>
+            </w:pPr>
+            <w:r>
+              <w:rPr>
+                <w:b/>
+                <w:bCs/>
+              </w:rPr>
+              <w:t xml:space="preserve">DRIVE</w:t>
+            </w:r>
+            <w:r>
+              <w:t xml:space="preserve">,</w:t>
+            </w:r>
+            <w:r>
+              <w:t xml:space="preserve"> </w:t>
+            </w:r>
+            <w:r>
+              <w:rPr>
+                <w:b/>
+                <w:bCs/>
+              </w:rPr>
+              <w:t xml:space="preserve">Achilles RNAi</w:t>
+            </w:r>
+            <w:r>
+              <w:t xml:space="preserve">,</w:t>
+            </w:r>
+            <w:r>
+              <w:t xml:space="preserve"> </w:t>
+            </w:r>
+            <w:r>
+              <w:rPr>
+                <w:b/>
+                <w:bCs/>
+              </w:rPr>
+              <w:t xml:space="preserve">GenomeRNAi</w:t>
+            </w:r>
+          </w:p>
+        </w:tc>
+        <w:tc>
+          <w:tcPr/>
+          <w:p>
+            <w:pPr>
+              <w:pStyle w:val="Compact"/>
+            </w:pPr>
+            <w:r>
+              <w:t xml:space="preserve">cross-platform agreement</w:t>
             </w:r>
           </w:p>
         </w:tc>
@@ -1051,6 +1223,96 @@
               <w:pStyle w:val="Compact"/>
             </w:pPr>
             <w:r>
+              <w:t xml:space="preserve">Microbial essentiality</w:t>
+            </w:r>
+          </w:p>
+        </w:tc>
+        <w:tc>
+          <w:tcPr/>
+          <w:p>
+            <w:pPr>
+              <w:pStyle w:val="Compact"/>
+            </w:pPr>
+            <w:r>
+              <w:rPr>
+                <w:b/>
+                <w:bCs/>
+              </w:rPr>
+              <w:t xml:space="preserve">Keio</w:t>
+            </w:r>
+            <w:r>
+              <w:t xml:space="preserve"> </w:t>
+            </w:r>
+            <w:r>
+              <w:t xml:space="preserve">(</w:t>
+            </w:r>
+            <w:r>
+              <w:rPr>
+                <w:i/>
+                <w:iCs/>
+              </w:rPr>
+              <w:t xml:space="preserve">E. coli</w:t>
+            </w:r>
+            <w:r>
+              <w:t xml:space="preserve">), DEG, OGEE</w:t>
+            </w:r>
+          </w:p>
+        </w:tc>
+        <w:tc>
+          <w:tcPr/>
+          <w:p>
+            <w:pPr>
+              <w:pStyle w:val="Compact"/>
+            </w:pPr>
+            <w:r>
+              <w:t xml:space="preserve">species-transfer validation</w:t>
+            </w:r>
+          </w:p>
+        </w:tc>
+      </w:tr>
+      <w:tr>
+        <w:tc>
+          <w:tcPr/>
+          <w:p>
+            <w:pPr>
+              <w:pStyle w:val="Compact"/>
+            </w:pPr>
+            <w:r>
+              <w:t xml:space="preserve">Essential-gene catalogs</w:t>
+            </w:r>
+          </w:p>
+        </w:tc>
+        <w:tc>
+          <w:tcPr/>
+          <w:p>
+            <w:pPr>
+              <w:pStyle w:val="Compact"/>
+            </w:pPr>
+            <w:r>
+              <w:t xml:space="preserve">DEG, OGEE</w:t>
+            </w:r>
+          </w:p>
+        </w:tc>
+        <w:tc>
+          <w:tcPr/>
+          <w:p>
+            <w:pPr>
+              <w:pStyle w:val="Compact"/>
+            </w:pPr>
+            <w:r>
+              <w:t xml:space="preserve">cross-species validation</w:t>
+            </w:r>
+          </w:p>
+        </w:tc>
+      </w:tr>
+      <w:tr>
+        <w:tc>
+          <w:tcPr/>
+          <w:p>
+            <w:pPr>
+              <w:pStyle w:val="Compact"/>
+            </w:pPr>
+            <w:r>
               <w:t xml:space="preserve">Housekeeping catalogs</w:t>
             </w:r>
           </w:p>
@@ -1122,7 +1384,7 @@
         <w:t xml:space="preserve"> </w:t>
       </w:r>
       <w:r>
-        <w:t xml:space="preserve">(DepMap) as a supervision signal to</w:t>
+        <w:t xml:space="preserve">(DepMap / Project Score) as a supervision signal to</w:t>
       </w:r>
       <w:r>
         <w:t xml:space="preserve"> </w:t>
@@ -1138,12 +1400,18 @@
         <w:t xml:space="preserve"> </w:t>
       </w:r>
       <w:r>
-        <w:t xml:space="preserve">the expression-derived score.</w:t>
+        <w:t xml:space="preserve">the expression-derived</w:t>
+      </w:r>
+      <w:r>
+        <w:t xml:space="preserve"> </w:t>
+      </w:r>
+      <w:r>
+        <w:t xml:space="preserve">score.</w:t>
       </w:r>
     </w:p>
     <w:bookmarkEnd w:id="11"/>
     <w:bookmarkEnd w:id="12"/>
-    <w:bookmarkStart w:id="16" w:name="state-of-the-art-method-survey"/>
+    <w:bookmarkStart w:id="18" w:name="state-of-the-art-method-survey"/>
     <w:p>
       <w:pPr>
         <w:pStyle w:val="Heading1"/>
@@ -1262,13 +1530,13 @@
         <w:t xml:space="preserve"> </w:t>
       </w:r>
       <w:r>
-        <w:t xml:space="preserve">Genome-wide CRISPR-Cas9 dependency scores across ~1000 cancer</w:t>
-      </w:r>
-      <w:r>
-        <w:t xml:space="preserve"> </w:t>
-      </w:r>
-      <w:r>
-        <w:t xml:space="preserve">cell lines. The reference label set.</w:t>
+        <w:t xml:space="preserve">Genome-wide CRISPR-Cas9 dependency scores across ~1100 cancer</w:t>
+      </w:r>
+      <w:r>
+        <w:t xml:space="preserve"> </w:t>
+      </w:r>
+      <w:r>
+        <w:t xml:space="preserve">cell lines (Tsherniak 2017; Dempster/Achilles 2019). The reference label set.</w:t>
       </w:r>
       <w:r>
         <w:t xml:space="preserve"> </w:t>
@@ -1278,19 +1546,32 @@
           <w:b/>
           <w:bCs/>
         </w:rPr>
-        <w:t xml:space="preserve">CoRe</w:t>
-      </w:r>
-      <w:r>
-        <w:t xml:space="preserve"> </w:t>
-      </w:r>
-      <w:r>
-        <w:t xml:space="preserve">(DepMap-Analytics/CoRe) integrates</w:t>
-      </w:r>
-      <w:r>
-        <w:t xml:space="preserve"> </w:t>
-      </w:r>
-      <w:r>
-        <w:t xml:space="preserve">multiple screens to define core-fitness and common-essential genes.</w:t>
+        <w:t xml:space="preserve">Project Score</w:t>
+      </w:r>
+      <w:r>
+        <w:t xml:space="preserve"> </w:t>
+      </w:r>
+      <w:r>
+        <w:t xml:space="preserve">(Sanger, ~300+ lines; Dwane 2020; Behan 2019</w:t>
+      </w:r>
+      <w:r>
+        <w:t xml:space="preserve"> </w:t>
+      </w:r>
+      <w:r>
+        <w:rPr>
+          <w:i/>
+          <w:iCs/>
+        </w:rPr>
+        <w:t xml:space="preserve">Nature</w:t>
+      </w:r>
+      <w:r>
+        <w:t xml:space="preserve">) provides an</w:t>
+      </w:r>
+      <w:r>
+        <w:t xml:space="preserve"> </w:t>
+      </w:r>
+      <w:r>
+        <w:t xml:space="preserve">independent dependency resource for therapeutic-target prioritisation.</w:t>
       </w:r>
       <w:r>
         <w:t xml:space="preserve"> </w:t>
@@ -1300,13 +1581,43 @@
           <w:b/>
           <w:bCs/>
         </w:rPr>
-        <w:t xml:space="preserve">ADAM /</w:t>
+        <w:t xml:space="preserve">CoRe</w:t>
+      </w:r>
+      <w:r>
+        <w:t xml:space="preserve"> </w:t>
+      </w:r>
+      <w:r>
+        <w:t xml:space="preserve">(DepMap-Analytics/CoRe) integrates multiple screens to define core-fitness and</w:t>
+      </w:r>
+      <w:r>
+        <w:t xml:space="preserve"> </w:t>
+      </w:r>
+      <w:r>
+        <w:t xml:space="preserve">common-essential genes.</w:t>
+      </w:r>
+      <w:r>
+        <w:t xml:space="preserve"> </w:t>
       </w:r>
       <w:r>
         <w:rPr>
           <w:b/>
           <w:bCs/>
         </w:rPr>
+        <w:t xml:space="preserve">ADAM / ADAM2</w:t>
+      </w:r>
+      <w:r>
+        <w:t xml:space="preserve"> </w:t>
+      </w:r>
+      <w:r>
+        <w:t xml:space="preserve">(francescojm/ADAM) classify genes as</w:t>
+      </w:r>
+      <w:r>
+        <w:t xml:space="preserve"> </w:t>
+      </w:r>
+      <w:r>
+        <w:t xml:space="preserve">core-fitness (essential everywhere) versus context-specific.</w:t>
+      </w:r>
+      <w:r>
         <w:t xml:space="preserve"> </w:t>
       </w:r>
       <w:r>
@@ -1314,19 +1625,19 @@
           <w:b/>
           <w:bCs/>
         </w:rPr>
-        <w:t xml:space="preserve">ADAM2</w:t>
-      </w:r>
-      <w:r>
-        <w:t xml:space="preserve"> </w:t>
-      </w:r>
-      <w:r>
-        <w:t xml:space="preserve">(francescojm/ADAM) classify genes as core-fitness (essential everywhere)</w:t>
-      </w:r>
-      <w:r>
-        <w:t xml:space="preserve"> </w:t>
-      </w:r>
-      <w:r>
-        <w:t xml:space="preserve">versus context-specific (essential in a subset of lines).</w:t>
+        <w:t xml:space="preserve">MAGeCK</w:t>
+      </w:r>
+      <w:r>
+        <w:t xml:space="preserve"> </w:t>
+      </w:r>
+      <w:r>
+        <w:t xml:space="preserve">(liulab-dfci/MAGeCK) is the upstream tool that turns raw screen FASTQs into</w:t>
+      </w:r>
+      <w:r>
+        <w:t xml:space="preserve"> </w:t>
+      </w:r>
+      <w:r>
+        <w:t xml:space="preserve">essentiality calls. Population-fitness models</w:t>
       </w:r>
       <w:r>
         <w:t xml:space="preserve"> </w:t>
@@ -1336,19 +1647,29 @@
           <w:b/>
           <w:bCs/>
         </w:rPr>
-        <w:t xml:space="preserve">MAGeCK</w:t>
-      </w:r>
-      <w:r>
-        <w:t xml:space="preserve"> </w:t>
-      </w:r>
-      <w:r>
-        <w:t xml:space="preserve">(liulab-dfci/MAGeCK) is the upstream tool that turns raw screen FASTQs into</w:t>
-      </w:r>
-      <w:r>
-        <w:t xml:space="preserve"> </w:t>
-      </w:r>
-      <w:r>
-        <w:t xml:space="preserve">essentiality calls.</w:t>
+        <w:t xml:space="preserve">Chronos</w:t>
+      </w:r>
+      <w:r>
+        <w:t xml:space="preserve"> </w:t>
+      </w:r>
+      <w:r>
+        <w:t xml:space="preserve">(Dempster 2021) and</w:t>
+      </w:r>
+      <w:r>
+        <w:t xml:space="preserve"> </w:t>
+      </w:r>
+      <w:r>
+        <w:rPr>
+          <w:b/>
+          <w:bCs/>
+        </w:rPr>
+        <w:t xml:space="preserve">ACE</w:t>
+      </w:r>
+      <w:r>
+        <w:t xml:space="preserve"> </w:t>
+      </w:r>
+      <w:r>
+        <w:t xml:space="preserve">(Hutton 2021) improve gene-fitness inference from CRISPR data.</w:t>
       </w:r>
     </w:p>
     <w:bookmarkEnd w:id="14"/>
@@ -1369,9 +1690,10 @@
         <w:tblLook w:firstRow="1" w:lastRow="0" w:firstColumn="0" w:lastColumn="0" w:noHBand="0" w:noVBand="0" w:val="0020"/>
       </w:tblPr>
       <w:tblGrid>
-        <w:gridCol w:w="1760"/>
-        <w:gridCol w:w="3226"/>
-        <w:gridCol w:w="2933"/>
+        <w:gridCol w:w="1131"/>
+        <w:gridCol w:w="1131"/>
+        <w:gridCol w:w="3771"/>
+        <w:gridCol w:w="1885"/>
       </w:tblGrid>
       <w:tr>
         <w:trPr>
@@ -1395,7 +1717,18 @@
               <w:pStyle w:val="Compact"/>
             </w:pPr>
             <w:r>
-              <w:t xml:space="preserve">Repository</w:t>
+              <w:t xml:space="preserve">Year</w:t>
+            </w:r>
+          </w:p>
+        </w:tc>
+        <w:tc>
+          <w:tcPr/>
+          <w:p>
+            <w:pPr>
+              <w:pStyle w:val="Compact"/>
+            </w:pPr>
+            <w:r>
+              <w:t xml:space="preserve">Repository / arXiv</w:t>
             </w:r>
           </w:p>
         </w:tc>
@@ -1430,6 +1763,17 @@
               <w:pStyle w:val="Compact"/>
             </w:pPr>
             <w:r>
+              <w:t xml:space="preserve">2021</w:t>
+            </w:r>
+          </w:p>
+        </w:tc>
+        <w:tc>
+          <w:tcPr/>
+          <w:p>
+            <w:pPr>
+              <w:pStyle w:val="Compact"/>
+            </w:pPr>
+            <w:r>
               <w:t xml:space="preserve">xzhang2016/DeepHE</w:t>
             </w:r>
           </w:p>
@@ -1454,29 +1798,40 @@
               <w:pStyle w:val="Compact"/>
             </w:pPr>
             <w:r>
-              <w:t xml:space="preserve">EssTFNet</w:t>
-            </w:r>
-          </w:p>
-        </w:tc>
-        <w:tc>
-          <w:tcPr/>
-          <w:p>
-            <w:pPr>
-              <w:pStyle w:val="Compact"/>
-            </w:pPr>
-            <w:r>
-              <w:t xml:space="preserve">QIANJINYDX/EssTFNet</w:t>
-            </w:r>
-          </w:p>
-        </w:tc>
-        <w:tc>
-          <w:tcPr/>
-          <w:p>
-            <w:pPr>
-              <w:pStyle w:val="Compact"/>
-            </w:pPr>
-            <w:r>
-              <w:t xml:space="preserve">temporal-frequency DNN + DNA language model</w:t>
+              <w:t xml:space="preserve">EPGAT</w:t>
+            </w:r>
+          </w:p>
+        </w:tc>
+        <w:tc>
+          <w:tcPr/>
+          <w:p>
+            <w:pPr>
+              <w:pStyle w:val="Compact"/>
+            </w:pPr>
+            <w:r>
+              <w:t xml:space="preserve">2020</w:t>
+            </w:r>
+          </w:p>
+        </w:tc>
+        <w:tc>
+          <w:tcPr/>
+          <w:p>
+            <w:pPr>
+              <w:pStyle w:val="Compact"/>
+            </w:pPr>
+            <w:r>
+              <w:t xml:space="preserve">arXiv:2007.09671</w:t>
+            </w:r>
+          </w:p>
+        </w:tc>
+        <w:tc>
+          <w:tcPr/>
+          <w:p>
+            <w:pPr>
+              <w:pStyle w:val="Compact"/>
+            </w:pPr>
+            <w:r>
+              <w:t xml:space="preserve">graph attention over PPI networks</w:t>
             </w:r>
           </w:p>
         </w:tc>
@@ -1489,29 +1844,40 @@
               <w:pStyle w:val="Compact"/>
             </w:pPr>
             <w:r>
-              <w:t xml:space="preserve">DeeplyEssential</w:t>
-            </w:r>
-          </w:p>
-        </w:tc>
-        <w:tc>
-          <w:tcPr/>
-          <w:p>
-            <w:pPr>
-              <w:pStyle w:val="Compact"/>
-            </w:pPr>
-            <w:r>
-              <w:t xml:space="preserve">ucrbioinfo/DeeplyEssential</w:t>
-            </w:r>
-          </w:p>
-        </w:tc>
-        <w:tc>
-          <w:tcPr/>
-          <w:p>
-            <w:pPr>
-              <w:pStyle w:val="Compact"/>
-            </w:pPr>
-            <w:r>
-              <w:t xml:space="preserve">microbial essentiality DNN</w:t>
+              <w:t xml:space="preserve">FluxGAT</w:t>
+            </w:r>
+          </w:p>
+        </w:tc>
+        <w:tc>
+          <w:tcPr/>
+          <w:p>
+            <w:pPr>
+              <w:pStyle w:val="Compact"/>
+            </w:pPr>
+            <w:r>
+              <w:t xml:space="preserve">2024</w:t>
+            </w:r>
+          </w:p>
+        </w:tc>
+        <w:tc>
+          <w:tcPr/>
+          <w:p>
+            <w:pPr>
+              <w:pStyle w:val="Compact"/>
+            </w:pPr>
+            <w:r>
+              <w:t xml:space="preserve">arXiv:2403.18666</w:t>
+            </w:r>
+          </w:p>
+        </w:tc>
+        <w:tc>
+          <w:tcPr/>
+          <w:p>
+            <w:pPr>
+              <w:pStyle w:val="Compact"/>
+            </w:pPr>
+            <w:r>
+              <w:t xml:space="preserve">flux-sampling + graph attention on metabolic networks</w:t>
             </w:r>
           </w:p>
         </w:tc>
@@ -1524,29 +1890,56 @@
               <w:pStyle w:val="Compact"/>
             </w:pPr>
             <w:r>
-              <w:t xml:space="preserve">DeepVul</w:t>
-            </w:r>
-          </w:p>
-        </w:tc>
-        <w:tc>
-          <w:tcPr/>
-          <w:p>
-            <w:pPr>
-              <w:pStyle w:val="Compact"/>
-            </w:pPr>
-            <w:r>
-              <w:t xml:space="preserve">alaa27/DeepVul</w:t>
-            </w:r>
-          </w:p>
-        </w:tc>
-        <w:tc>
-          <w:tcPr/>
-          <w:p>
-            <w:pPr>
-              <w:pStyle w:val="Compact"/>
-            </w:pPr>
-            <w:r>
-              <w:t xml:space="preserve">multi-task transformer: essentiality + drug response</w:t>
+              <w:t xml:space="preserve">DeepHEN</w:t>
+            </w:r>
+          </w:p>
+        </w:tc>
+        <w:tc>
+          <w:tcPr/>
+          <w:p>
+            <w:pPr>
+              <w:pStyle w:val="Compact"/>
+            </w:pPr>
+            <w:r>
+              <w:t xml:space="preserve">2023</w:t>
+            </w:r>
+          </w:p>
+        </w:tc>
+        <w:tc>
+          <w:tcPr/>
+          <w:p>
+            <w:pPr>
+              <w:pStyle w:val="Compact"/>
+            </w:pPr>
+            <w:r>
+              <w:t xml:space="preserve">arXiv:2309.10008</w:t>
+            </w:r>
+          </w:p>
+        </w:tc>
+        <w:tc>
+          <w:tcPr/>
+          <w:p>
+            <w:pPr>
+              <w:pStyle w:val="Compact"/>
+            </w:pPr>
+            <w:r>
+              <w:t xml:space="preserve">deep model for essential</w:t>
+            </w:r>
+            <w:r>
+              <w:t xml:space="preserve"> </w:t>
+            </w:r>
+            <w:r>
+              <w:rPr>
+                <w:b/>
+                <w:bCs/>
+              </w:rPr>
+              <w:t xml:space="preserve">lncRNA</w:t>
+            </w:r>
+            <w:r>
+              <w:t xml:space="preserve"> </w:t>
+            </w:r>
+            <w:r>
+              <w:t xml:space="preserve">genes</w:t>
             </w:r>
           </w:p>
         </w:tc>
@@ -1559,6 +1952,374 @@
               <w:pStyle w:val="Compact"/>
             </w:pPr>
             <w:r>
+              <w:t xml:space="preserve">LeAP</w:t>
+            </w:r>
+          </w:p>
+        </w:tc>
+        <w:tc>
+          <w:tcPr/>
+          <w:p>
+            <w:pPr>
+              <w:pStyle w:val="Compact"/>
+            </w:pPr>
+            <w:r>
+              <w:t xml:space="preserve">2025</w:t>
+            </w:r>
+          </w:p>
+        </w:tc>
+        <w:tc>
+          <w:tcPr/>
+          <w:p>
+            <w:pPr>
+              <w:pStyle w:val="Compact"/>
+            </w:pPr>
+            <w:r>
+              <w:t xml:space="preserve">arXiv:2502.15646</w:t>
+            </w:r>
+          </w:p>
+        </w:tc>
+        <w:tc>
+          <w:tcPr/>
+          <w:p>
+            <w:pPr>
+              <w:pStyle w:val="Compact"/>
+            </w:pPr>
+            <w:r>
+              <w:t xml:space="preserve">layered ensemble of autoencoders + predictors</w:t>
+            </w:r>
+          </w:p>
+        </w:tc>
+      </w:tr>
+      <w:tr>
+        <w:tc>
+          <w:tcPr/>
+          <w:p>
+            <w:pPr>
+              <w:pStyle w:val="Compact"/>
+            </w:pPr>
+            <w:r>
+              <w:t xml:space="preserve">Topology-ML (metabolism)</w:t>
+            </w:r>
+          </w:p>
+        </w:tc>
+        <w:tc>
+          <w:tcPr/>
+          <w:p>
+            <w:pPr>
+              <w:pStyle w:val="Compact"/>
+            </w:pPr>
+            <w:r>
+              <w:t xml:space="preserve">2025</w:t>
+            </w:r>
+          </w:p>
+        </w:tc>
+        <w:tc>
+          <w:tcPr/>
+          <w:p>
+            <w:pPr>
+              <w:pStyle w:val="Compact"/>
+            </w:pPr>
+            <w:r>
+              <w:t xml:space="preserve">arXiv:2507.20406</w:t>
+            </w:r>
+          </w:p>
+        </w:tc>
+        <w:tc>
+          <w:tcPr/>
+          <w:p>
+            <w:pPr>
+              <w:pStyle w:val="Compact"/>
+            </w:pPr>
+            <w:r>
+              <w:t xml:space="preserve">graph-topological features beat FBA</w:t>
+            </w:r>
+          </w:p>
+        </w:tc>
+      </w:tr>
+      <w:tr>
+        <w:tc>
+          <w:tcPr/>
+          <w:p>
+            <w:pPr>
+              <w:pStyle w:val="Compact"/>
+            </w:pPr>
+            <w:r>
+              <w:t xml:space="preserve">Multiplex-network DL</w:t>
+            </w:r>
+          </w:p>
+        </w:tc>
+        <w:tc>
+          <w:tcPr/>
+          <w:p>
+            <w:pPr>
+              <w:pStyle w:val="Compact"/>
+            </w:pPr>
+            <w:r>
+              <w:t xml:space="preserve">2024</w:t>
+            </w:r>
+          </w:p>
+        </w:tc>
+        <w:tc>
+          <w:tcPr/>
+          <w:p>
+            <w:pPr>
+              <w:pStyle w:val="Compact"/>
+            </w:pPr>
+            <w:r>
+              <w:t xml:space="preserve">arXiv:2403.02724</w:t>
+            </w:r>
+          </w:p>
+        </w:tc>
+        <w:tc>
+          <w:tcPr/>
+          <w:p>
+            <w:pPr>
+              <w:pStyle w:val="Compact"/>
+            </w:pPr>
+            <w:r>
+              <w:t xml:space="preserve">predicting perturbation outcomes from multiplex networks</w:t>
+            </w:r>
+          </w:p>
+        </w:tc>
+      </w:tr>
+      <w:tr>
+        <w:tc>
+          <w:tcPr/>
+          <w:p>
+            <w:pPr>
+              <w:pStyle w:val="Compact"/>
+            </w:pPr>
+            <w:r>
+              <w:t xml:space="preserve">Explainable DL (PPI)</w:t>
+            </w:r>
+          </w:p>
+        </w:tc>
+        <w:tc>
+          <w:tcPr/>
+          <w:p>
+            <w:pPr>
+              <w:pStyle w:val="Compact"/>
+            </w:pPr>
+            <w:r>
+              <w:t xml:space="preserve">2025</w:t>
+            </w:r>
+          </w:p>
+        </w:tc>
+        <w:tc>
+          <w:tcPr/>
+          <w:p>
+            <w:pPr>
+              <w:pStyle w:val="Compact"/>
+            </w:pPr>
+            <w:r>
+              <w:t xml:space="preserve">arXiv:2511.12463</w:t>
+            </w:r>
+          </w:p>
+        </w:tc>
+        <w:tc>
+          <w:tcPr/>
+          <w:p>
+            <w:pPr>
+              <w:pStyle w:val="Compact"/>
+            </w:pPr>
+            <w:r>
+              <w:t xml:space="preserve">centrality + node embeddings for target prioritisation</w:t>
+            </w:r>
+          </w:p>
+        </w:tc>
+      </w:tr>
+      <w:tr>
+        <w:tc>
+          <w:tcPr/>
+          <w:p>
+            <w:pPr>
+              <w:pStyle w:val="Compact"/>
+            </w:pPr>
+            <w:r>
+              <w:t xml:space="preserve">EssentialGIN</w:t>
+            </w:r>
+          </w:p>
+        </w:tc>
+        <w:tc>
+          <w:tcPr/>
+          <w:p>
+            <w:pPr>
+              <w:pStyle w:val="Compact"/>
+            </w:pPr>
+            <w:r>
+              <w:t xml:space="preserve">2026</w:t>
+            </w:r>
+          </w:p>
+        </w:tc>
+        <w:tc>
+          <w:tcPr/>
+          <w:p>
+            <w:pPr>
+              <w:pStyle w:val="Compact"/>
+            </w:pPr>
+            <w:r>
+              <w:t xml:space="preserve">arXiv:2606.07700</w:t>
+            </w:r>
+          </w:p>
+        </w:tc>
+        <w:tc>
+          <w:tcPr/>
+          <w:p>
+            <w:pPr>
+              <w:pStyle w:val="Compact"/>
+            </w:pPr>
+            <w:r>
+              <w:t xml:space="preserve">graph isomorphism NN</w:t>
+            </w:r>
+          </w:p>
+        </w:tc>
+      </w:tr>
+      <w:tr>
+        <w:tc>
+          <w:tcPr/>
+          <w:p>
+            <w:pPr>
+              <w:pStyle w:val="Compact"/>
+            </w:pPr>
+            <w:r>
+              <w:t xml:space="preserve">DeepHEM</w:t>
+            </w:r>
+          </w:p>
+        </w:tc>
+        <w:tc>
+          <w:tcPr/>
+          <w:p>
+            <w:pPr>
+              <w:pStyle w:val="Compact"/>
+            </w:pPr>
+            <w:r>
+              <w:t xml:space="preserve">2025</w:t>
+            </w:r>
+          </w:p>
+        </w:tc>
+        <w:tc>
+          <w:tcPr/>
+          <w:p>
+            <w:pPr>
+              <w:pStyle w:val="Compact"/>
+            </w:pPr>
+            <w:r>
+              <w:t xml:space="preserve">Mol Ther</w:t>
+            </w:r>
+          </w:p>
+        </w:tc>
+        <w:tc>
+          <w:tcPr/>
+          <w:p>
+            <w:pPr>
+              <w:pStyle w:val="Compact"/>
+            </w:pPr>
+            <w:r>
+              <w:t xml:space="preserve">domain-adversarial learning, human essentials</w:t>
+            </w:r>
+          </w:p>
+        </w:tc>
+      </w:tr>
+      <w:tr>
+        <w:tc>
+          <w:tcPr/>
+          <w:p>
+            <w:pPr>
+              <w:pStyle w:val="Compact"/>
+            </w:pPr>
+            <w:r>
+              <w:t xml:space="preserve">DeEPsnap</w:t>
+            </w:r>
+          </w:p>
+        </w:tc>
+        <w:tc>
+          <w:tcPr/>
+          <w:p>
+            <w:pPr>
+              <w:pStyle w:val="Compact"/>
+            </w:pPr>
+            <w:r>
+              <w:t xml:space="preserve">2024</w:t>
+            </w:r>
+          </w:p>
+        </w:tc>
+        <w:tc>
+          <w:tcPr/>
+          <w:p>
+            <w:pPr>
+              <w:pStyle w:val="Compact"/>
+            </w:pPr>
+            <w:r>
+              <w:t xml:space="preserve">preprint</w:t>
+            </w:r>
+          </w:p>
+        </w:tc>
+        <w:tc>
+          <w:tcPr/>
+          <w:p>
+            <w:pPr>
+              <w:pStyle w:val="Compact"/>
+            </w:pPr>
+            <w:r>
+              <w:t xml:space="preserve">multi-omics integration</w:t>
+            </w:r>
+          </w:p>
+        </w:tc>
+      </w:tr>
+      <w:tr>
+        <w:tc>
+          <w:tcPr/>
+          <w:p>
+            <w:pPr>
+              <w:pStyle w:val="Compact"/>
+            </w:pPr>
+            <w:r>
+              <w:t xml:space="preserve">DeepVul</w:t>
+            </w:r>
+          </w:p>
+        </w:tc>
+        <w:tc>
+          <w:tcPr/>
+          <w:p>
+            <w:pPr>
+              <w:pStyle w:val="Compact"/>
+            </w:pPr>
+            <w:r>
+              <w:t xml:space="preserve">2024</w:t>
+            </w:r>
+          </w:p>
+        </w:tc>
+        <w:tc>
+          <w:tcPr/>
+          <w:p>
+            <w:pPr>
+              <w:pStyle w:val="Compact"/>
+            </w:pPr>
+            <w:r>
+              <w:t xml:space="preserve">alaa27/DeepVul</w:t>
+            </w:r>
+          </w:p>
+        </w:tc>
+        <w:tc>
+          <w:tcPr/>
+          <w:p>
+            <w:pPr>
+              <w:pStyle w:val="Compact"/>
+            </w:pPr>
+            <w:r>
+              <w:t xml:space="preserve">multi-task transformer: essentiality + drug response</w:t>
+            </w:r>
+          </w:p>
+        </w:tc>
+      </w:tr>
+      <w:tr>
+        <w:tc>
+          <w:tcPr/>
+          <w:p>
+            <w:pPr>
+              <w:pStyle w:val="Compact"/>
+            </w:pPr>
+            <w:r>
               <w:t xml:space="preserve">XGEP</w:t>
             </w:r>
           </w:p>
@@ -1570,6 +2331,17 @@
               <w:pStyle w:val="Compact"/>
             </w:pPr>
             <w:r>
+              <w:t xml:space="preserve">2023</w:t>
+            </w:r>
+          </w:p>
+        </w:tc>
+        <w:tc>
+          <w:tcPr/>
+          <w:p>
+            <w:pPr>
+              <w:pStyle w:val="Compact"/>
+            </w:pPr>
+            <w:r>
               <w:t xml:space="preserve">BioDataLearning/XGEP</w:t>
             </w:r>
           </w:p>
@@ -1582,50 +2354,691 @@
             </w:pPr>
             <w:r>
               <w:t xml:space="preserve">expression-based essentials + lncRNAs</w:t>
+            </w:r>
+          </w:p>
+        </w:tc>
+      </w:tr>
+      <w:tr>
+        <w:tc>
+          <w:tcPr/>
+          <w:p>
+            <w:pPr>
+              <w:pStyle w:val="Compact"/>
+            </w:pPr>
+            <w:r>
+              <w:t xml:space="preserve">DeeplyEssential</w:t>
+            </w:r>
+          </w:p>
+        </w:tc>
+        <w:tc>
+          <w:tcPr/>
+          <w:p>
+            <w:pPr>
+              <w:pStyle w:val="Compact"/>
+            </w:pPr>
+            <w:r>
+              <w:t xml:space="preserve">2020</w:t>
+            </w:r>
+          </w:p>
+        </w:tc>
+        <w:tc>
+          <w:tcPr/>
+          <w:p>
+            <w:pPr>
+              <w:pStyle w:val="Compact"/>
+            </w:pPr>
+            <w:r>
+              <w:t xml:space="preserve">ucrbioinfo/DeeplyEssential</w:t>
+            </w:r>
+          </w:p>
+        </w:tc>
+        <w:tc>
+          <w:tcPr/>
+          <w:p>
+            <w:pPr>
+              <w:pStyle w:val="Compact"/>
+            </w:pPr>
+            <w:r>
+              <w:t xml:space="preserve">microbial essentiality DNN</w:t>
+            </w:r>
+          </w:p>
+        </w:tc>
+      </w:tr>
+      <w:tr>
+        <w:tc>
+          <w:tcPr/>
+          <w:p>
+            <w:pPr>
+              <w:pStyle w:val="Compact"/>
+            </w:pPr>
+            <w:r>
+              <w:t xml:space="preserve">Spiking NN (CGR)</w:t>
+            </w:r>
+          </w:p>
+        </w:tc>
+        <w:tc>
+          <w:tcPr/>
+          <w:p>
+            <w:pPr>
+              <w:pStyle w:val="Compact"/>
+            </w:pPr>
+            <w:r>
+              <w:t xml:space="preserve">2021</w:t>
+            </w:r>
+          </w:p>
+        </w:tc>
+        <w:tc>
+          <w:tcPr/>
+          <w:p>
+            <w:pPr>
+              <w:pStyle w:val="Compact"/>
+            </w:pPr>
+            <w:r>
+              <w:t xml:space="preserve">Chaos Solitons Fractals</w:t>
+            </w:r>
+          </w:p>
+        </w:tc>
+        <w:tc>
+          <w:tcPr/>
+          <w:p>
+            <w:pPr>
+              <w:pStyle w:val="Compact"/>
+            </w:pPr>
+            <w:r>
+              <w:t xml:space="preserve">chaos-game representation + spiking NN</w:t>
+            </w:r>
+          </w:p>
+        </w:tc>
+      </w:tr>
+      <w:tr>
+        <w:tc>
+          <w:tcPr/>
+          <w:p>
+            <w:pPr>
+              <w:pStyle w:val="Compact"/>
+            </w:pPr>
+            <w:r>
+              <w:t xml:space="preserve">MetaGEM</w:t>
+            </w:r>
+          </w:p>
+        </w:tc>
+        <w:tc>
+          <w:tcPr/>
+          <w:p>
+            <w:pPr>
+              <w:pStyle w:val="Compact"/>
+            </w:pPr>
+            <w:r>
+              <w:t xml:space="preserve">2026</w:t>
+            </w:r>
+          </w:p>
+        </w:tc>
+        <w:tc>
+          <w:tcPr/>
+          <w:p>
+            <w:pPr>
+              <w:pStyle w:val="Compact"/>
+            </w:pPr>
+            <w:r>
+              <w:t xml:space="preserve">arXiv:2605.14812</w:t>
+            </w:r>
+          </w:p>
+        </w:tc>
+        <w:tc>
+          <w:tcPr/>
+          <w:p>
+            <w:pPr>
+              <w:pStyle w:val="Compact"/>
+            </w:pPr>
+            <w:r>
+              <w:t xml:space="preserve">genome-scale metabolic networks via deep enzyme anchoring</w:t>
+            </w:r>
+          </w:p>
+        </w:tc>
+      </w:tr>
+      <w:tr>
+        <w:tc>
+          <w:tcPr/>
+          <w:p>
+            <w:pPr>
+              <w:pStyle w:val="Compact"/>
+            </w:pPr>
+            <w:r>
+              <w:t xml:space="preserve">dnaHNet</w:t>
+            </w:r>
+          </w:p>
+        </w:tc>
+        <w:tc>
+          <w:tcPr/>
+          <w:p>
+            <w:pPr>
+              <w:pStyle w:val="Compact"/>
+            </w:pPr>
+            <w:r>
+              <w:t xml:space="preserve">2026</w:t>
+            </w:r>
+          </w:p>
+        </w:tc>
+        <w:tc>
+          <w:tcPr/>
+          <w:p>
+            <w:pPr>
+              <w:pStyle w:val="Compact"/>
+            </w:pPr>
+            <w:r>
+              <w:t xml:space="preserve">arXiv:2602.10603</w:t>
+            </w:r>
+          </w:p>
+        </w:tc>
+        <w:tc>
+          <w:tcPr/>
+          <w:p>
+            <w:pPr>
+              <w:pStyle w:val="Compact"/>
+            </w:pPr>
+            <w:r>
+              <w:t xml:space="preserve">hierarchical foundation model for genomic sequence</w:t>
             </w:r>
           </w:p>
         </w:tc>
       </w:tr>
     </w:tbl>
-    <w:p>
-      <w:pPr>
-        <w:pStyle w:val="BodyText"/>
+    <w:bookmarkEnd w:id="15"/>
+    <w:bookmarkStart w:id="16" w:name="Xfa735b275b3ba366f99bd8cf2c3a9a83e7b7543"/>
+    <w:p>
+      <w:pPr>
+        <w:pStyle w:val="Heading2"/>
+      </w:pPr>
+      <w:r>
+        <w:t xml:space="preserve">3.4 Generative models &amp; single-cell CRISPR (scCRISPR)</w:t>
+      </w:r>
+    </w:p>
+    <w:p>
+      <w:pPr>
+        <w:pStyle w:val="FirstParagraph"/>
+      </w:pPr>
+      <w:r>
+        <w:t xml:space="preserve">The current frontier is predicting</w:t>
+      </w:r>
+      <w:r>
+        <w:t xml:space="preserve"> </w:t>
+      </w:r>
+      <w:r>
+        <w:rPr>
+          <w:i/>
+          <w:iCs/>
+        </w:rPr>
+        <w:t xml:space="preserve">single-cell perturbation response</w:t>
+      </w:r>
+      <w:r>
+        <w:t xml:space="preserve"> </w:t>
+      </w:r>
+      <w:r>
+        <w:t xml:space="preserve">and</w:t>
+      </w:r>
+      <w:r>
+        <w:t xml:space="preserve"> </w:t>
+      </w:r>
+      <w:r>
+        <w:t xml:space="preserve">essentiality from scCRISPR screens:</w:t>
+      </w:r>
+    </w:p>
+    <w:tbl>
+      <w:tblPr>
+        <w:tblStyle w:val="Table"/>
+        <w:tblW w:type="pct" w:w="5000"/>
+        <w:tblLayout w:type="fixed"/>
+        <w:tblLook w:firstRow="1" w:lastRow="0" w:firstColumn="0" w:lastColumn="0" w:noHBand="0" w:noVBand="0" w:val="0020"/>
+      </w:tblPr>
+      <w:tblGrid>
+        <w:gridCol w:w="1357"/>
+        <w:gridCol w:w="1357"/>
+        <w:gridCol w:w="2941"/>
+        <w:gridCol w:w="2262"/>
+      </w:tblGrid>
+      <w:tr>
+        <w:trPr>
+          <w:tblHeader w:val="on"/>
+        </w:trPr>
+        <w:tc>
+          <w:tcPr/>
+          <w:p>
+            <w:pPr>
+              <w:pStyle w:val="Compact"/>
+            </w:pPr>
+            <w:r>
+              <w:t xml:space="preserve">Tool</w:t>
+            </w:r>
+          </w:p>
+        </w:tc>
+        <w:tc>
+          <w:tcPr/>
+          <w:p>
+            <w:pPr>
+              <w:pStyle w:val="Compact"/>
+            </w:pPr>
+            <w:r>
+              <w:t xml:space="preserve">Year</w:t>
+            </w:r>
+          </w:p>
+        </w:tc>
+        <w:tc>
+          <w:tcPr/>
+          <w:p>
+            <w:pPr>
+              <w:pStyle w:val="Compact"/>
+            </w:pPr>
+            <w:r>
+              <w:t xml:space="preserve">Venue / DOI</w:t>
+            </w:r>
+          </w:p>
+        </w:tc>
+        <w:tc>
+          <w:tcPr/>
+          <w:p>
+            <w:pPr>
+              <w:pStyle w:val="Compact"/>
+            </w:pPr>
+            <w:r>
+              <w:t xml:space="preserve">Approach</w:t>
+            </w:r>
+          </w:p>
+        </w:tc>
+      </w:tr>
+      <w:tr>
+        <w:tc>
+          <w:tcPr/>
+          <w:p>
+            <w:pPr>
+              <w:pStyle w:val="Compact"/>
+            </w:pPr>
+            <w:r>
+              <w:rPr>
+                <w:b/>
+                <w:bCs/>
+              </w:rPr>
+              <w:t xml:space="preserve">DEGAS</w:t>
+            </w:r>
+          </w:p>
+        </w:tc>
+        <w:tc>
+          <w:tcPr/>
+          <w:p>
+            <w:pPr>
+              <w:pStyle w:val="Compact"/>
+            </w:pPr>
+            <w:r>
+              <w:t xml:space="preserve">2023</w:t>
+            </w:r>
+          </w:p>
+        </w:tc>
+        <w:tc>
+          <w:tcPr/>
+          <w:p>
+            <w:pPr>
+              <w:pStyle w:val="Compact"/>
+            </w:pPr>
+            <w:r>
+              <w:t xml:space="preserve">Nat Commun</w:t>
+            </w:r>
+          </w:p>
+        </w:tc>
+        <w:tc>
+          <w:tcPr/>
+          <w:p>
+            <w:pPr>
+              <w:pStyle w:val="Compact"/>
+            </w:pPr>
+            <w:r>
+              <w:t xml:space="preserve">deep generative (VAE) model of gene essentiality from single-cell CRISPR screens</w:t>
+            </w:r>
+          </w:p>
+        </w:tc>
+      </w:tr>
+      <w:tr>
+        <w:tc>
+          <w:tcPr/>
+          <w:p>
+            <w:pPr>
+              <w:pStyle w:val="Compact"/>
+            </w:pPr>
+            <w:r>
+              <w:rPr>
+                <w:b/>
+                <w:bCs/>
+              </w:rPr>
+              <w:t xml:space="preserve">scLAMBDA</w:t>
+            </w:r>
+          </w:p>
+        </w:tc>
+        <w:tc>
+          <w:tcPr/>
+          <w:p>
+            <w:pPr>
+              <w:pStyle w:val="Compact"/>
+            </w:pPr>
+            <w:r>
+              <w:t xml:space="preserve">2024</w:t>
+            </w:r>
+          </w:p>
+        </w:tc>
+        <w:tc>
+          <w:tcPr/>
+          <w:p>
+            <w:pPr>
+              <w:pStyle w:val="Compact"/>
+            </w:pPr>
+            <w:r>
+              <w:t xml:space="preserve">bioRxiv 10.1101/2024.12.04.626878</w:t>
+            </w:r>
+          </w:p>
+        </w:tc>
+        <w:tc>
+          <w:tcPr/>
+          <w:p>
+            <w:pPr>
+              <w:pStyle w:val="Compact"/>
+            </w:pPr>
+            <w:r>
+              <w:t xml:space="preserve">deep generative framework for scCRISPR perturbation responses</w:t>
+            </w:r>
+          </w:p>
+        </w:tc>
+      </w:tr>
+      <w:tr>
+        <w:tc>
+          <w:tcPr/>
+          <w:p>
+            <w:pPr>
+              <w:pStyle w:val="Compact"/>
+            </w:pPr>
+            <w:r>
+              <w:rPr>
+                <w:b/>
+                <w:bCs/>
+              </w:rPr>
+              <w:t xml:space="preserve">PerturbNet</w:t>
+            </w:r>
+          </w:p>
+        </w:tc>
+        <w:tc>
+          <w:tcPr/>
+          <w:p>
+            <w:pPr>
+              <w:pStyle w:val="Compact"/>
+            </w:pPr>
+            <w:r>
+              <w:t xml:space="preserve">2025</w:t>
+            </w:r>
+          </w:p>
+        </w:tc>
+        <w:tc>
+          <w:tcPr/>
+          <w:p>
+            <w:pPr>
+              <w:pStyle w:val="Compact"/>
+            </w:pPr>
+            <w:r>
+              <w:t xml:space="preserve">Mol Syst Biol 10.1038/s44320-025-00131-3</w:t>
+            </w:r>
+          </w:p>
+        </w:tc>
+        <w:tc>
+          <w:tcPr/>
+          <w:p>
+            <w:pPr>
+              <w:pStyle w:val="Compact"/>
+            </w:pPr>
+            <w:r>
+              <w:t xml:space="preserve">generative model for single-cell perturbation response</w:t>
+            </w:r>
+          </w:p>
+        </w:tc>
+      </w:tr>
+      <w:tr>
+        <w:tc>
+          <w:tcPr/>
+          <w:p>
+            <w:pPr>
+              <w:pStyle w:val="Compact"/>
+            </w:pPr>
+            <w:r>
+              <w:t xml:space="preserve">ACE</w:t>
+            </w:r>
+          </w:p>
+        </w:tc>
+        <w:tc>
+          <w:tcPr/>
+          <w:p>
+            <w:pPr>
+              <w:pStyle w:val="Compact"/>
+            </w:pPr>
+            <w:r>
+              <w:t xml:space="preserve">2021</w:t>
+            </w:r>
+          </w:p>
+        </w:tc>
+        <w:tc>
+          <w:tcPr/>
+          <w:p>
+            <w:pPr>
+              <w:pStyle w:val="Compact"/>
+            </w:pPr>
+            <w:r>
+              <w:t xml:space="preserve">Genome Biol 10.1186/s13059-021-02491-z</w:t>
+            </w:r>
+          </w:p>
+        </w:tc>
+        <w:tc>
+          <w:tcPr/>
+          <w:p>
+            <w:pPr>
+              <w:pStyle w:val="Compact"/>
+            </w:pPr>
+            <w:r>
+              <w:t xml:space="preserve">profile-HMM essentiality from (single-cell) CRISPR screens</w:t>
+            </w:r>
+          </w:p>
+        </w:tc>
+      </w:tr>
+      <w:tr>
+        <w:tc>
+          <w:tcPr/>
+          <w:p>
+            <w:pPr>
+              <w:pStyle w:val="Compact"/>
+            </w:pPr>
+            <w:r>
+              <w:t xml:space="preserve">Chronos</w:t>
+            </w:r>
+          </w:p>
+        </w:tc>
+        <w:tc>
+          <w:tcPr/>
+          <w:p>
+            <w:pPr>
+              <w:pStyle w:val="Compact"/>
+            </w:pPr>
+            <w:r>
+              <w:t xml:space="preserve">2021</w:t>
+            </w:r>
+          </w:p>
+        </w:tc>
+        <w:tc>
+          <w:tcPr/>
+          <w:p>
+            <w:pPr>
+              <w:pStyle w:val="Compact"/>
+            </w:pPr>
+            <w:r>
+              <w:t xml:space="preserve">Genome Biol 10.1186/s13059-021-02540-7</w:t>
+            </w:r>
+          </w:p>
+        </w:tc>
+        <w:tc>
+          <w:tcPr/>
+          <w:p>
+            <w:pPr>
+              <w:pStyle w:val="Compact"/>
+            </w:pPr>
+            <w:r>
+              <w:t xml:space="preserve">cell-population fitness model</w:t>
+            </w:r>
+          </w:p>
+        </w:tc>
+      </w:tr>
+      <w:tr>
+        <w:tc>
+          <w:tcPr/>
+          <w:p>
+            <w:pPr>
+              <w:pStyle w:val="Compact"/>
+            </w:pPr>
+            <w:r>
+              <w:t xml:space="preserve">scCRISPR tiling</w:t>
+            </w:r>
+          </w:p>
+        </w:tc>
+        <w:tc>
+          <w:tcPr/>
+          <w:p>
+            <w:pPr>
+              <w:pStyle w:val="Compact"/>
+            </w:pPr>
+            <w:r>
+              <w:t xml:space="preserve">2021</w:t>
+            </w:r>
+          </w:p>
+        </w:tc>
+        <w:tc>
+          <w:tcPr/>
+          <w:p>
+            <w:pPr>
+              <w:pStyle w:val="Compact"/>
+            </w:pPr>
+            <w:r>
+              <w:t xml:space="preserve">Nat Commun 10.1038/s41467-021-24324-0</w:t>
+            </w:r>
+          </w:p>
+        </w:tc>
+        <w:tc>
+          <w:tcPr/>
+          <w:p>
+            <w:pPr>
+              <w:pStyle w:val="Compact"/>
+            </w:pPr>
+            <w:r>
+              <w:t xml:space="preserve">functional inference from single-cell CRISPR tiling</w:t>
+            </w:r>
+          </w:p>
+        </w:tc>
+      </w:tr>
+    </w:tbl>
+    <w:p>
+      <w:pPr>
+        <w:pStyle w:val="BlockText"/>
       </w:pPr>
       <w:r>
         <w:rPr>
           <w:b/>
           <w:bCs/>
         </w:rPr>
-        <w:t xml:space="preserve">Methods not yet located in a canonical public repository.</w:t>
-      </w:r>
-      <w:r>
-        <w:t xml:space="preserve"> </w:t>
-      </w:r>
-      <w:r>
-        <w:t xml:space="preserve">DEGAS (deep</w:t>
-      </w:r>
-      <w:r>
-        <w:t xml:space="preserve"> </w:t>
-      </w:r>
-      <w:r>
-        <w:t xml:space="preserve">generative model of essentiality from single-cell CRISPR screens), scEVE, and</w:t>
-      </w:r>
-      <w:r>
-        <w:t xml:space="preserve"> </w:t>
-      </w:r>
-      <w:r>
-        <w:t xml:space="preserve">CHNet appear in the literature but their canonical GitHub repositories could not</w:t>
-      </w:r>
-      <w:r>
-        <w:t xml:space="preserve"> </w:t>
-      </w:r>
-      <w:r>
-        <w:t xml:space="preserve">be confirmed in this survey; they should be sourced from their papers directly.</w:t>
-      </w:r>
-    </w:p>
-    <w:bookmarkEnd w:id="15"/>
+        <w:t xml:space="preserve">Verification note.</w:t>
+      </w:r>
+      <w:r>
+        <w:t xml:space="preserve"> </w:t>
+      </w:r>
+      <w:r>
+        <w:t xml:space="preserve">DEGAS is a journal-only publication (not on arXiv); its</w:t>
+      </w:r>
+      <w:r>
+        <w:t xml:space="preserve"> </w:t>
+      </w:r>
+      <w:r>
+        <w:t xml:space="preserve">exact DOI could not be auto-verified from title search during this review. It is</w:t>
+      </w:r>
+      <w:r>
+        <w:t xml:space="preserve"> </w:t>
+      </w:r>
+      <w:r>
+        <w:t xml:space="preserve">cited here from domain knowledge; confirm the DOI (Nat Commun 2023,</w:t>
+      </w:r>
+      <w:r>
+        <w:t xml:space="preserve"> </w:t>
+      </w:r>
+      <w:r>
+        <w:t xml:space="preserve">~10.1038/s41467-023-…) before submission.</w:t>
+      </w:r>
+    </w:p>
     <w:bookmarkEnd w:id="16"/>
-    <w:bookmarkStart w:id="19" w:name="comparison-and-strengths-weaknesses"/>
+    <w:bookmarkStart w:id="17" w:name="Xc688dba9e5b163f075bcc68997f2c16654b2e23"/>
+    <w:p>
+      <w:pPr>
+        <w:pStyle w:val="Heading2"/>
+      </w:pPr>
+      <w:r>
+        <w:t xml:space="preserve">3.5 Methods with no canonical public repository</w:t>
+      </w:r>
+    </w:p>
+    <w:p>
+      <w:pPr>
+        <w:pStyle w:val="FirstParagraph"/>
+      </w:pPr>
+      <w:r>
+        <w:rPr>
+          <w:b/>
+          <w:bCs/>
+        </w:rPr>
+        <w:t xml:space="preserve">DEGAS</w:t>
+      </w:r>
+      <w:r>
+        <w:t xml:space="preserve">,</w:t>
+      </w:r>
+      <w:r>
+        <w:t xml:space="preserve"> </w:t>
+      </w:r>
+      <w:r>
+        <w:rPr>
+          <w:b/>
+          <w:bCs/>
+        </w:rPr>
+        <w:t xml:space="preserve">scEVE</w:t>
+      </w:r>
+      <w:r>
+        <w:t xml:space="preserve">, and</w:t>
+      </w:r>
+      <w:r>
+        <w:t xml:space="preserve"> </w:t>
+      </w:r>
+      <w:r>
+        <w:rPr>
+          <w:b/>
+          <w:bCs/>
+        </w:rPr>
+        <w:t xml:space="preserve">CHNet</w:t>
+      </w:r>
+      <w:r>
+        <w:t xml:space="preserve"> </w:t>
+      </w:r>
+      <w:r>
+        <w:t xml:space="preserve">appear in the literature but could not be</w:t>
+      </w:r>
+      <w:r>
+        <w:t xml:space="preserve"> </w:t>
+      </w:r>
+      <w:r>
+        <w:t xml:space="preserve">confirmed in a canonical GitHub repository during this survey; they should be</w:t>
+      </w:r>
+      <w:r>
+        <w:t xml:space="preserve"> </w:t>
+      </w:r>
+      <w:r>
+        <w:t xml:space="preserve">sourced from their papers directly.</w:t>
+      </w:r>
+    </w:p>
+    <w:bookmarkEnd w:id="17"/>
+    <w:bookmarkEnd w:id="18"/>
+    <w:bookmarkStart w:id="21" w:name="comparison-and-strengths-weaknesses"/>
     <w:p>
       <w:pPr>
         <w:pStyle w:val="Heading1"/>
@@ -1634,7 +3047,7 @@
         <w:t xml:space="preserve">4. Comparison and Strengths / Weaknesses</w:t>
       </w:r>
     </w:p>
-    <w:bookmarkStart w:id="17" w:name="cross-cutting-comparison"/>
+    <w:bookmarkStart w:id="19" w:name="cross-cutting-comparison"/>
     <w:p>
       <w:pPr>
         <w:pStyle w:val="Heading2"/>
@@ -1982,8 +3395,8 @@
         </w:tc>
       </w:tr>
     </w:tbl>
-    <w:bookmarkEnd w:id="17"/>
-    <w:bookmarkStart w:id="18" w:name="detailed-strengths-and-weaknesses"/>
+    <w:bookmarkEnd w:id="19"/>
+    <w:bookmarkStart w:id="20" w:name="detailed-strengths-and-weaknesses"/>
     <w:p>
       <w:pPr>
         <w:pStyle w:val="Heading2"/>
@@ -2078,7 +3491,7 @@
           <w:b/>
           <w:bCs/>
         </w:rPr>
-        <w:t xml:space="preserve">DepMap/CRISPR (functional gold standard).</w:t>
+        <w:t xml:space="preserve">DepMap / Project Score / CRSIPR (functional gold standard).</w:t>
       </w:r>
       <w:r>
         <w:t xml:space="preserve"> </w:t>
@@ -2122,7 +3535,7 @@
           <w:b/>
           <w:bCs/>
         </w:rPr>
-        <w:t xml:space="preserve">Deep learning.</w:t>
+        <w:t xml:space="preserve">Graph / topology methods (EPGAT, FluxGAT, topology-ML).</w:t>
       </w:r>
       <w:r>
         <w:t xml:space="preserve"> </w:t>
@@ -2138,13 +3551,13 @@
         <w:t xml:space="preserve"> </w:t>
       </w:r>
       <w:r>
-        <w:t xml:space="preserve">multi-modal features; covers unexpressed genes; cross-species; can</w:t>
-      </w:r>
-      <w:r>
-        <w:t xml:space="preserve"> </w:t>
-      </w:r>
-      <w:r>
-        <w:t xml:space="preserve">align to functional labels.</w:t>
+        <w:t xml:space="preserve">exploit network structure; good for unexpressed or under-measured</w:t>
+      </w:r>
+      <w:r>
+        <w:t xml:space="preserve"> </w:t>
+      </w:r>
+      <w:r>
+        <w:t xml:space="preserve">genes; FluxGAT/metabolic-topology avoid FBA bias.</w:t>
       </w:r>
       <w:r>
         <w:t xml:space="preserve"> </w:t>
@@ -2160,48 +3573,146 @@
         <w:t xml:space="preserve"> </w:t>
       </w:r>
       <w:r>
-        <w:t xml:space="preserve">poor interpretability; label-quality dependent; training bias</w:t>
-      </w:r>
-      <w:r>
-        <w:t xml:space="preserve"> </w:t>
-      </w:r>
-      <w:r>
-        <w:t xml:space="preserve">towards cancer cell lines.</w:t>
-      </w:r>
-    </w:p>
-    <w:bookmarkEnd w:id="18"/>
-    <w:bookmarkEnd w:id="19"/>
-    <w:bookmarkStart w:id="20" w:name="discussion"/>
-    <w:p>
-      <w:pPr>
-        <w:pStyle w:val="Heading1"/>
-      </w:pPr>
-      <w:r>
-        <w:t xml:space="preserve">5. Discussion</w:t>
-      </w:r>
-    </w:p>
-    <w:p>
-      <w:pPr>
-        <w:pStyle w:val="FirstParagraph"/>
-      </w:pPr>
-      <w:r>
-        <w:t xml:space="preserve">The field is converging on a synthesis.</w:t>
-      </w:r>
-      <w:r>
-        <w:t xml:space="preserve"> </w:t>
-      </w:r>
+        <w:t xml:space="preserve">network completeness/quality dependent; require curated networks;</w:t>
+      </w:r>
+      <w:r>
+        <w:t xml:space="preserve"> </w:t>
+      </w:r>
+      <w:r>
+        <w:t xml:space="preserve">less mature for single-cell resolution.</w:t>
+      </w:r>
+    </w:p>
+    <w:p>
+      <w:pPr>
+        <w:pStyle w:val="BodyText"/>
+      </w:pPr>
       <w:r>
         <w:rPr>
           <w:b/>
           <w:bCs/>
         </w:rPr>
-        <w:t xml:space="preserve">Expression-robustness and functional</w:t>
-      </w:r>
+        <w:t xml:space="preserve">Generative / scCRISPR (DEGAS, scLAMBDA, PerturbNet).</w:t>
+      </w:r>
+      <w:r>
+        <w:t xml:space="preserve"> </w:t>
+      </w:r>
+      <w:r>
+        <w:rPr>
+          <w:i/>
+          <w:iCs/>
+        </w:rPr>
+        <w:t xml:space="preserve">Strengths:</w:t>
+      </w:r>
+      <w:r>
+        <w:t xml:space="preserve"> </w:t>
+      </w:r>
+      <w:r>
+        <w:t xml:space="preserve">capture sample-level heterogeneity and perturbation responses;</w:t>
+      </w:r>
+      <w:r>
+        <w:t xml:space="preserve"> </w:t>
+      </w:r>
+      <w:r>
+        <w:t xml:space="preserve">single-cell resolution; predict phenotypes for unseen genes/conditions.</w:t>
+      </w:r>
+      <w:r>
+        <w:t xml:space="preserve"> </w:t>
+      </w:r>
+      <w:r>
+        <w:rPr>
+          <w:i/>
+          <w:iCs/>
+        </w:rPr>
+        <w:t xml:space="preserve">Weaknesses:</w:t>
+      </w:r>
+      <w:r>
+        <w:t xml:space="preserve"> </w:t>
+      </w:r>
+      <w:r>
+        <w:t xml:space="preserve">data-hungry; heavy compute; label quality from screen design;</w:t>
+      </w:r>
+      <w:r>
+        <w:t xml:space="preserve"> </w:t>
+      </w:r>
+      <w:r>
+        <w:t xml:space="preserve">newer and less standardised.</w:t>
+      </w:r>
+    </w:p>
+    <w:p>
+      <w:pPr>
+        <w:pStyle w:val="BodyText"/>
+      </w:pPr>
       <w:r>
         <w:rPr>
           <w:b/>
           <w:bCs/>
         </w:rPr>
+        <w:t xml:space="preserve">Deep learning in general.</w:t>
+      </w:r>
+      <w:r>
+        <w:t xml:space="preserve"> </w:t>
+      </w:r>
+      <w:r>
+        <w:rPr>
+          <w:i/>
+          <w:iCs/>
+        </w:rPr>
+        <w:t xml:space="preserve">Strengths:</w:t>
+      </w:r>
+      <w:r>
+        <w:t xml:space="preserve"> </w:t>
+      </w:r>
+      <w:r>
+        <w:t xml:space="preserve">multi-modal features; covers unexpressed genes; cross-species; can</w:t>
+      </w:r>
+      <w:r>
+        <w:t xml:space="preserve"> </w:t>
+      </w:r>
+      <w:r>
+        <w:t xml:space="preserve">align to functional labels.</w:t>
+      </w:r>
+      <w:r>
+        <w:t xml:space="preserve"> </w:t>
+      </w:r>
+      <w:r>
+        <w:rPr>
+          <w:i/>
+          <w:iCs/>
+        </w:rPr>
+        <w:t xml:space="preserve">Weaknesses:</w:t>
+      </w:r>
+      <w:r>
+        <w:t xml:space="preserve"> </w:t>
+      </w:r>
+      <w:r>
+        <w:t xml:space="preserve">poor interpretability; label-quality dependent; training bias</w:t>
+      </w:r>
+      <w:r>
+        <w:t xml:space="preserve"> </w:t>
+      </w:r>
+      <w:r>
+        <w:t xml:space="preserve">towards cancer cell lines.</w:t>
+      </w:r>
+    </w:p>
+    <w:bookmarkEnd w:id="20"/>
+    <w:bookmarkEnd w:id="21"/>
+    <w:bookmarkStart w:id="22" w:name="discussion"/>
+    <w:p>
+      <w:pPr>
+        <w:pStyle w:val="Heading1"/>
+      </w:pPr>
+      <w:r>
+        <w:t xml:space="preserve">5. Discussion</w:t>
+      </w:r>
+    </w:p>
+    <w:p>
+      <w:pPr>
+        <w:pStyle w:val="FirstParagraph"/>
+      </w:pPr>
+      <w:r>
+        <w:t xml:space="preserve">The field is converging on a synthesis.</w:t>
+      </w:r>
+      <w:r>
         <w:t xml:space="preserve"> </w:t>
       </w:r>
       <w:r>
@@ -2209,6 +3720,20 @@
           <w:b/>
           <w:bCs/>
         </w:rPr>
+        <w:t xml:space="preserve">Expression-robustness and functional</w:t>
+      </w:r>
+      <w:r>
+        <w:rPr>
+          <w:b/>
+          <w:bCs/>
+        </w:rPr>
+        <w:t xml:space="preserve"> </w:t>
+      </w:r>
+      <w:r>
+        <w:rPr>
+          <w:b/>
+          <w:bCs/>
+        </w:rPr>
         <w:t xml:space="preserve">essentiality are complementary, not competing</w:t>
       </w:r>
       <w:r>
@@ -2244,41 +3769,139 @@
         <w:pStyle w:val="BodyText"/>
       </w:pPr>
       <w:r>
+        <w:t xml:space="preserve">The new generation of methods adds two powerful ingredients:</w:t>
+      </w:r>
+      <w:r>
+        <w:t xml:space="preserve"> </w:t>
+      </w:r>
+      <w:r>
+        <w:t xml:space="preserve">1.</w:t>
+      </w:r>
+      <w:r>
+        <w:t xml:space="preserve"> </w:t>
+      </w:r>
+      <w:r>
+        <w:rPr>
+          <w:b/>
+          <w:bCs/>
+        </w:rPr>
+        <w:t xml:space="preserve">Network/topology information</w:t>
+      </w:r>
+      <w:r>
+        <w:t xml:space="preserve"> </w:t>
+      </w:r>
+      <w:r>
+        <w:t xml:space="preserve">(GNNs, metabolic flux, PPI centrality) that</w:t>
+      </w:r>
+      <w:r>
+        <w:t xml:space="preserve"> </w:t>
+      </w:r>
+      <w:r>
+        <w:t xml:space="preserve">captures biological importance beyond expression statistics and can score</w:t>
+      </w:r>
+      <w:r>
+        <w:t xml:space="preserve"> </w:t>
+      </w:r>
+      <w:r>
+        <w:t xml:space="preserve">genes that are barely or not expressed in a given dataset.</w:t>
+      </w:r>
+      <w:r>
+        <w:t xml:space="preserve"> </w:t>
+      </w:r>
+      <w:r>
+        <w:t xml:space="preserve">2.</w:t>
+      </w:r>
+      <w:r>
+        <w:t xml:space="preserve"> </w:t>
+      </w:r>
+      <w:r>
+        <w:rPr>
+          <w:b/>
+          <w:bCs/>
+        </w:rPr>
+        <w:t xml:space="preserve">Generative single-cell modeling</w:t>
+      </w:r>
+      <w:r>
+        <w:t xml:space="preserve"> </w:t>
+      </w:r>
+      <w:r>
+        <w:t xml:space="preserve">(scCRISPR) that learns essentiality from</w:t>
+      </w:r>
+      <w:r>
+        <w:t xml:space="preserve"> </w:t>
+      </w:r>
+      <w:r>
+        <w:t xml:space="preserve">the transcriptomic</w:t>
+      </w:r>
+      <w:r>
+        <w:t xml:space="preserve"> </w:t>
+      </w:r>
+      <w:r>
+        <w:rPr>
+          <w:i/>
+          <w:iCs/>
+        </w:rPr>
+        <w:t xml:space="preserve">consequences</w:t>
+      </w:r>
+      <w:r>
+        <w:t xml:space="preserve"> </w:t>
+      </w:r>
+      <w:r>
+        <w:t xml:space="preserve">of perturbing many genes at once, in a</w:t>
+      </w:r>
+      <w:r>
+        <w:t xml:space="preserve"> </w:t>
+      </w:r>
+      <w:r>
+        <w:t xml:space="preserve">heterogeneous single-cell context — closer to the biological reality than any</w:t>
+      </w:r>
+      <w:r>
+        <w:t xml:space="preserve"> </w:t>
+      </w:r>
+      <w:r>
+        <w:t xml:space="preserve">global score.</w:t>
+      </w:r>
+    </w:p>
+    <w:p>
+      <w:pPr>
+        <w:pStyle w:val="BodyText"/>
+      </w:pPr>
+      <w:r>
         <w:t xml:space="preserve">Deep learning offers the machinery to merge these: learn a mapping from</w:t>
       </w:r>
       <w:r>
         <w:t xml:space="preserve"> </w:t>
       </w:r>
       <w:r>
-        <w:t xml:space="preserve">single-cell expression and sequence features to functional essentiality labels,</w:t>
-      </w:r>
-      <w:r>
-        <w:t xml:space="preserve"> </w:t>
-      </w:r>
-      <w:r>
-        <w:t xml:space="preserve">thereby transferring the authority of DepMap to any scRNA-seq dataset. The</w:t>
-      </w:r>
-      <w:r>
-        <w:t xml:space="preserve"> </w:t>
-      </w:r>
-      <w:r>
-        <w:t xml:space="preserve">principal risks are interpretability and label bias, which argue for</w:t>
-      </w:r>
-      <w:r>
-        <w:t xml:space="preserve"> </w:t>
-      </w:r>
-      <w:r>
-        <w:t xml:space="preserve">interpretable (GBM) baselines plus model-agnostic explanation, and for</w:t>
-      </w:r>
-      <w:r>
-        <w:t xml:space="preserve"> </w:t>
-      </w:r>
-      <w:r>
-        <w:t xml:space="preserve">explicit context modelling rather than a single global score.</w:t>
-      </w:r>
-    </w:p>
-    <w:bookmarkEnd w:id="20"/>
-    <w:bookmarkStart w:id="21" w:name="future-directions-ranked"/>
+        <w:t xml:space="preserve">single-cell expression, sequence, and network features to functional essentiality</w:t>
+      </w:r>
+      <w:r>
+        <w:t xml:space="preserve"> </w:t>
+      </w:r>
+      <w:r>
+        <w:t xml:space="preserve">labels, thereby transferring the authority of DepMap/Project Score to any scRNA-seq</w:t>
+      </w:r>
+      <w:r>
+        <w:t xml:space="preserve"> </w:t>
+      </w:r>
+      <w:r>
+        <w:t xml:space="preserve">dataset. The principal risks are interpretability and label bias, which argue for</w:t>
+      </w:r>
+      <w:r>
+        <w:t xml:space="preserve"> </w:t>
+      </w:r>
+      <w:r>
+        <w:t xml:space="preserve">interpretable (GBM) baselines plus model-agnostic explanation, and for explicit</w:t>
+      </w:r>
+      <w:r>
+        <w:t xml:space="preserve"> </w:t>
+      </w:r>
+      <w:r>
+        <w:t xml:space="preserve">context modelling rather than a single global score.</w:t>
+      </w:r>
+    </w:p>
+    <w:bookmarkEnd w:id="22"/>
+    <w:bookmarkStart w:id="23" w:name="future-directions-ranked"/>
     <w:p>
       <w:pPr>
         <w:pStyle w:val="Heading1"/>
@@ -2333,7 +3956,19 @@
         <w:t xml:space="preserve"> </w:t>
       </w:r>
       <w:r>
-        <w:t xml:space="preserve">(GBM → small DNN) trained on DepMap CERES labels from scRNA-derived features.</w:t>
+        <w:t xml:space="preserve">(GBM → small DNN/GNN) trained on DepMap/Project Score labels from scRNA-derived</w:t>
+      </w:r>
+    </w:p>
+    <w:p>
+      <w:pPr>
+        <w:pStyle w:val="Compact"/>
+        <w:numPr>
+          <w:ilvl w:val="1"/>
+          <w:numId w:val="1004"/>
+        </w:numPr>
+      </w:pPr>
+      <w:r>
+        <w:t xml:space="preserve">network features.</w:t>
       </w:r>
       <w:r>
         <w:t xml:space="preserve"> </w:t>
@@ -2371,7 +4006,13 @@
         <w:t xml:space="preserve"> </w:t>
       </w:r>
       <w:r>
-        <w:t xml:space="preserve">and context-specific essentials (core-vs-context framing of ADAM/CoRe).</w:t>
+        <w:t xml:space="preserve">and context-specific essentials (core-vs-context framing of ADAM/CoRe, using</w:t>
+      </w:r>
+      <w:r>
+        <w:t xml:space="preserve"> </w:t>
+      </w:r>
+      <w:r>
+        <w:t xml:space="preserve">CCLE covariates).</w:t>
       </w:r>
       <w:r>
         <w:t xml:space="preserve"> </w:t>
@@ -2397,19 +4038,25 @@
           <w:b/>
           <w:bCs/>
         </w:rPr>
-        <w:t xml:space="preserve">Sequence / DNA-LLM features.</w:t>
-      </w:r>
-      <w:r>
-        <w:t xml:space="preserve"> </w:t>
-      </w:r>
-      <w:r>
-        <w:t xml:space="preserve">Cover unexpressed genes and enable</w:t>
-      </w:r>
-      <w:r>
-        <w:t xml:space="preserve"> </w:t>
-      </w:r>
-      <w:r>
-        <w:t xml:space="preserve">cross-species transfer (EssTFNet, ProteomeLM).</w:t>
+        <w:t xml:space="preserve">Network centrality / topology as an essentiality signal.</w:t>
+      </w:r>
+      <w:r>
+        <w:t xml:space="preserve"> </w:t>
+      </w:r>
+      <w:r>
+        <w:t xml:space="preserve">Replace or augment</w:t>
+      </w:r>
+      <w:r>
+        <w:t xml:space="preserve"> </w:t>
+      </w:r>
+      <w:r>
+        <w:t xml:space="preserve">stability with PPI/metabolic-network degree and centrality (EPGAT, FluxGAT,</w:t>
+      </w:r>
+      <w:r>
+        <w:t xml:space="preserve"> </w:t>
+      </w:r>
+      <w:r>
+        <w:t xml:space="preserve">topology-ML, scRoGG). Enables scoring of unexpressed genes.</w:t>
       </w:r>
     </w:p>
     <w:p>
@@ -2425,19 +4072,19 @@
           <w:b/>
           <w:bCs/>
         </w:rPr>
-        <w:t xml:space="preserve">Network centrality as an essentiality signal.</w:t>
-      </w:r>
-      <w:r>
-        <w:t xml:space="preserve"> </w:t>
-      </w:r>
-      <w:r>
-        <w:t xml:space="preserve">Replace or augment</w:t>
-      </w:r>
-      <w:r>
-        <w:t xml:space="preserve"> </w:t>
-      </w:r>
-      <w:r>
-        <w:t xml:space="preserve">stability with co-expression-network degree/centrality (scRoGG, STRING).</w:t>
+        <w:t xml:space="preserve">Sequence / DNA-LLM features.</w:t>
+      </w:r>
+      <w:r>
+        <w:t xml:space="preserve"> </w:t>
+      </w:r>
+      <w:r>
+        <w:t xml:space="preserve">Cover unexpressed genes and enable</w:t>
+      </w:r>
+      <w:r>
+        <w:t xml:space="preserve"> </w:t>
+      </w:r>
+      <w:r>
+        <w:t xml:space="preserve">cross-species transfer (EssTFNet, dnaHNet, ProteomeLM).</w:t>
       </w:r>
     </w:p>
     <w:p>
@@ -2453,19 +4100,25 @@
           <w:b/>
           <w:bCs/>
         </w:rPr>
-        <w:t xml:space="preserve">Co-essentiality modules.</w:t>
-      </w:r>
-      <w:r>
-        <w:t xml:space="preserve"> </w:t>
-      </w:r>
-      <w:r>
-        <w:t xml:space="preserve">Deliver functionally-enriched modules instead of</w:t>
-      </w:r>
-      <w:r>
-        <w:t xml:space="preserve"> </w:t>
-      </w:r>
-      <w:r>
-        <w:t xml:space="preserve">flat lists.</w:t>
+        <w:t xml:space="preserve">Generative scCRISPR alignment.</w:t>
+      </w:r>
+      <w:r>
+        <w:t xml:space="preserve"> </w:t>
+      </w:r>
+      <w:r>
+        <w:t xml:space="preserve">Where scCRISPR data exist, align/validate</w:t>
+      </w:r>
+      <w:r>
+        <w:t xml:space="preserve"> </w:t>
+      </w:r>
+      <w:r>
+        <w:t xml:space="preserve">against DEGAS/scLAMBDA-style generative essentiality to capture perturbation</w:t>
+      </w:r>
+      <w:r>
+        <w:t xml:space="preserve"> </w:t>
+      </w:r>
+      <w:r>
+        <w:t xml:space="preserve">response and heterogeneity.</w:t>
       </w:r>
     </w:p>
     <w:p>
@@ -2481,35 +4134,19 @@
           <w:b/>
           <w:bCs/>
         </w:rPr>
-        <w:t xml:space="preserve">Built-in benchmark suite.</w:t>
-      </w:r>
-      <w:r>
-        <w:t xml:space="preserve"> </w:t>
-      </w:r>
-      <w:r>
-        <w:t xml:space="preserve">Reproducibly report platform-consistency,</w:t>
-      </w:r>
-      <w:r>
-        <w:t xml:space="preserve"> </w:t>
-      </w:r>
-      <w:r>
-        <w:t xml:space="preserve">housekeeping/Panglao overlap, DepMap AUC, and top-k enrichment — the</w:t>
-      </w:r>
-      <w:r>
-        <w:t xml:space="preserve"> </w:t>
-      </w:r>
-      <w:r>
-        <w:t xml:space="preserve">measurement stick for every other improvement.</w:t>
-      </w:r>
-    </w:p>
-    <w:bookmarkEnd w:id="21"/>
-    <w:bookmarkStart w:id="22" w:name="recommended-roadmap-v2.0"/>
-    <w:p>
-      <w:pPr>
-        <w:pStyle w:val="Heading1"/>
-      </w:pPr>
-      <w:r>
-        <w:t xml:space="preserve">7. Recommended Roadmap (v2.0)</w:t>
+        <w:t xml:space="preserve">Co-essentiality modules.</w:t>
+      </w:r>
+      <w:r>
+        <w:t xml:space="preserve"> </w:t>
+      </w:r>
+      <w:r>
+        <w:t xml:space="preserve">Deliver functionally-enriched modules (with</w:t>
+      </w:r>
+      <w:r>
+        <w:t xml:space="preserve"> </w:t>
+      </w:r>
+      <w:r>
+        <w:t xml:space="preserve">GO/KEGG) instead of flat lists.</w:t>
       </w:r>
     </w:p>
     <w:p>
@@ -2517,11 +4154,43 @@
         <w:pStyle w:val="Compact"/>
         <w:numPr>
           <w:ilvl w:val="0"/>
-          <w:numId w:val="1004"/>
+          <w:numId w:val="1003"/>
         </w:numPr>
       </w:pPr>
       <w:r>
-        <w:t xml:space="preserve">Benchmark suite (enables measurement).</w:t>
+        <w:rPr>
+          <w:b/>
+          <w:bCs/>
+        </w:rPr>
+        <w:t xml:space="preserve">Built-in benchmark suite.</w:t>
+      </w:r>
+      <w:r>
+        <w:t xml:space="preserve"> </w:t>
+      </w:r>
+      <w:r>
+        <w:t xml:space="preserve">Reproducibly report platform-consistency,</w:t>
+      </w:r>
+      <w:r>
+        <w:t xml:space="preserve"> </w:t>
+      </w:r>
+      <w:r>
+        <w:t xml:space="preserve">housekeeping/Panglao overlap, DepMap AUC, Hart/BEAN true-essential overlap, and</w:t>
+      </w:r>
+      <w:r>
+        <w:t xml:space="preserve"> </w:t>
+      </w:r>
+      <w:r>
+        <w:t xml:space="preserve">top-k enrichment — the measurement stick for every other improvement.</w:t>
+      </w:r>
+    </w:p>
+    <w:bookmarkEnd w:id="23"/>
+    <w:bookmarkStart w:id="24" w:name="recommended-roadmap-v2.0"/>
+    <w:p>
+      <w:pPr>
+        <w:pStyle w:val="Heading1"/>
+      </w:pPr>
+      <w:r>
+        <w:t xml:space="preserve">7. Recommended Roadmap (v2.0)</w:t>
       </w:r>
     </w:p>
     <w:p>
@@ -2529,11 +4198,11 @@
         <w:pStyle w:val="Compact"/>
         <w:numPr>
           <w:ilvl w:val="0"/>
-          <w:numId w:val="1004"/>
+          <w:numId w:val="1005"/>
         </w:numPr>
       </w:pPr>
       <w:r>
-        <w:t xml:space="preserve">Supervised score vs. DepMap.</w:t>
+        <w:t xml:space="preserve">Benchmark suite (enables measurement; anchor on DepMap + Hart/BEAN).</w:t>
       </w:r>
     </w:p>
     <w:p>
@@ -2541,11 +4210,11 @@
         <w:pStyle w:val="Compact"/>
         <w:numPr>
           <w:ilvl w:val="0"/>
-          <w:numId w:val="1004"/>
+          <w:numId w:val="1005"/>
         </w:numPr>
       </w:pPr>
       <w:r>
-        <w:t xml:space="preserve">Context-conditional essentiality.</w:t>
+        <w:t xml:space="preserve">Supervised score vs. DepMap/Project Score.</w:t>
       </w:r>
     </w:p>
     <w:p>
@@ -2553,11 +4222,11 @@
         <w:pStyle w:val="Compact"/>
         <w:numPr>
           <w:ilvl w:val="0"/>
-          <w:numId w:val="1004"/>
+          <w:numId w:val="1005"/>
         </w:numPr>
       </w:pPr>
       <w:r>
-        <w:t xml:space="preserve">Network- and module-based delivery.</w:t>
+        <w:t xml:space="preserve">Context-conditional essentiality (with CCLE covariates).</w:t>
       </w:r>
     </w:p>
     <w:p>
@@ -2565,319 +4234,1248 @@
         <w:pStyle w:val="Compact"/>
         <w:numPr>
           <w:ilvl w:val="0"/>
-          <w:numId w:val="1004"/>
+          <w:numId w:val="1005"/>
         </w:numPr>
       </w:pPr>
       <w:r>
+        <w:t xml:space="preserve">Network- and module-based delivery (GNN / topology).</w:t>
+      </w:r>
+    </w:p>
+    <w:p>
+      <w:pPr>
+        <w:pStyle w:val="Compact"/>
+        <w:numPr>
+          <w:ilvl w:val="0"/>
+          <w:numId w:val="1005"/>
+        </w:numPr>
+      </w:pPr>
+      <w:r>
         <w:t xml:space="preserve">DNA-LLM / cross-species (stretch).</w:t>
       </w:r>
     </w:p>
-    <w:bookmarkEnd w:id="22"/>
-    <w:bookmarkStart w:id="23" w:name="verified-repository-annex-2026-08-16"/>
+    <w:bookmarkEnd w:id="24"/>
+    <w:bookmarkStart w:id="25" w:name="X857ac6d28bb025a3947393e3e79a0bba371abe5"/>
     <w:p>
       <w:pPr>
         <w:pStyle w:val="Heading1"/>
       </w:pPr>
       <w:r>
-        <w:t xml:space="preserve">8. Verified Repository Annex (2026-08-16)</w:t>
-      </w:r>
-    </w:p>
-    <w:tbl>
-      <w:tblPr>
-        <w:tblStyle w:val="Table"/>
-        <w:tblW w:type="pct" w:w="5000"/>
-        <w:tblLayout w:type="fixed"/>
-        <w:tblLook w:firstRow="1" w:lastRow="0" w:firstColumn="0" w:lastColumn="0" w:noHBand="0" w:noVBand="0" w:val="0020"/>
-      </w:tblPr>
-      <w:tblGrid>
-        <w:gridCol w:w="4148"/>
-        <w:gridCol w:w="3771"/>
-      </w:tblGrid>
-      <w:tr>
-        <w:trPr>
-          <w:tblHeader w:val="on"/>
-        </w:trPr>
-        <w:tc>
-          <w:tcPr/>
-          <w:p>
-            <w:pPr>
-              <w:pStyle w:val="Compact"/>
-            </w:pPr>
-            <w:r>
-              <w:t xml:space="preserve">Repository</w:t>
-            </w:r>
-          </w:p>
-        </w:tc>
-        <w:tc>
-          <w:tcPr/>
-          <w:p>
-            <w:pPr>
-              <w:pStyle w:val="Compact"/>
-            </w:pPr>
-            <w:r>
-              <w:t xml:space="preserve">Category</w:t>
-            </w:r>
-          </w:p>
-        </w:tc>
-      </w:tr>
-      <w:tr>
-        <w:tc>
-          <w:tcPr/>
-          <w:p>
-            <w:pPr>
-              <w:pStyle w:val="Compact"/>
-            </w:pPr>
-            <w:r>
-              <w:t xml:space="preserve">huiwenzh/scEssentials, huiwenzh/scRoGG</w:t>
-            </w:r>
-          </w:p>
-        </w:tc>
-        <w:tc>
-          <w:tcPr/>
-          <w:p>
-            <w:pPr>
-              <w:pStyle w:val="Compact"/>
-            </w:pPr>
-            <w:r>
-              <w:t xml:space="preserve">expression-robust / co-expression</w:t>
-            </w:r>
-          </w:p>
-        </w:tc>
-      </w:tr>
-      <w:tr>
-        <w:tc>
-          <w:tcPr/>
-          <w:p>
-            <w:pPr>
-              <w:pStyle w:val="Compact"/>
-            </w:pPr>
-            <w:r>
-              <w:t xml:space="preserve">DepMap-Analytics/CoRe, DepMap-Analytics/ADAM2</w:t>
-            </w:r>
-          </w:p>
-        </w:tc>
-        <w:tc>
-          <w:tcPr/>
-          <w:p>
-            <w:pPr>
-              <w:pStyle w:val="Compact"/>
-            </w:pPr>
-            <w:r>
-              <w:t xml:space="preserve">functional essentiality (R)</w:t>
-            </w:r>
-          </w:p>
-        </w:tc>
-      </w:tr>
-      <w:tr>
-        <w:tc>
-          <w:tcPr/>
-          <w:p>
-            <w:pPr>
-              <w:pStyle w:val="Compact"/>
-            </w:pPr>
-            <w:r>
-              <w:t xml:space="preserve">francescojm/ADAM, broadinstitute/depmap-portal</w:t>
-            </w:r>
-          </w:p>
-        </w:tc>
-        <w:tc>
-          <w:tcPr/>
-          <w:p>
-            <w:pPr>
-              <w:pStyle w:val="Compact"/>
-            </w:pPr>
-            <w:r>
-              <w:t xml:space="preserve">functional / portal</w:t>
-            </w:r>
-          </w:p>
-        </w:tc>
-      </w:tr>
-      <w:tr>
-        <w:tc>
-          <w:tcPr/>
-          <w:p>
-            <w:pPr>
-              <w:pStyle w:val="Compact"/>
-            </w:pPr>
-            <w:r>
-              <w:t xml:space="preserve">liulab-dfci/MAGeCK, WubingZhang/MAGeCKFlute</w:t>
-            </w:r>
-          </w:p>
-        </w:tc>
-        <w:tc>
-          <w:tcPr/>
-          <w:p>
-            <w:pPr>
-              <w:pStyle w:val="Compact"/>
-            </w:pPr>
-            <w:r>
-              <w:t xml:space="preserve">CRISPR upstream analysis</w:t>
-            </w:r>
-          </w:p>
-        </w:tc>
-      </w:tr>
-      <w:tr>
-        <w:tc>
-          <w:tcPr/>
-          <w:p>
-            <w:pPr>
-              <w:pStyle w:val="Compact"/>
-            </w:pPr>
-            <w:r>
-              <w:t xml:space="preserve">xzhang2016/DeepHE, xzhang2016/DeepSF</w:t>
-            </w:r>
-          </w:p>
-        </w:tc>
-        <w:tc>
-          <w:tcPr/>
-          <w:p>
-            <w:pPr>
-              <w:pStyle w:val="Compact"/>
-            </w:pPr>
-            <w:r>
-              <w:t xml:space="preserve">deep-learning essentiality</w:t>
-            </w:r>
-          </w:p>
-        </w:tc>
-      </w:tr>
-      <w:tr>
-        <w:tc>
-          <w:tcPr/>
-          <w:p>
-            <w:pPr>
-              <w:pStyle w:val="Compact"/>
-            </w:pPr>
-            <w:r>
-              <w:t xml:space="preserve">QIANJINYDX/EssTFNet, ucrbioinfo/DeeplyEssential</w:t>
-            </w:r>
-          </w:p>
-        </w:tc>
-        <w:tc>
-          <w:tcPr/>
-          <w:p>
-            <w:pPr>
-              <w:pStyle w:val="Compact"/>
-            </w:pPr>
-            <w:r>
-              <w:t xml:space="preserve">DNA-LLM / microbial DNN</w:t>
-            </w:r>
-          </w:p>
-        </w:tc>
-      </w:tr>
-      <w:tr>
-        <w:tc>
-          <w:tcPr/>
-          <w:p>
-            <w:pPr>
-              <w:pStyle w:val="Compact"/>
-            </w:pPr>
-            <w:r>
-              <w:t xml:space="preserve">alaa27/DeepVul, BioDataLearning/XGEP</w:t>
-            </w:r>
-          </w:p>
-        </w:tc>
-        <w:tc>
-          <w:tcPr/>
-          <w:p>
-            <w:pPr>
-              <w:pStyle w:val="Compact"/>
-            </w:pPr>
-            <w:r>
-              <w:t xml:space="preserve">transformer multi-task / lncRNA</w:t>
-            </w:r>
-          </w:p>
-        </w:tc>
-      </w:tr>
-      <w:tr>
-        <w:tc>
-          <w:tcPr/>
-          <w:p>
-            <w:pPr>
-              <w:pStyle w:val="Compact"/>
-            </w:pPr>
-            <w:r>
-              <w:t xml:space="preserve">Bitbol-Lab/ProteomeLM</w:t>
-            </w:r>
-          </w:p>
-        </w:tc>
-        <w:tc>
-          <w:tcPr/>
-          <w:p>
-            <w:pPr>
-              <w:pStyle w:val="Compact"/>
-            </w:pPr>
-            <w:r>
-              <w:t xml:space="preserve">protein language-model embeddings</w:t>
-            </w:r>
-          </w:p>
-        </w:tc>
-      </w:tr>
-    </w:tbl>
-    <w:bookmarkEnd w:id="23"/>
-    <w:bookmarkStart w:id="24" w:name="references"/>
-    <w:p>
-      <w:pPr>
-        <w:pStyle w:val="Heading1"/>
-      </w:pPr>
-      <w:r>
-        <w:t xml:space="preserve">References</w:t>
+        <w:t xml:space="preserve">8. Verified Repository &amp; Dataset Annex (2026-08-18)</w:t>
       </w:r>
     </w:p>
     <w:p>
       <w:pPr>
         <w:pStyle w:val="FirstParagraph"/>
       </w:pPr>
+      <w:r>
+        <w:rPr>
+          <w:b/>
+          <w:bCs/>
+        </w:rPr>
+        <w:t xml:space="preserve">Repositories</w:t>
+      </w:r>
+      <w:r>
+        <w:t xml:space="preserve"> </w:t>
+      </w:r>
+      <w:r>
+        <w:t xml:space="preserve">| Repository | Category |</w:t>
+      </w:r>
+      <w:r>
+        <w:t xml:space="preserve"> </w:t>
+      </w:r>
+      <w:r>
+        <w:t xml:space="preserve">|———–|———-|</w:t>
+      </w:r>
+      <w:r>
+        <w:t xml:space="preserve"> </w:t>
+      </w:r>
+      <w:r>
+        <w:t xml:space="preserve">| huiwenzh/scEssentials, huiwenzh/scRoGG | expression-robust / co-expression |</w:t>
+      </w:r>
+      <w:r>
+        <w:t xml:space="preserve"> </w:t>
+      </w:r>
+      <w:r>
+        <w:t xml:space="preserve">| DepMap-Analytics/CoRe, DepMap-Analytics/ADAM2 | functional essentiality (R) |</w:t>
+      </w:r>
+      <w:r>
+        <w:t xml:space="preserve"> </w:t>
+      </w:r>
+      <w:r>
+        <w:t xml:space="preserve">| francescojm/ADAM, broadinstitute/depmap-portal | functional / portal |</w:t>
+      </w:r>
+      <w:r>
+        <w:t xml:space="preserve"> </w:t>
+      </w:r>
+      <w:r>
+        <w:t xml:space="preserve">| liulab-dfci/MAGeCK, WubingZhang/MAGeCKFlute | CRISPR upstream analysis |</w:t>
+      </w:r>
+      <w:r>
+        <w:t xml:space="preserve"> </w:t>
+      </w:r>
+      <w:r>
+        <w:t xml:space="preserve">| xzhang2016/DeepHE, xzhang2016/DeepSF | deep-learning essentiality |</w:t>
+      </w:r>
+      <w:r>
+        <w:t xml:space="preserve"> </w:t>
+      </w:r>
+      <w:r>
+        <w:t xml:space="preserve">| QIANJINYDX/EssTFNet, ucrbioinfo/DeeplyEssential | DNA-LLM / microbial DNN |</w:t>
+      </w:r>
+      <w:r>
+        <w:t xml:space="preserve"> </w:t>
+      </w:r>
+      <w:r>
+        <w:t xml:space="preserve">| alaa27/DeepVul, BioDataLearning/XGEP | transformer multi-task / lncRNA |</w:t>
+      </w:r>
+      <w:r>
+        <w:t xml:space="preserve"> </w:t>
+      </w:r>
+      <w:r>
+        <w:t xml:space="preserve">| Bitbol-Lab/ProteomeLM | protein language-model embeddings |</w:t>
+      </w:r>
+    </w:p>
+    <w:p>
+      <w:pPr>
+        <w:pStyle w:val="BodyText"/>
+      </w:pPr>
+      <w:r>
+        <w:rPr>
+          <w:b/>
+          <w:bCs/>
+        </w:rPr>
+        <w:t xml:space="preserve">Datasets</w:t>
+      </w:r>
+      <w:r>
+        <w:t xml:space="preserve"> </w:t>
+      </w:r>
+      <w:r>
+        <w:t xml:space="preserve">| Resource | Contents | Access |</w:t>
+      </w:r>
+      <w:r>
+        <w:t xml:space="preserve"> </w:t>
+      </w:r>
+      <w:r>
+        <w:t xml:space="preserve">|———-|———-|——–|</w:t>
+      </w:r>
+      <w:r>
+        <w:t xml:space="preserve"> </w:t>
+      </w:r>
+      <w:r>
+        <w:t xml:space="preserve">| DepMap / Project Achilles | ~1100 lines × 18k genes, CRISPR + RNAi | depmap.org/portal |</w:t>
+      </w:r>
+      <w:r>
+        <w:t xml:space="preserve"> </w:t>
+      </w:r>
+      <w:r>
+        <w:t xml:space="preserve">| Project Score (Sanger) | ~300+ lines, dependency scores | score.depmap.sanger.ac.uk |</w:t>
+      </w:r>
+      <w:r>
+        <w:t xml:space="preserve"> </w:t>
+      </w:r>
+      <w:r>
+        <w:t xml:space="preserve">| CCLE | ~1000 lines genomic covariates | sites.broadinstitute.org/ccle |</w:t>
+      </w:r>
+      <w:r>
+        <w:t xml:space="preserve"> </w:t>
+      </w:r>
+      <w:r>
+        <w:t xml:space="preserve">| DRIVE + Achilles RNAi | RNAi dependency cross-validation | DepMap portal |</w:t>
+      </w:r>
+      <w:r>
+        <w:t xml:space="preserve"> </w:t>
+      </w:r>
+      <w:r>
+        <w:t xml:space="preserve">| Keio (</w:t>
+      </w:r>
       <w:r>
         <w:rPr>
           <w:i/>
           <w:iCs/>
         </w:rPr>
-        <w:t xml:space="preserve">Placeholder — resolve before submission. Candidates:</w:t>
-      </w:r>
-      <w:r>
-        <w:t xml:space="preserve"> </w:t>
-      </w:r>
-      <w:r>
-        <w:t xml:space="preserve">- Ziegenhain et al., 2017 (Mol. Cell) — single-cell platform benchmarking.</w:t>
-      </w:r>
-      <w:r>
-        <w:t xml:space="preserve"> </w:t>
-      </w:r>
-      <w:r>
-        <w:t xml:space="preserve">- Chen et al., 2020 — multi-platform human B-cell line data.</w:t>
-      </w:r>
-      <w:r>
-        <w:t xml:space="preserve"> </w:t>
-      </w:r>
-      <w:r>
-        <w:t xml:space="preserve">- DepMap / Tsherniak et al., 2017 (Nat. Cancer / Cell) — dependency mapping.</w:t>
-      </w:r>
-      <w:r>
-        <w:t xml:space="preserve"> </w:t>
-      </w:r>
-      <w:r>
-        <w:t xml:space="preserve">- The Tabula Sapiens Consortium, 2022 (Science); Tabula Muris Consortium, 2018.</w:t>
-      </w:r>
-      <w:r>
-        <w:t xml:space="preserve"> </w:t>
-      </w:r>
-      <w:r>
-        <w:t xml:space="preserve">- Tan et al. (DEGAS), Nat. Commun. 2023 — deep generative essentiality.</w:t>
-      </w:r>
-      <w:r>
-        <w:t xml:space="preserve"> </w:t>
-      </w:r>
-      <w:r>
-        <w:t xml:space="preserve">- Hounkpe et al., 2021 — housekeeping gene list.</w:t>
-      </w:r>
-      <w:r>
-        <w:t xml:space="preserve"> </w:t>
-      </w:r>
-      <w:r>
-        <w:t xml:space="preserve">- Original scEssentials manuscript (huiwenzh).</w:t>
-      </w:r>
-    </w:p>
-    <w:bookmarkEnd w:id="24"/>
+        <w:t xml:space="preserve">E. coli</w:t>
+      </w:r>
+      <w:r>
+        <w:t xml:space="preserve">) | microbial essentiality gold standard | KHRI/NBRP |</w:t>
+      </w:r>
+      <w:r>
+        <w:t xml:space="preserve"> </w:t>
+      </w:r>
+      <w:r>
+        <w:t xml:space="preserve">| Hart / BEAN | curated</w:t>
+      </w:r>
+      <w:r>
+        <w:t xml:space="preserve"> </w:t>
+      </w:r>
+      <w:r>
+        <w:t xml:space="preserve">“true”</w:t>
+      </w:r>
+      <w:r>
+        <w:t xml:space="preserve"> </w:t>
+      </w:r>
+      <w:r>
+        <w:t xml:space="preserve">essential gene lists | DepMap downloads |</w:t>
+      </w:r>
+      <w:r>
+        <w:t xml:space="preserve"> </w:t>
+      </w:r>
+      <w:r>
+        <w:t xml:space="preserve">| Perturb-seq / scCRISPR | single-cell perturbation essentiality | GEO / Broad portal |</w:t>
+      </w:r>
+      <w:r>
+        <w:t xml:space="preserve"> </w:t>
+      </w:r>
+      <w:r>
+        <w:t xml:space="preserve">| GenomeRNAi | RNAi-based essentiality reference | genomernai.org |</w:t>
+      </w:r>
+      <w:r>
+        <w:t xml:space="preserve"> </w:t>
+      </w:r>
+      <w:r>
+        <w:t xml:space="preserve">| L1000 / CMAP | perturbational signatures | clue.io |</w:t>
+      </w:r>
+    </w:p>
+    <w:bookmarkEnd w:id="25"/>
+    <w:bookmarkStart w:id="31" w:name="references"/>
+    <w:p>
+      <w:pPr>
+        <w:pStyle w:val="Heading1"/>
+      </w:pPr>
+      <w:r>
+        <w:t xml:space="preserve">References</w:t>
+      </w:r>
+    </w:p>
+    <w:bookmarkStart w:id="26" w:name="benchmarks-functional-essentiality"/>
+    <w:p>
+      <w:pPr>
+        <w:pStyle w:val="Heading2"/>
+      </w:pPr>
+      <w:r>
+        <w:t xml:space="preserve">Benchmarks &amp; functional essentiality</w:t>
+      </w:r>
+    </w:p>
+    <w:p>
+      <w:pPr>
+        <w:pStyle w:val="Compact"/>
+        <w:numPr>
+          <w:ilvl w:val="0"/>
+          <w:numId w:val="1006"/>
+        </w:numPr>
+      </w:pPr>
+      <w:r>
+        <w:t xml:space="preserve">Tsherniak A, et al. Defining a Cancer Dependency Map.</w:t>
+      </w:r>
+      <w:r>
+        <w:t xml:space="preserve"> </w:t>
+      </w:r>
+      <w:r>
+        <w:rPr>
+          <w:i/>
+          <w:iCs/>
+        </w:rPr>
+        <w:t xml:space="preserve">Cell</w:t>
+      </w:r>
+      <w:r>
+        <w:t xml:space="preserve"> </w:t>
+      </w:r>
+      <w:r>
+        <w:t xml:space="preserve">2017.</w:t>
+      </w:r>
+    </w:p>
+    <w:p>
+      <w:pPr>
+        <w:pStyle w:val="Compact"/>
+        <w:numPr>
+          <w:ilvl w:val="0"/>
+          <w:numId w:val="1006"/>
+        </w:numPr>
+      </w:pPr>
+      <w:r>
+        <w:t xml:space="preserve">Dempster JM, et al. Extracting biological insights from Project Achilles genome-scale</w:t>
+      </w:r>
+      <w:r>
+        <w:t xml:space="preserve"> </w:t>
+      </w:r>
+      <w:r>
+        <w:t xml:space="preserve">CRISPR screens in cancer cell lines.</w:t>
+      </w:r>
+      <w:r>
+        <w:t xml:space="preserve"> </w:t>
+      </w:r>
+      <w:r>
+        <w:rPr>
+          <w:i/>
+          <w:iCs/>
+        </w:rPr>
+        <w:t xml:space="preserve">Cancer Discov</w:t>
+      </w:r>
+      <w:r>
+        <w:t xml:space="preserve"> </w:t>
+      </w:r>
+      <w:r>
+        <w:t xml:space="preserve">2019. DOI:10.1158/2159-8290.CD-18-0834.</w:t>
+      </w:r>
+    </w:p>
+    <w:p>
+      <w:pPr>
+        <w:pStyle w:val="Compact"/>
+        <w:numPr>
+          <w:ilvl w:val="0"/>
+          <w:numId w:val="1006"/>
+        </w:numPr>
+      </w:pPr>
+      <w:r>
+        <w:t xml:space="preserve">Behan FM, et al. Prioritization of cancer therapeutic targets using CRISPR–Cas9</w:t>
+      </w:r>
+      <w:r>
+        <w:t xml:space="preserve"> </w:t>
+      </w:r>
+      <w:r>
+        <w:t xml:space="preserve">screens.</w:t>
+      </w:r>
+      <w:r>
+        <w:t xml:space="preserve"> </w:t>
+      </w:r>
+      <w:r>
+        <w:rPr>
+          <w:i/>
+          <w:iCs/>
+        </w:rPr>
+        <w:t xml:space="preserve">Nature</w:t>
+      </w:r>
+      <w:r>
+        <w:t xml:space="preserve"> </w:t>
+      </w:r>
+      <w:r>
+        <w:t xml:space="preserve">2019. DOI:10.1038/s41586-019-1103-9.</w:t>
+      </w:r>
+    </w:p>
+    <w:p>
+      <w:pPr>
+        <w:pStyle w:val="Compact"/>
+        <w:numPr>
+          <w:ilvl w:val="0"/>
+          <w:numId w:val="1006"/>
+        </w:numPr>
+      </w:pPr>
+      <w:r>
+        <w:t xml:space="preserve">Dwane L, et al. Project Score database.</w:t>
+      </w:r>
+      <w:r>
+        <w:t xml:space="preserve"> </w:t>
+      </w:r>
+      <w:r>
+        <w:rPr>
+          <w:i/>
+          <w:iCs/>
+        </w:rPr>
+        <w:t xml:space="preserve">Nucleic Acids Res</w:t>
+      </w:r>
+      <w:r>
+        <w:t xml:space="preserve"> </w:t>
+      </w:r>
+      <w:r>
+        <w:t xml:space="preserve">2020. DOI:10.1093/nar/gkaa882.</w:t>
+      </w:r>
+    </w:p>
+    <w:p>
+      <w:pPr>
+        <w:pStyle w:val="Compact"/>
+        <w:numPr>
+          <w:ilvl w:val="0"/>
+          <w:numId w:val="1006"/>
+        </w:numPr>
+      </w:pPr>
+      <w:r>
+        <w:t xml:space="preserve">Barretina J, et al. The Cancer Cell Line Encyclopedia (CCLE).</w:t>
+      </w:r>
+      <w:r>
+        <w:t xml:space="preserve"> </w:t>
+      </w:r>
+      <w:r>
+        <w:rPr>
+          <w:i/>
+          <w:iCs/>
+        </w:rPr>
+        <w:t xml:space="preserve">Nature</w:t>
+      </w:r>
+      <w:r>
+        <w:t xml:space="preserve"> </w:t>
+      </w:r>
+      <w:r>
+        <w:t xml:space="preserve">2012. DOI:10.1038/nature11003.</w:t>
+      </w:r>
+    </w:p>
+    <w:p>
+      <w:pPr>
+        <w:pStyle w:val="Compact"/>
+        <w:numPr>
+          <w:ilvl w:val="0"/>
+          <w:numId w:val="1006"/>
+        </w:numPr>
+      </w:pPr>
+      <w:r>
+        <w:t xml:space="preserve">McDonald ER, et al. Project DRIVE.</w:t>
+      </w:r>
+      <w:r>
+        <w:t xml:space="preserve"> </w:t>
+      </w:r>
+      <w:r>
+        <w:rPr>
+          <w:i/>
+          <w:iCs/>
+        </w:rPr>
+        <w:t xml:space="preserve">Cell</w:t>
+      </w:r>
+      <w:r>
+        <w:t xml:space="preserve"> </w:t>
+      </w:r>
+      <w:r>
+        <w:t xml:space="preserve">2017. DOI:10.1016/j.cell.2017.05.006.</w:t>
+      </w:r>
+    </w:p>
+    <w:p>
+      <w:pPr>
+        <w:pStyle w:val="Compact"/>
+        <w:numPr>
+          <w:ilvl w:val="0"/>
+          <w:numId w:val="1006"/>
+        </w:numPr>
+      </w:pPr>
+      <w:r>
+        <w:t xml:space="preserve">Baba T, et al. Keio collection.</w:t>
+      </w:r>
+      <w:r>
+        <w:t xml:space="preserve"> </w:t>
+      </w:r>
+      <w:r>
+        <w:rPr>
+          <w:i/>
+          <w:iCs/>
+        </w:rPr>
+        <w:t xml:space="preserve">Mol Syst Biol</w:t>
+      </w:r>
+      <w:r>
+        <w:t xml:space="preserve"> </w:t>
+      </w:r>
+      <w:r>
+        <w:t xml:space="preserve">2006. DOI:10.1038/msb4100050.</w:t>
+      </w:r>
+    </w:p>
+    <w:p>
+      <w:pPr>
+        <w:pStyle w:val="Compact"/>
+        <w:numPr>
+          <w:ilvl w:val="0"/>
+          <w:numId w:val="1006"/>
+        </w:numPr>
+      </w:pPr>
+      <w:r>
+        <w:t xml:space="preserve">Schmidt EE, et al. GenomeRNAi.</w:t>
+      </w:r>
+      <w:r>
+        <w:t xml:space="preserve"> </w:t>
+      </w:r>
+      <w:r>
+        <w:rPr>
+          <w:i/>
+          <w:iCs/>
+        </w:rPr>
+        <w:t xml:space="preserve">Nucleic Acids Res</w:t>
+      </w:r>
+      <w:r>
+        <w:t xml:space="preserve"> </w:t>
+      </w:r>
+      <w:r>
+        <w:t xml:space="preserve">2013. DOI:10.1093/nar/gks1171.</w:t>
+      </w:r>
+    </w:p>
+    <w:p>
+      <w:pPr>
+        <w:pStyle w:val="Compact"/>
+        <w:numPr>
+          <w:ilvl w:val="0"/>
+          <w:numId w:val="1006"/>
+        </w:numPr>
+      </w:pPr>
+      <w:r>
+        <w:t xml:space="preserve">Dixit A, et al. Perturb-Seq.</w:t>
+      </w:r>
+      <w:r>
+        <w:t xml:space="preserve"> </w:t>
+      </w:r>
+      <w:r>
+        <w:rPr>
+          <w:i/>
+          <w:iCs/>
+        </w:rPr>
+        <w:t xml:space="preserve">Cell</w:t>
+      </w:r>
+      <w:r>
+        <w:t xml:space="preserve"> </w:t>
+      </w:r>
+      <w:r>
+        <w:t xml:space="preserve">2016. DOI:10.1016/j.cell.2016.11.038.</w:t>
+      </w:r>
+    </w:p>
+    <w:p>
+      <w:pPr>
+        <w:pStyle w:val="Compact"/>
+        <w:numPr>
+          <w:ilvl w:val="0"/>
+          <w:numId w:val="1006"/>
+        </w:numPr>
+      </w:pPr>
+      <w:r>
+        <w:t xml:space="preserve">Subramanian A, et al. L1000/CMAP.</w:t>
+      </w:r>
+      <w:r>
+        <w:t xml:space="preserve"> </w:t>
+      </w:r>
+      <w:r>
+        <w:rPr>
+          <w:i/>
+          <w:iCs/>
+        </w:rPr>
+        <w:t xml:space="preserve">Cell</w:t>
+      </w:r>
+      <w:r>
+        <w:t xml:space="preserve"> </w:t>
+      </w:r>
+      <w:r>
+        <w:t xml:space="preserve">2017. DOI:10.1016/j.cell.2017.10.049.</w:t>
+      </w:r>
+    </w:p>
+    <w:bookmarkEnd w:id="26"/>
+    <w:bookmarkStart w:id="27" w:name="inference-models"/>
+    <w:p>
+      <w:pPr>
+        <w:pStyle w:val="Heading2"/>
+      </w:pPr>
+      <w:r>
+        <w:t xml:space="preserve">Inference models</w:t>
+      </w:r>
+    </w:p>
+    <w:p>
+      <w:pPr>
+        <w:pStyle w:val="Compact"/>
+        <w:numPr>
+          <w:ilvl w:val="0"/>
+          <w:numId w:val="1007"/>
+        </w:numPr>
+      </w:pPr>
+      <w:r>
+        <w:t xml:space="preserve">Dempster JM, et al. Chronos.</w:t>
+      </w:r>
+      <w:r>
+        <w:t xml:space="preserve"> </w:t>
+      </w:r>
+      <w:r>
+        <w:rPr>
+          <w:i/>
+          <w:iCs/>
+        </w:rPr>
+        <w:t xml:space="preserve">Genome Biol</w:t>
+      </w:r>
+      <w:r>
+        <w:t xml:space="preserve"> </w:t>
+      </w:r>
+      <w:r>
+        <w:t xml:space="preserve">2021. DOI:10.1186/s13059-021-02540-7.</w:t>
+      </w:r>
+    </w:p>
+    <w:p>
+      <w:pPr>
+        <w:pStyle w:val="Compact"/>
+        <w:numPr>
+          <w:ilvl w:val="0"/>
+          <w:numId w:val="1007"/>
+        </w:numPr>
+      </w:pPr>
+      <w:r>
+        <w:t xml:space="preserve">Hutton ER, et al. ACE.</w:t>
+      </w:r>
+      <w:r>
+        <w:t xml:space="preserve"> </w:t>
+      </w:r>
+      <w:r>
+        <w:rPr>
+          <w:i/>
+          <w:iCs/>
+        </w:rPr>
+        <w:t xml:space="preserve">Genome Biol</w:t>
+      </w:r>
+      <w:r>
+        <w:t xml:space="preserve"> </w:t>
+      </w:r>
+      <w:r>
+        <w:t xml:space="preserve">2021. DOI:10.1186/s13059-021-02491-z.</w:t>
+      </w:r>
+    </w:p>
+    <w:p>
+      <w:pPr>
+        <w:pStyle w:val="Compact"/>
+        <w:numPr>
+          <w:ilvl w:val="0"/>
+          <w:numId w:val="1007"/>
+        </w:numPr>
+      </w:pPr>
+      <w:r>
+        <w:t xml:space="preserve">Yang et al. High-resolution scCRISPR tiling.</w:t>
+      </w:r>
+      <w:r>
+        <w:t xml:space="preserve"> </w:t>
+      </w:r>
+      <w:r>
+        <w:rPr>
+          <w:i/>
+          <w:iCs/>
+        </w:rPr>
+        <w:t xml:space="preserve">Nat Commun</w:t>
+      </w:r>
+      <w:r>
+        <w:t xml:space="preserve"> </w:t>
+      </w:r>
+      <w:r>
+        <w:t xml:space="preserve">2021. DOI:10.1038/s41467-021-24324-0.</w:t>
+      </w:r>
+    </w:p>
+    <w:p>
+      <w:pPr>
+        <w:pStyle w:val="Compact"/>
+        <w:numPr>
+          <w:ilvl w:val="0"/>
+          <w:numId w:val="1007"/>
+        </w:numPr>
+      </w:pPr>
+      <w:r>
+        <w:t xml:space="preserve">Zhao Y, Zhang M, Yang D. Bioinformatics approaches to CRISPR screen data.</w:t>
+      </w:r>
+      <w:r>
+        <w:t xml:space="preserve"> </w:t>
+      </w:r>
+      <w:r>
+        <w:rPr>
+          <w:i/>
+          <w:iCs/>
+        </w:rPr>
+        <w:t xml:space="preserve">Quant Biol</w:t>
+      </w:r>
+    </w:p>
+    <w:p>
+      <w:pPr>
+        <w:pStyle w:val="Compact"/>
+        <w:numPr>
+          <w:ilvl w:val="1"/>
+          <w:numId w:val="1008"/>
+        </w:numPr>
+      </w:pPr>
+      <w:r>
+        <w:t xml:space="preserve">DOI:10.15302/j-qb-022-0299.</w:t>
+      </w:r>
+    </w:p>
+    <w:bookmarkEnd w:id="27"/>
+    <w:bookmarkStart w:id="28" w:name="generative-sccrispr"/>
+    <w:p>
+      <w:pPr>
+        <w:pStyle w:val="Heading2"/>
+      </w:pPr>
+      <w:r>
+        <w:t xml:space="preserve">Generative / scCRISPR</w:t>
+      </w:r>
+    </w:p>
+    <w:p>
+      <w:pPr>
+        <w:pStyle w:val="Compact"/>
+        <w:numPr>
+          <w:ilvl w:val="0"/>
+          <w:numId w:val="1009"/>
+        </w:numPr>
+      </w:pPr>
+      <w:r>
+        <w:rPr>
+          <w:b/>
+          <w:bCs/>
+        </w:rPr>
+        <w:t xml:space="preserve">DEGAS.</w:t>
+      </w:r>
+      <w:r>
+        <w:t xml:space="preserve"> </w:t>
+      </w:r>
+      <w:r>
+        <w:t xml:space="preserve">Lorbeer, Tan, et al. A deep generative model of gene essentiality from</w:t>
+      </w:r>
+      <w:r>
+        <w:t xml:space="preserve"> </w:t>
+      </w:r>
+      <w:r>
+        <w:t xml:space="preserve">single-cell CRISPR screens.</w:t>
+      </w:r>
+      <w:r>
+        <w:t xml:space="preserve"> </w:t>
+      </w:r>
+      <w:r>
+        <w:rPr>
+          <w:i/>
+          <w:iCs/>
+        </w:rPr>
+        <w:t xml:space="preserve">Nat Commun</w:t>
+      </w:r>
+      <w:r>
+        <w:t xml:space="preserve"> </w:t>
+      </w:r>
+      <w:r>
+        <w:t xml:space="preserve">2023.</w:t>
+      </w:r>
+      <w:r>
+        <w:t xml:space="preserve"> </w:t>
+      </w:r>
+      <w:r>
+        <w:rPr>
+          <w:i/>
+          <w:iCs/>
+        </w:rPr>
+        <w:t xml:space="preserve">(DOI to confirm: 10.1038/s41467-023-…)</w:t>
+      </w:r>
+    </w:p>
+    <w:p>
+      <w:pPr>
+        <w:pStyle w:val="Compact"/>
+        <w:numPr>
+          <w:ilvl w:val="0"/>
+          <w:numId w:val="1009"/>
+        </w:numPr>
+      </w:pPr>
+      <w:r>
+        <w:t xml:space="preserve">Wang et al. scLAMBDA.</w:t>
+      </w:r>
+      <w:r>
+        <w:t xml:space="preserve"> </w:t>
+      </w:r>
+      <w:r>
+        <w:rPr>
+          <w:i/>
+          <w:iCs/>
+        </w:rPr>
+        <w:t xml:space="preserve">bioRxiv</w:t>
+      </w:r>
+      <w:r>
+        <w:t xml:space="preserve"> </w:t>
+      </w:r>
+      <w:r>
+        <w:t xml:space="preserve">2024. DOI:10.1101/2024.12.04.626878.</w:t>
+      </w:r>
+    </w:p>
+    <w:p>
+      <w:pPr>
+        <w:pStyle w:val="Compact"/>
+        <w:numPr>
+          <w:ilvl w:val="0"/>
+          <w:numId w:val="1009"/>
+        </w:numPr>
+      </w:pPr>
+      <w:r>
+        <w:t xml:space="preserve">Yu et al. PerturbNet.</w:t>
+      </w:r>
+      <w:r>
+        <w:t xml:space="preserve"> </w:t>
+      </w:r>
+      <w:r>
+        <w:rPr>
+          <w:i/>
+          <w:iCs/>
+        </w:rPr>
+        <w:t xml:space="preserve">Mol Syst Biol</w:t>
+      </w:r>
+      <w:r>
+        <w:t xml:space="preserve"> </w:t>
+      </w:r>
+      <w:r>
+        <w:t xml:space="preserve">2025. DOI:10.1038/s44320-025-00131-3.</w:t>
+      </w:r>
+    </w:p>
+    <w:bookmarkEnd w:id="28"/>
+    <w:bookmarkStart w:id="29" w:name="deep-learning-predictors-arxiv-verified"/>
+    <w:p>
+      <w:pPr>
+        <w:pStyle w:val="Heading2"/>
+      </w:pPr>
+      <w:r>
+        <w:t xml:space="preserve">Deep-learning predictors (arXiv-verified)</w:t>
+      </w:r>
+    </w:p>
+    <w:p>
+      <w:pPr>
+        <w:pStyle w:val="Compact"/>
+        <w:numPr>
+          <w:ilvl w:val="0"/>
+          <w:numId w:val="1010"/>
+        </w:numPr>
+      </w:pPr>
+      <w:r>
+        <w:t xml:space="preserve">Schapke, Tavares, Recamonde-Mendoza. EPGAT.</w:t>
+      </w:r>
+      <w:r>
+        <w:t xml:space="preserve"> </w:t>
+      </w:r>
+      <w:r>
+        <w:rPr>
+          <w:i/>
+          <w:iCs/>
+        </w:rPr>
+        <w:t xml:space="preserve">arXiv:2007.09671</w:t>
+      </w:r>
+      <w:r>
+        <w:t xml:space="preserve"> </w:t>
+      </w:r>
+      <w:r>
+        <w:t xml:space="preserve">(2020).</w:t>
+      </w:r>
+    </w:p>
+    <w:p>
+      <w:pPr>
+        <w:pStyle w:val="Compact"/>
+        <w:numPr>
+          <w:ilvl w:val="0"/>
+          <w:numId w:val="1010"/>
+        </w:numPr>
+      </w:pPr>
+      <w:r>
+        <w:t xml:space="preserve">Sharma, Marucci, Abdallah. FluxGAT.</w:t>
+      </w:r>
+      <w:r>
+        <w:t xml:space="preserve"> </w:t>
+      </w:r>
+      <w:r>
+        <w:rPr>
+          <w:i/>
+          <w:iCs/>
+        </w:rPr>
+        <w:t xml:space="preserve">arXiv:2403.18666</w:t>
+      </w:r>
+      <w:r>
+        <w:t xml:space="preserve"> </w:t>
+      </w:r>
+      <w:r>
+        <w:t xml:space="preserve">(2024).</w:t>
+      </w:r>
+    </w:p>
+    <w:p>
+      <w:pPr>
+        <w:pStyle w:val="Compact"/>
+        <w:numPr>
+          <w:ilvl w:val="0"/>
+          <w:numId w:val="1010"/>
+        </w:numPr>
+      </w:pPr>
+      <w:r>
+        <w:t xml:space="preserve">Zhang, Cheng. DeepHEN.</w:t>
+      </w:r>
+      <w:r>
+        <w:t xml:space="preserve"> </w:t>
+      </w:r>
+      <w:r>
+        <w:rPr>
+          <w:i/>
+          <w:iCs/>
+        </w:rPr>
+        <w:t xml:space="preserve">arXiv:2309.10008</w:t>
+      </w:r>
+      <w:r>
+        <w:t xml:space="preserve"> </w:t>
+      </w:r>
+      <w:r>
+        <w:t xml:space="preserve">(2023).</w:t>
+      </w:r>
+    </w:p>
+    <w:p>
+      <w:pPr>
+        <w:pStyle w:val="Compact"/>
+        <w:numPr>
+          <w:ilvl w:val="0"/>
+          <w:numId w:val="1010"/>
+        </w:numPr>
+      </w:pPr>
+      <w:r>
+        <w:t xml:space="preserve">Bodinier et al. LeAP.</w:t>
+      </w:r>
+      <w:r>
+        <w:t xml:space="preserve"> </w:t>
+      </w:r>
+      <w:r>
+        <w:rPr>
+          <w:i/>
+          <w:iCs/>
+        </w:rPr>
+        <w:t xml:space="preserve">arXiv:2502.15646</w:t>
+      </w:r>
+      <w:r>
+        <w:t xml:space="preserve"> </w:t>
+      </w:r>
+      <w:r>
+        <w:t xml:space="preserve">(2025).</w:t>
+      </w:r>
+    </w:p>
+    <w:p>
+      <w:pPr>
+        <w:pStyle w:val="Compact"/>
+        <w:numPr>
+          <w:ilvl w:val="0"/>
+          <w:numId w:val="1010"/>
+        </w:numPr>
+      </w:pPr>
+      <w:r>
+        <w:t xml:space="preserve">Boone. Topology-based metabolic essentiality ML.</w:t>
+      </w:r>
+      <w:r>
+        <w:t xml:space="preserve"> </w:t>
+      </w:r>
+      <w:r>
+        <w:rPr>
+          <w:i/>
+          <w:iCs/>
+        </w:rPr>
+        <w:t xml:space="preserve">arXiv:2507.20406</w:t>
+      </w:r>
+      <w:r>
+        <w:t xml:space="preserve"> </w:t>
+      </w:r>
+      <w:r>
+        <w:t xml:space="preserve">(2025).</w:t>
+      </w:r>
+    </w:p>
+    <w:p>
+      <w:pPr>
+        <w:pStyle w:val="Compact"/>
+        <w:numPr>
+          <w:ilvl w:val="0"/>
+          <w:numId w:val="1010"/>
+        </w:numPr>
+      </w:pPr>
+      <w:r>
+        <w:t xml:space="preserve">Zhan, Zhang, Wang. Multiplex-network perturbation DL.</w:t>
+      </w:r>
+      <w:r>
+        <w:t xml:space="preserve"> </w:t>
+      </w:r>
+      <w:r>
+        <w:rPr>
+          <w:i/>
+          <w:iCs/>
+        </w:rPr>
+        <w:t xml:space="preserve">arXiv:2403.02724</w:t>
+      </w:r>
+      <w:r>
+        <w:t xml:space="preserve"> </w:t>
+      </w:r>
+      <w:r>
+        <w:t xml:space="preserve">(2024).</w:t>
+      </w:r>
+    </w:p>
+    <w:p>
+      <w:pPr>
+        <w:pStyle w:val="Compact"/>
+        <w:numPr>
+          <w:ilvl w:val="0"/>
+          <w:numId w:val="1010"/>
+        </w:numPr>
+      </w:pPr>
+      <w:r>
+        <w:t xml:space="preserve">Alkhadrawi et al. Explainable DL for target prioritisation.</w:t>
+      </w:r>
+      <w:r>
+        <w:t xml:space="preserve"> </w:t>
+      </w:r>
+      <w:r>
+        <w:rPr>
+          <w:i/>
+          <w:iCs/>
+        </w:rPr>
+        <w:t xml:space="preserve">arXiv:2511.12463</w:t>
+      </w:r>
+      <w:r>
+        <w:t xml:space="preserve"> </w:t>
+      </w:r>
+      <w:r>
+        <w:t xml:space="preserve">(2025).</w:t>
+      </w:r>
+    </w:p>
+    <w:p>
+      <w:pPr>
+        <w:pStyle w:val="Compact"/>
+        <w:numPr>
+          <w:ilvl w:val="0"/>
+          <w:numId w:val="1010"/>
+        </w:numPr>
+      </w:pPr>
+      <w:r>
+        <w:t xml:space="preserve">Mansouri-Rad, Narimani, Razzaghi. EssentialGIN.</w:t>
+      </w:r>
+      <w:r>
+        <w:t xml:space="preserve"> </w:t>
+      </w:r>
+      <w:r>
+        <w:rPr>
+          <w:i/>
+          <w:iCs/>
+        </w:rPr>
+        <w:t xml:space="preserve">arXiv:2606.07700</w:t>
+      </w:r>
+      <w:r>
+        <w:t xml:space="preserve"> </w:t>
+      </w:r>
+      <w:r>
+        <w:t xml:space="preserve">(2026).</w:t>
+      </w:r>
+    </w:p>
+    <w:p>
+      <w:pPr>
+        <w:pStyle w:val="Compact"/>
+        <w:numPr>
+          <w:ilvl w:val="0"/>
+          <w:numId w:val="1010"/>
+        </w:numPr>
+      </w:pPr>
+      <w:r>
+        <w:t xml:space="preserve">Zhan. Genome-scale deep model on multiplex networks.</w:t>
+      </w:r>
+      <w:r>
+        <w:t xml:space="preserve"> </w:t>
+      </w:r>
+      <w:r>
+        <w:rPr>
+          <w:i/>
+          <w:iCs/>
+        </w:rPr>
+        <w:t xml:space="preserve">arXiv:2403.02724</w:t>
+      </w:r>
+      <w:r>
+        <w:t xml:space="preserve"> </w:t>
+      </w:r>
+      <w:r>
+        <w:t xml:space="preserve">(2024).</w:t>
+      </w:r>
+    </w:p>
+    <w:p>
+      <w:pPr>
+        <w:pStyle w:val="Compact"/>
+        <w:numPr>
+          <w:ilvl w:val="0"/>
+          <w:numId w:val="1010"/>
+        </w:numPr>
+      </w:pPr>
+      <w:r>
+        <w:t xml:space="preserve">Xiao, Zheng, Li. MetaGEM.</w:t>
+      </w:r>
+      <w:r>
+        <w:t xml:space="preserve"> </w:t>
+      </w:r>
+      <w:r>
+        <w:rPr>
+          <w:i/>
+          <w:iCs/>
+        </w:rPr>
+        <w:t xml:space="preserve">arXiv:2605.14812</w:t>
+      </w:r>
+      <w:r>
+        <w:t xml:space="preserve"> </w:t>
+      </w:r>
+      <w:r>
+        <w:t xml:space="preserve">(2026).</w:t>
+      </w:r>
+    </w:p>
+    <w:p>
+      <w:pPr>
+        <w:pStyle w:val="Compact"/>
+        <w:numPr>
+          <w:ilvl w:val="0"/>
+          <w:numId w:val="1010"/>
+        </w:numPr>
+      </w:pPr>
+      <w:r>
+        <w:t xml:space="preserve">Shah, Li. dnaHNet.</w:t>
+      </w:r>
+      <w:r>
+        <w:t xml:space="preserve"> </w:t>
+      </w:r>
+      <w:r>
+        <w:rPr>
+          <w:i/>
+          <w:iCs/>
+        </w:rPr>
+        <w:t xml:space="preserve">arXiv:2602.10603</w:t>
+      </w:r>
+      <w:r>
+        <w:t xml:space="preserve"> </w:t>
+      </w:r>
+      <w:r>
+        <w:t xml:space="preserve">(2026).</w:t>
+      </w:r>
+    </w:p>
+    <w:bookmarkEnd w:id="29"/>
+    <w:bookmarkStart w:id="30" w:name="others-from-direct-search"/>
+    <w:p>
+      <w:pPr>
+        <w:pStyle w:val="Heading2"/>
+      </w:pPr>
+      <w:r>
+        <w:t xml:space="preserve">Others (from direct search)</w:t>
+      </w:r>
+    </w:p>
+    <w:p>
+      <w:pPr>
+        <w:pStyle w:val="Compact"/>
+        <w:numPr>
+          <w:ilvl w:val="0"/>
+          <w:numId w:val="1011"/>
+        </w:numPr>
+      </w:pPr>
+      <w:r>
+        <w:t xml:space="preserve">Zhang, Cheng. DeepHEM.</w:t>
+      </w:r>
+      <w:r>
+        <w:t xml:space="preserve"> </w:t>
+      </w:r>
+      <w:r>
+        <w:rPr>
+          <w:i/>
+          <w:iCs/>
+        </w:rPr>
+        <w:t xml:space="preserve">Mol Ther</w:t>
+      </w:r>
+      <w:r>
+        <w:t xml:space="preserve"> </w:t>
+      </w:r>
+      <w:r>
+        <w:t xml:space="preserve">2025. DOI:10.1016/j.ymthe.2025.11.018.</w:t>
+      </w:r>
+    </w:p>
+    <w:p>
+      <w:pPr>
+        <w:pStyle w:val="Compact"/>
+        <w:numPr>
+          <w:ilvl w:val="0"/>
+          <w:numId w:val="1011"/>
+        </w:numPr>
+      </w:pPr>
+      <w:r>
+        <w:t xml:space="preserve">Gene essentiality via chaos-game representation + spiking NN.</w:t>
+      </w:r>
+      <w:r>
+        <w:t xml:space="preserve"> </w:t>
+      </w:r>
+      <w:r>
+        <w:rPr>
+          <w:i/>
+          <w:iCs/>
+        </w:rPr>
+        <w:t xml:space="preserve">Chaos Solitons Fractals</w:t>
+      </w:r>
+    </w:p>
+    <w:p>
+      <w:pPr>
+        <w:pStyle w:val="Compact"/>
+        <w:numPr>
+          <w:ilvl w:val="1"/>
+          <w:numId w:val="1012"/>
+        </w:numPr>
+      </w:pPr>
+      <w:r>
+        <w:t xml:space="preserve">DOI:10.1016/j.chaos.2021.110649.</w:t>
+      </w:r>
+    </w:p>
+    <w:p>
+      <w:pPr>
+        <w:pStyle w:val="Compact"/>
+        <w:numPr>
+          <w:ilvl w:val="0"/>
+          <w:numId w:val="1011"/>
+        </w:numPr>
+      </w:pPr>
+      <w:r>
+        <w:t xml:space="preserve">Deep gene essentiality based on population/functions.</w:t>
+      </w:r>
+      <w:r>
+        <w:t xml:space="preserve"> </w:t>
+      </w:r>
+      <w:r>
+        <w:rPr>
+          <w:i/>
+          <w:iCs/>
+        </w:rPr>
+        <w:t xml:space="preserve">bioRxiv</w:t>
+      </w:r>
+      <w:r>
+        <w:t xml:space="preserve"> </w:t>
+      </w:r>
+      <w:r>
+        <w:t xml:space="preserve">2021. DOI:10.1101/2021.12.21.473690.</w:t>
+      </w:r>
+    </w:p>
+    <w:p>
+      <w:pPr>
+        <w:pStyle w:val="Compact"/>
+        <w:numPr>
+          <w:ilvl w:val="0"/>
+          <w:numId w:val="1011"/>
+        </w:numPr>
+      </w:pPr>
+      <w:r>
+        <w:t xml:space="preserve">DeEPsnap (multi-omics essentiality).</w:t>
+      </w:r>
+      <w:r>
+        <w:t xml:space="preserve"> </w:t>
+      </w:r>
+      <w:r>
+        <w:rPr>
+          <w:i/>
+          <w:iCs/>
+        </w:rPr>
+        <w:t xml:space="preserve">bioRxiv</w:t>
+      </w:r>
+      <w:r>
+        <w:t xml:space="preserve"> </w:t>
+      </w:r>
+      <w:r>
+        <w:t xml:space="preserve">2024. DOI:10.1101/2024.06.20.599958.</w:t>
+      </w:r>
+    </w:p>
+    <w:p>
+      <w:pPr>
+        <w:pStyle w:val="Compact"/>
+        <w:numPr>
+          <w:ilvl w:val="0"/>
+          <w:numId w:val="1011"/>
+        </w:numPr>
+      </w:pPr>
+      <w:r>
+        <w:t xml:space="preserve">Deep learning-based representation methods for survival &amp; essentiality.</w:t>
+      </w:r>
+      <w:r>
+        <w:t xml:space="preserve"> </w:t>
+      </w:r>
+      <w:r>
+        <w:rPr>
+          <w:i/>
+          <w:iCs/>
+        </w:rPr>
+        <w:t xml:space="preserve">Sci Rep</w:t>
+      </w:r>
+    </w:p>
+    <w:p>
+      <w:pPr>
+        <w:pStyle w:val="Compact"/>
+        <w:numPr>
+          <w:ilvl w:val="1"/>
+          <w:numId w:val="1013"/>
+        </w:numPr>
+      </w:pPr>
+      <w:r>
+        <w:t xml:space="preserve">DOI:10.1038/s41598-024-67023-8.</w:t>
+      </w:r>
+    </w:p>
+    <w:bookmarkEnd w:id="30"/>
+    <w:bookmarkEnd w:id="31"/>
     <w:sectPr>
       <w:footnotePr>
         <w:numRestart w:val="eachSect"/>
@@ -3168,6 +5766,261 @@
     </w:lvl>
     <w:lvl w:ilvl="8">
       <w:start w:val="1"/>
+      <w:numFmt w:val="decimal"/>
+      <w:lvlText w:val="%9."/>
+      <w:lvlJc w:val="left"/>
+      <w:pPr>
+        <w:ind w:left="6480" w:hanging="360"/>
+      </w:pPr>
+    </w:lvl>
+  </w:abstractNum>
+  <w:abstractNum w:abstractNumId="99412022">
+    <w:nsid w:val="A99412022"/>
+    <w:multiLevelType w:val="multilevel"/>
+    <w:lvl w:ilvl="0">
+      <w:start w:val="2022"/>
+      <w:numFmt w:val="decimal"/>
+      <w:lvlText w:val="%1."/>
+      <w:lvlJc w:val="left"/>
+      <w:pPr>
+        <w:ind w:left="720" w:hanging="360"/>
+      </w:pPr>
+    </w:lvl>
+    <w:lvl w:ilvl="1">
+      <w:start w:val="2022"/>
+      <w:numFmt w:val="decimal"/>
+      <w:lvlText w:val="%2."/>
+      <w:lvlJc w:val="left"/>
+      <w:pPr>
+        <w:ind w:left="1440" w:hanging="360"/>
+      </w:pPr>
+    </w:lvl>
+    <w:lvl w:ilvl="2">
+      <w:start w:val="2022"/>
+      <w:numFmt w:val="decimal"/>
+      <w:lvlText w:val="%3."/>
+      <w:lvlJc w:val="left"/>
+      <w:pPr>
+        <w:ind w:left="2160" w:hanging="360"/>
+      </w:pPr>
+    </w:lvl>
+    <w:lvl w:ilvl="3">
+      <w:start w:val="2022"/>
+      <w:numFmt w:val="decimal"/>
+      <w:lvlText w:val="%4."/>
+      <w:lvlJc w:val="left"/>
+      <w:pPr>
+        <w:ind w:left="2880" w:hanging="360"/>
+      </w:pPr>
+    </w:lvl>
+    <w:lvl w:ilvl="4">
+      <w:start w:val="2022"/>
+      <w:numFmt w:val="decimal"/>
+      <w:lvlText w:val="%5."/>
+      <w:lvlJc w:val="left"/>
+      <w:pPr>
+        <w:ind w:left="3600" w:hanging="360"/>
+      </w:pPr>
+    </w:lvl>
+    <w:lvl w:ilvl="5">
+      <w:start w:val="2022"/>
+      <w:numFmt w:val="decimal"/>
+      <w:lvlText w:val="%6."/>
+      <w:lvlJc w:val="left"/>
+      <w:pPr>
+        <w:ind w:left="4320" w:hanging="360"/>
+      </w:pPr>
+    </w:lvl>
+    <w:lvl w:ilvl="6">
+      <w:start w:val="2022"/>
+      <w:numFmt w:val="decimal"/>
+      <w:lvlText w:val="%7."/>
+      <w:lvlJc w:val="left"/>
+      <w:pPr>
+        <w:ind w:left="5040" w:hanging="360"/>
+      </w:pPr>
+    </w:lvl>
+    <w:lvl w:ilvl="7">
+      <w:start w:val="2022"/>
+      <w:numFmt w:val="decimal"/>
+      <w:lvlText w:val="%8."/>
+      <w:lvlJc w:val="left"/>
+      <w:pPr>
+        <w:ind w:left="5760" w:hanging="360"/>
+      </w:pPr>
+    </w:lvl>
+    <w:lvl w:ilvl="8">
+      <w:start w:val="2022"/>
+      <w:numFmt w:val="decimal"/>
+      <w:lvlText w:val="%9."/>
+      <w:lvlJc w:val="left"/>
+      <w:pPr>
+        <w:ind w:left="6480" w:hanging="360"/>
+      </w:pPr>
+    </w:lvl>
+  </w:abstractNum>
+  <w:abstractNum w:abstractNumId="99412021">
+    <w:nsid w:val="A99412021"/>
+    <w:multiLevelType w:val="multilevel"/>
+    <w:lvl w:ilvl="0">
+      <w:start w:val="2021"/>
+      <w:numFmt w:val="decimal"/>
+      <w:lvlText w:val="%1."/>
+      <w:lvlJc w:val="left"/>
+      <w:pPr>
+        <w:ind w:left="720" w:hanging="360"/>
+      </w:pPr>
+    </w:lvl>
+    <w:lvl w:ilvl="1">
+      <w:start w:val="2021"/>
+      <w:numFmt w:val="decimal"/>
+      <w:lvlText w:val="%2."/>
+      <w:lvlJc w:val="left"/>
+      <w:pPr>
+        <w:ind w:left="1440" w:hanging="360"/>
+      </w:pPr>
+    </w:lvl>
+    <w:lvl w:ilvl="2">
+      <w:start w:val="2021"/>
+      <w:numFmt w:val="decimal"/>
+      <w:lvlText w:val="%3."/>
+      <w:lvlJc w:val="left"/>
+      <w:pPr>
+        <w:ind w:left="2160" w:hanging="360"/>
+      </w:pPr>
+    </w:lvl>
+    <w:lvl w:ilvl="3">
+      <w:start w:val="2021"/>
+      <w:numFmt w:val="decimal"/>
+      <w:lvlText w:val="%4."/>
+      <w:lvlJc w:val="left"/>
+      <w:pPr>
+        <w:ind w:left="2880" w:hanging="360"/>
+      </w:pPr>
+    </w:lvl>
+    <w:lvl w:ilvl="4">
+      <w:start w:val="2021"/>
+      <w:numFmt w:val="decimal"/>
+      <w:lvlText w:val="%5."/>
+      <w:lvlJc w:val="left"/>
+      <w:pPr>
+        <w:ind w:left="3600" w:hanging="360"/>
+      </w:pPr>
+    </w:lvl>
+    <w:lvl w:ilvl="5">
+      <w:start w:val="2021"/>
+      <w:numFmt w:val="decimal"/>
+      <w:lvlText w:val="%6."/>
+      <w:lvlJc w:val="left"/>
+      <w:pPr>
+        <w:ind w:left="4320" w:hanging="360"/>
+      </w:pPr>
+    </w:lvl>
+    <w:lvl w:ilvl="6">
+      <w:start w:val="2021"/>
+      <w:numFmt w:val="decimal"/>
+      <w:lvlText w:val="%7."/>
+      <w:lvlJc w:val="left"/>
+      <w:pPr>
+        <w:ind w:left="5040" w:hanging="360"/>
+      </w:pPr>
+    </w:lvl>
+    <w:lvl w:ilvl="7">
+      <w:start w:val="2021"/>
+      <w:numFmt w:val="decimal"/>
+      <w:lvlText w:val="%8."/>
+      <w:lvlJc w:val="left"/>
+      <w:pPr>
+        <w:ind w:left="5760" w:hanging="360"/>
+      </w:pPr>
+    </w:lvl>
+    <w:lvl w:ilvl="8">
+      <w:start w:val="2021"/>
+      <w:numFmt w:val="decimal"/>
+      <w:lvlText w:val="%9."/>
+      <w:lvlJc w:val="left"/>
+      <w:pPr>
+        <w:ind w:left="6480" w:hanging="360"/>
+      </w:pPr>
+    </w:lvl>
+  </w:abstractNum>
+  <w:abstractNum w:abstractNumId="99412024">
+    <w:nsid w:val="A99412024"/>
+    <w:multiLevelType w:val="multilevel"/>
+    <w:lvl w:ilvl="0">
+      <w:start w:val="2024"/>
+      <w:numFmt w:val="decimal"/>
+      <w:lvlText w:val="%1."/>
+      <w:lvlJc w:val="left"/>
+      <w:pPr>
+        <w:ind w:left="720" w:hanging="360"/>
+      </w:pPr>
+    </w:lvl>
+    <w:lvl w:ilvl="1">
+      <w:start w:val="2024"/>
+      <w:numFmt w:val="decimal"/>
+      <w:lvlText w:val="%2."/>
+      <w:lvlJc w:val="left"/>
+      <w:pPr>
+        <w:ind w:left="1440" w:hanging="360"/>
+      </w:pPr>
+    </w:lvl>
+    <w:lvl w:ilvl="2">
+      <w:start w:val="2024"/>
+      <w:numFmt w:val="decimal"/>
+      <w:lvlText w:val="%3."/>
+      <w:lvlJc w:val="left"/>
+      <w:pPr>
+        <w:ind w:left="2160" w:hanging="360"/>
+      </w:pPr>
+    </w:lvl>
+    <w:lvl w:ilvl="3">
+      <w:start w:val="2024"/>
+      <w:numFmt w:val="decimal"/>
+      <w:lvlText w:val="%4."/>
+      <w:lvlJc w:val="left"/>
+      <w:pPr>
+        <w:ind w:left="2880" w:hanging="360"/>
+      </w:pPr>
+    </w:lvl>
+    <w:lvl w:ilvl="4">
+      <w:start w:val="2024"/>
+      <w:numFmt w:val="decimal"/>
+      <w:lvlText w:val="%5."/>
+      <w:lvlJc w:val="left"/>
+      <w:pPr>
+        <w:ind w:left="3600" w:hanging="360"/>
+      </w:pPr>
+    </w:lvl>
+    <w:lvl w:ilvl="5">
+      <w:start w:val="2024"/>
+      <w:numFmt w:val="decimal"/>
+      <w:lvlText w:val="%6."/>
+      <w:lvlJc w:val="left"/>
+      <w:pPr>
+        <w:ind w:left="4320" w:hanging="360"/>
+      </w:pPr>
+    </w:lvl>
+    <w:lvl w:ilvl="6">
+      <w:start w:val="2024"/>
+      <w:numFmt w:val="decimal"/>
+      <w:lvlText w:val="%7."/>
+      <w:lvlJc w:val="left"/>
+      <w:pPr>
+        <w:ind w:left="5040" w:hanging="360"/>
+      </w:pPr>
+    </w:lvl>
+    <w:lvl w:ilvl="7">
+      <w:start w:val="2024"/>
+      <w:numFmt w:val="decimal"/>
+      <w:lvlText w:val="%8."/>
+      <w:lvlJc w:val="left"/>
+      <w:pPr>
+        <w:ind w:left="5760" w:hanging="360"/>
+      </w:pPr>
+    </w:lvl>
+    <w:lvl w:ilvl="8">
+      <w:start w:val="2024"/>
       <w:numFmt w:val="decimal"/>
       <w:lvlText w:val="%9."/>
       <w:lvlJc w:val="left"/>
@@ -3243,6 +6096,9 @@
     </w:lvlOverride>
   </w:num>
   <w:num w:numId="1004">
+    <w:abstractNumId w:val="991"/>
+  </w:num>
+  <w:num w:numId="1005">
     <w:abstractNumId w:val="99411"/>
     <w:lvlOverride w:ilvl="0">
       <w:startOverride w:val="1"/>
@@ -3270,6 +6126,111 @@
     </w:lvlOverride>
     <w:lvlOverride w:ilvl="8">
       <w:startOverride w:val="1"/>
+    </w:lvlOverride>
+  </w:num>
+  <w:num w:numId="1006">
+    <w:abstractNumId w:val="991"/>
+  </w:num>
+  <w:num w:numId="1007">
+    <w:abstractNumId w:val="991"/>
+  </w:num>
+  <w:num w:numId="1008">
+    <w:abstractNumId w:val="99412022"/>
+    <w:lvlOverride w:ilvl="0">
+      <w:startOverride w:val="2022"/>
+    </w:lvlOverride>
+    <w:lvlOverride w:ilvl="1">
+      <w:startOverride w:val="2022"/>
+    </w:lvlOverride>
+    <w:lvlOverride w:ilvl="2">
+      <w:startOverride w:val="2022"/>
+    </w:lvlOverride>
+    <w:lvlOverride w:ilvl="3">
+      <w:startOverride w:val="2022"/>
+    </w:lvlOverride>
+    <w:lvlOverride w:ilvl="4">
+      <w:startOverride w:val="2022"/>
+    </w:lvlOverride>
+    <w:lvlOverride w:ilvl="5">
+      <w:startOverride w:val="2022"/>
+    </w:lvlOverride>
+    <w:lvlOverride w:ilvl="6">
+      <w:startOverride w:val="2022"/>
+    </w:lvlOverride>
+    <w:lvlOverride w:ilvl="7">
+      <w:startOverride w:val="2022"/>
+    </w:lvlOverride>
+    <w:lvlOverride w:ilvl="8">
+      <w:startOverride w:val="2022"/>
+    </w:lvlOverride>
+  </w:num>
+  <w:num w:numId="1009">
+    <w:abstractNumId w:val="991"/>
+  </w:num>
+  <w:num w:numId="1010">
+    <w:abstractNumId w:val="991"/>
+  </w:num>
+  <w:num w:numId="1011">
+    <w:abstractNumId w:val="991"/>
+  </w:num>
+  <w:num w:numId="1012">
+    <w:abstractNumId w:val="99412021"/>
+    <w:lvlOverride w:ilvl="0">
+      <w:startOverride w:val="2021"/>
+    </w:lvlOverride>
+    <w:lvlOverride w:ilvl="1">
+      <w:startOverride w:val="2021"/>
+    </w:lvlOverride>
+    <w:lvlOverride w:ilvl="2">
+      <w:startOverride w:val="2021"/>
+    </w:lvlOverride>
+    <w:lvlOverride w:ilvl="3">
+      <w:startOverride w:val="2021"/>
+    </w:lvlOverride>
+    <w:lvlOverride w:ilvl="4">
+      <w:startOverride w:val="2021"/>
+    </w:lvlOverride>
+    <w:lvlOverride w:ilvl="5">
+      <w:startOverride w:val="2021"/>
+    </w:lvlOverride>
+    <w:lvlOverride w:ilvl="6">
+      <w:startOverride w:val="2021"/>
+    </w:lvlOverride>
+    <w:lvlOverride w:ilvl="7">
+      <w:startOverride w:val="2021"/>
+    </w:lvlOverride>
+    <w:lvlOverride w:ilvl="8">
+      <w:startOverride w:val="2021"/>
+    </w:lvlOverride>
+  </w:num>
+  <w:num w:numId="1013">
+    <w:abstractNumId w:val="99412024"/>
+    <w:lvlOverride w:ilvl="0">
+      <w:startOverride w:val="2024"/>
+    </w:lvlOverride>
+    <w:lvlOverride w:ilvl="1">
+      <w:startOverride w:val="2024"/>
+    </w:lvlOverride>
+    <w:lvlOverride w:ilvl="2">
+      <w:startOverride w:val="2024"/>
+    </w:lvlOverride>
+    <w:lvlOverride w:ilvl="3">
+      <w:startOverride w:val="2024"/>
+    </w:lvlOverride>
+    <w:lvlOverride w:ilvl="4">
+      <w:startOverride w:val="2024"/>
+    </w:lvlOverride>
+    <w:lvlOverride w:ilvl="5">
+      <w:startOverride w:val="2024"/>
+    </w:lvlOverride>
+    <w:lvlOverride w:ilvl="6">
+      <w:startOverride w:val="2024"/>
+    </w:lvlOverride>
+    <w:lvlOverride w:ilvl="7">
+      <w:startOverride w:val="2024"/>
+    </w:lvlOverride>
+    <w:lvlOverride w:ilvl="8">
+      <w:startOverride w:val="2024"/>
     </w:lvlOverride>
   </w:num>
 </w:numbering>

</xml_diff>

<commit_message>
Remove unverifiable DEGAS/scEVE/CHNet citations; keep as honest verification note; regenerate docx
</commit_message>
<xml_diff>
--- a/manuscript_review.docx
+++ b/manuscript_review.docx
@@ -111,7 +111,7 @@
         <w:t xml:space="preserve"> </w:t>
       </w:r>
       <w:r>
-        <w:t xml:space="preserve">generative models (DEGAS, scLAMBDA, PerturbNet) — and critically compares the two</w:t>
+        <w:t xml:space="preserve">generative models (scLAMBDA, PerturbNet) — and critically compares the two</w:t>
       </w:r>
       <w:r>
         <w:t xml:space="preserve"> </w:t>
@@ -2580,7 +2580,13 @@
         <w:t xml:space="preserve"> </w:t>
       </w:r>
       <w:r>
-        <w:t xml:space="preserve">essentiality from scCRISPR screens:</w:t>
+        <w:t xml:space="preserve">essentiality from scCRISPR screens. The following are verifiable via public APIs</w:t>
+      </w:r>
+      <w:r>
+        <w:t xml:space="preserve"> </w:t>
+      </w:r>
+      <w:r>
+        <w:t xml:space="preserve">(PubMed / Crossref / Europe PMC):</w:t>
       </w:r>
     </w:p>
     <w:tbl>
@@ -2657,56 +2663,6 @@
                 <w:b/>
                 <w:bCs/>
               </w:rPr>
-              <w:t xml:space="preserve">DEGAS</w:t>
-            </w:r>
-          </w:p>
-        </w:tc>
-        <w:tc>
-          <w:tcPr/>
-          <w:p>
-            <w:pPr>
-              <w:pStyle w:val="Compact"/>
-            </w:pPr>
-            <w:r>
-              <w:t xml:space="preserve">2023</w:t>
-            </w:r>
-          </w:p>
-        </w:tc>
-        <w:tc>
-          <w:tcPr/>
-          <w:p>
-            <w:pPr>
-              <w:pStyle w:val="Compact"/>
-            </w:pPr>
-            <w:r>
-              <w:t xml:space="preserve">Nat Commun</w:t>
-            </w:r>
-          </w:p>
-        </w:tc>
-        <w:tc>
-          <w:tcPr/>
-          <w:p>
-            <w:pPr>
-              <w:pStyle w:val="Compact"/>
-            </w:pPr>
-            <w:r>
-              <w:t xml:space="preserve">deep generative (VAE) model of gene essentiality from single-cell CRISPR screens</w:t>
-            </w:r>
-          </w:p>
-        </w:tc>
-      </w:tr>
-      <w:tr>
-        <w:tc>
-          <w:tcPr/>
-          <w:p>
-            <w:pPr>
-              <w:pStyle w:val="Compact"/>
-            </w:pPr>
-            <w:r>
-              <w:rPr>
-                <w:b/>
-                <w:bCs/>
-              </w:rPr>
               <w:t xml:space="preserve">scLAMBDA</w:t>
             </w:r>
           </w:p>
@@ -2933,6 +2889,52 @@
           </w:p>
         </w:tc>
       </w:tr>
+      <w:tr>
+        <w:tc>
+          <w:tcPr/>
+          <w:p>
+            <w:pPr>
+              <w:pStyle w:val="Compact"/>
+            </w:pPr>
+            <w:r>
+              <w:t xml:space="preserve">Single-cell CRISPR essentiality assay</w:t>
+            </w:r>
+          </w:p>
+        </w:tc>
+        <w:tc>
+          <w:tcPr/>
+          <w:p>
+            <w:pPr>
+              <w:pStyle w:val="Compact"/>
+            </w:pPr>
+            <w:r>
+              <w:t xml:space="preserve">2015</w:t>
+            </w:r>
+          </w:p>
+        </w:tc>
+        <w:tc>
+          <w:tcPr/>
+          <w:p>
+            <w:pPr>
+              <w:pStyle w:val="Compact"/>
+            </w:pPr>
+            <w:r>
+              <w:t xml:space="preserve">Biol Proced Online (PMID:26578851)</w:t>
+            </w:r>
+          </w:p>
+        </w:tc>
+        <w:tc>
+          <w:tcPr/>
+          <w:p>
+            <w:pPr>
+              <w:pStyle w:val="Compact"/>
+            </w:pPr>
+            <w:r>
+              <w:t xml:space="preserve">medium-throughput single-cell CRISPR essentiality assay</w:t>
+            </w:r>
+          </w:p>
+        </w:tc>
+      </w:tr>
     </w:tbl>
     <w:p>
       <w:pPr>
@@ -2949,25 +2951,135 @@
         <w:t xml:space="preserve"> </w:t>
       </w:r>
       <w:r>
-        <w:t xml:space="preserve">DEGAS is a journal-only publication (not on arXiv); its</w:t>
-      </w:r>
-      <w:r>
-        <w:t xml:space="preserve"> </w:t>
-      </w:r>
-      <w:r>
-        <w:t xml:space="preserve">exact DOI could not be auto-verified from title search during this review. It is</w:t>
-      </w:r>
-      <w:r>
-        <w:t xml:space="preserve"> </w:t>
-      </w:r>
-      <w:r>
-        <w:t xml:space="preserve">cited here from domain knowledge; confirm the DOI (Nat Commun 2023,</w:t>
-      </w:r>
-      <w:r>
-        <w:t xml:space="preserve"> </w:t>
-      </w:r>
-      <w:r>
-        <w:t xml:space="preserve">~10.1038/s41467-023-…) before submission.</w:t>
+        <w:t xml:space="preserve">The widely-cited</w:t>
+      </w:r>
+      <w:r>
+        <w:t xml:space="preserve"> </w:t>
+      </w:r>
+      <w:r>
+        <w:rPr>
+          <w:b/>
+          <w:bCs/>
+        </w:rPr>
+        <w:t xml:space="preserve">DEGAS</w:t>
+      </w:r>
+      <w:r>
+        <w:t xml:space="preserve"> </w:t>
+      </w:r>
+      <w:r>
+        <w:t xml:space="preserve">(</w:t>
+      </w:r>
+      <w:r>
+        <w:t xml:space="preserve">“A deep generative model of</w:t>
+      </w:r>
+      <w:r>
+        <w:t xml:space="preserve"> </w:t>
+      </w:r>
+      <w:r>
+        <w:t xml:space="preserve">gene essentiality from single-cell CRISPR screens,”</w:t>
+      </w:r>
+      <w:r>
+        <w:t xml:space="preserve"> </w:t>
+      </w:r>
+      <w:r>
+        <w:t xml:space="preserve">attributed to Lorbeer, Tan,</w:t>
+      </w:r>
+      <w:r>
+        <w:t xml:space="preserve"> </w:t>
+      </w:r>
+      <w:r>
+        <w:t xml:space="preserve">et al., Nat Commun 2023) could</w:t>
+      </w:r>
+      <w:r>
+        <w:t xml:space="preserve"> </w:t>
+      </w:r>
+      <w:r>
+        <w:rPr>
+          <w:b/>
+          <w:bCs/>
+        </w:rPr>
+        <w:t xml:space="preserve">not be confirmed</w:t>
+      </w:r>
+      <w:r>
+        <w:t xml:space="preserve"> </w:t>
+      </w:r>
+      <w:r>
+        <w:t xml:space="preserve">through PubMed, Crossref,</w:t>
+      </w:r>
+      <w:r>
+        <w:t xml:space="preserve"> </w:t>
+      </w:r>
+      <w:r>
+        <w:t xml:space="preserve">Europe PMC, or arXiv title/name searches performed for this review, and no</w:t>
+      </w:r>
+      <w:r>
+        <w:t xml:space="preserve"> </w:t>
+      </w:r>
+      <w:r>
+        <w:t xml:space="preserve">canonical public repository was found. It is therefore</w:t>
+      </w:r>
+      <w:r>
+        <w:t xml:space="preserve"> </w:t>
+      </w:r>
+      <w:r>
+        <w:rPr>
+          <w:b/>
+          <w:bCs/>
+        </w:rPr>
+        <w:t xml:space="preserve">not</w:t>
+      </w:r>
+      <w:r>
+        <w:t xml:space="preserve"> </w:t>
+      </w:r>
+      <w:r>
+        <w:t xml:space="preserve">included in the</w:t>
+      </w:r>
+      <w:r>
+        <w:t xml:space="preserve"> </w:t>
+      </w:r>
+      <w:r>
+        <w:t xml:space="preserve">verified table above; if it is to be cited, its DOI and authorship must be</w:t>
+      </w:r>
+      <w:r>
+        <w:t xml:space="preserve"> </w:t>
+      </w:r>
+      <w:r>
+        <w:t xml:space="preserve">confirmed from the original publication before submission. The same applies to</w:t>
+      </w:r>
+      <w:r>
+        <w:t xml:space="preserve"> </w:t>
+      </w:r>
+      <w:r>
+        <w:rPr>
+          <w:b/>
+          <w:bCs/>
+        </w:rPr>
+        <w:t xml:space="preserve">scEVE</w:t>
+      </w:r>
+      <w:r>
+        <w:t xml:space="preserve"> </w:t>
+      </w:r>
+      <w:r>
+        <w:t xml:space="preserve">and</w:t>
+      </w:r>
+      <w:r>
+        <w:t xml:space="preserve"> </w:t>
+      </w:r>
+      <w:r>
+        <w:rPr>
+          <w:b/>
+          <w:bCs/>
+        </w:rPr>
+        <w:t xml:space="preserve">CHNet</w:t>
+      </w:r>
+      <w:r>
+        <w:t xml:space="preserve">, which appear in the essentiality literature but could not</w:t>
+      </w:r>
+      <w:r>
+        <w:t xml:space="preserve"> </w:t>
+      </w:r>
+      <w:r>
+        <w:t xml:space="preserve">be verified against public APIs or a canonical repository.</w:t>
       </w:r>
     </w:p>
     <w:bookmarkEnd w:id="16"/>
@@ -3027,13 +3139,19 @@
         <w:t xml:space="preserve"> </w:t>
       </w:r>
       <w:r>
-        <w:t xml:space="preserve">confirmed in a canonical GitHub repository during this survey; they should be</w:t>
-      </w:r>
-      <w:r>
-        <w:t xml:space="preserve"> </w:t>
-      </w:r>
-      <w:r>
-        <w:t xml:space="preserve">sourced from their papers directly.</w:t>
+        <w:t xml:space="preserve">verified in this survey (neither a canonical GitHub repository nor a resolvable</w:t>
+      </w:r>
+      <w:r>
+        <w:t xml:space="preserve"> </w:t>
+      </w:r>
+      <w:r>
+        <w:t xml:space="preserve">DOI via PubMed/Crossref/Europe PMC/arXiv). They should be sourced directly from</w:t>
+      </w:r>
+      <w:r>
+        <w:t xml:space="preserve"> </w:t>
+      </w:r>
+      <w:r>
+        <w:t xml:space="preserve">their papers, with DOI and authorship confirmed, before being cited.</w:t>
       </w:r>
     </w:p>
     <w:bookmarkEnd w:id="17"/>
@@ -3591,7 +3709,7 @@
           <w:b/>
           <w:bCs/>
         </w:rPr>
-        <w:t xml:space="preserve">Generative / scCRISPR (DEGAS, scLAMBDA, PerturbNet).</w:t>
+        <w:t xml:space="preserve">Generative / scCRISPR (scLAMBDA, PerturbNet).</w:t>
       </w:r>
       <w:r>
         <w:t xml:space="preserve"> </w:t>
@@ -4112,7 +4230,7 @@
         <w:t xml:space="preserve"> </w:t>
       </w:r>
       <w:r>
-        <w:t xml:space="preserve">against DEGAS/scLAMBDA-style generative essentiality to capture perturbation</w:t>
+        <w:t xml:space="preserve">against scLAMBDA/PerturbNet-style generative essentiality to capture perturbation</w:t>
       </w:r>
       <w:r>
         <w:t xml:space="preserve"> </w:t>
@@ -4882,60 +5000,6 @@
       </w:pPr>
       <w:r>
         <w:t xml:space="preserve">Generative / scCRISPR</w:t>
-      </w:r>
-    </w:p>
-    <w:p>
-      <w:pPr>
-        <w:pStyle w:val="Compact"/>
-        <w:numPr>
-          <w:ilvl w:val="0"/>
-          <w:numId w:val="1009"/>
-        </w:numPr>
-      </w:pPr>
-      <w:r>
-        <w:rPr>
-          <w:b/>
-          <w:bCs/>
-        </w:rPr>
-        <w:t xml:space="preserve">DEGAS.</w:t>
-      </w:r>
-      <w:r>
-        <w:t xml:space="preserve"> </w:t>
-      </w:r>
-      <w:r>
-        <w:t xml:space="preserve">Lorbeer, Tan, et al. A deep generative model of gene essentiality from</w:t>
-      </w:r>
-      <w:r>
-        <w:t xml:space="preserve"> </w:t>
-      </w:r>
-      <w:r>
-        <w:t xml:space="preserve">single-cell CRISPR screens.</w:t>
-      </w:r>
-      <w:r>
-        <w:t xml:space="preserve"> </w:t>
-      </w:r>
-      <w:r>
-        <w:rPr>
-          <w:i/>
-          <w:iCs/>
-        </w:rPr>
-        <w:t xml:space="preserve">Nat Commun</w:t>
-      </w:r>
-      <w:r>
-        <w:t xml:space="preserve"> </w:t>
-      </w:r>
-      <w:r>
-        <w:t xml:space="preserve">2023.</w:t>
-      </w:r>
-      <w:r>
-        <w:t xml:space="preserve"> </w:t>
-      </w:r>
-      <w:r>
-        <w:rPr>
-          <w:i/>
-          <w:iCs/>
-        </w:rPr>
-        <w:t xml:space="preserve">(DOI to confirm: 10.1038/s41467-023-…)</w:t>
       </w:r>
     </w:p>
     <w:p>

</xml_diff>

<commit_message>
Add comparison figure (radar + dimension scores) and embed into EN/ZH manuscripts
</commit_message>
<xml_diff>
--- a/manuscript_review.docx
+++ b/manuscript_review.docx
@@ -3156,7 +3156,7 @@
     </w:p>
     <w:bookmarkEnd w:id="17"/>
     <w:bookmarkEnd w:id="18"/>
-    <w:bookmarkStart w:id="21" w:name="comparison-and-strengths-weaknesses"/>
+    <w:bookmarkStart w:id="25" w:name="comparison-and-strengths-weaknesses"/>
     <w:p>
       <w:pPr>
         <w:pStyle w:val="Heading1"/>
@@ -3165,7 +3165,102 @@
         <w:t xml:space="preserve">4. Comparison and Strengths / Weaknesses</w:t>
       </w:r>
     </w:p>
-    <w:bookmarkStart w:id="19" w:name="cross-cutting-comparison"/>
+    <w:bookmarkStart w:id="22" w:name="fig:comparison"/>
+    <w:p>
+      <w:pPr>
+        <w:pStyle w:val="CaptionedFigure"/>
+      </w:pPr>
+      <w:r>
+        <w:drawing>
+          <wp:inline>
+            <wp:extent cx="5067300" cy="2244850"/>
+            <wp:effectExtent b="0" l="0" r="0" t="0"/>
+            <wp:docPr descr="Comparison of the four method paradigms across six qualitative dimensions. (A) Radar chart. (B) Grouped dimension scores. Scores range 0–5 and reflect the authors’ qualitative assessment from the survey in Section 3." title="" id="20" name="Picture"/>
+            <a:graphic>
+              <a:graphicData uri="http://schemas.openxmlformats.org/drawingml/2006/picture">
+                <pic:pic>
+                  <pic:nvPicPr>
+                    <pic:cNvPr descr="manuscript_figure_comparison.png" id="21" name="Picture"/>
+                    <pic:cNvPicPr>
+                      <a:picLocks noChangeArrowheads="1" noChangeAspect="1"/>
+                    </pic:cNvPicPr>
+                  </pic:nvPicPr>
+                  <pic:blipFill>
+                    <a:blip r:embed="rId19"/>
+                    <a:stretch>
+                      <a:fillRect/>
+                    </a:stretch>
+                  </pic:blipFill>
+                  <pic:spPr bwMode="auto">
+                    <a:xfrm>
+                      <a:off x="0" y="0"/>
+                      <a:ext cx="5067300" cy="2244850"/>
+                    </a:xfrm>
+                    <a:prstGeom prst="rect">
+                      <a:avLst/>
+                    </a:prstGeom>
+                    <a:noFill/>
+                    <a:ln w="9525">
+                      <a:noFill/>
+                      <a:headEnd/>
+                      <a:tailEnd/>
+                    </a:ln>
+                  </pic:spPr>
+                </pic:pic>
+              </a:graphicData>
+            </a:graphic>
+          </wp:inline>
+        </w:drawing>
+      </w:r>
+    </w:p>
+    <w:p>
+      <w:pPr>
+        <w:pStyle w:val="ImageCaption"/>
+      </w:pPr>
+      <w:r>
+        <w:t xml:space="preserve">Comparison of the four method paradigms across six qualitative dimensions.</w:t>
+      </w:r>
+      <w:r>
+        <w:t xml:space="preserve"> </w:t>
+      </w:r>
+      <w:r>
+        <w:t xml:space="preserve">(A) Radar chart. (B) Grouped dimension scores. Scores range 0–5 and reflect the</w:t>
+      </w:r>
+      <w:r>
+        <w:t xml:space="preserve"> </w:t>
+      </w:r>
+      <w:r>
+        <w:t xml:space="preserve">authors’ qualitative assessment from the survey in Section 3.</w:t>
+      </w:r>
+    </w:p>
+    <w:bookmarkEnd w:id="22"/>
+    <w:p>
+      <w:pPr>
+        <w:pStyle w:val="BodyText"/>
+      </w:pPr>
+      <w:r>
+        <w:t xml:space="preserve">Figure</w:t>
+      </w:r>
+      <w:r>
+        <w:t xml:space="preserve"> </w:t>
+      </w:r>
+      <w:r>
+        <w:t xml:space="preserve">@fig:comparison</w:t>
+      </w:r>
+      <w:r>
+        <w:t xml:space="preserve"> </w:t>
+      </w:r>
+      <w:r>
+        <w:t xml:space="preserve">summarises the qualitative trade-offs among the four</w:t>
+      </w:r>
+      <w:r>
+        <w:t xml:space="preserve"> </w:t>
+      </w:r>
+      <w:r>
+        <w:t xml:space="preserve">paradigms discussed below (Section 4.1) and detailed in Sections 3–5.</w:t>
+      </w:r>
+    </w:p>
+    <w:bookmarkStart w:id="23" w:name="cross-cutting-comparison"/>
     <w:p>
       <w:pPr>
         <w:pStyle w:val="Heading2"/>
@@ -3513,8 +3608,8 @@
         </w:tc>
       </w:tr>
     </w:tbl>
-    <w:bookmarkEnd w:id="19"/>
-    <w:bookmarkStart w:id="20" w:name="detailed-strengths-and-weaknesses"/>
+    <w:bookmarkEnd w:id="23"/>
+    <w:bookmarkStart w:id="24" w:name="detailed-strengths-and-weaknesses"/>
     <w:p>
       <w:pPr>
         <w:pStyle w:val="Heading2"/>
@@ -3812,9 +3907,9 @@
         <w:t xml:space="preserve">towards cancer cell lines.</w:t>
       </w:r>
     </w:p>
-    <w:bookmarkEnd w:id="20"/>
-    <w:bookmarkEnd w:id="21"/>
-    <w:bookmarkStart w:id="22" w:name="discussion"/>
+    <w:bookmarkEnd w:id="24"/>
+    <w:bookmarkEnd w:id="25"/>
+    <w:bookmarkStart w:id="26" w:name="discussion"/>
     <w:p>
       <w:pPr>
         <w:pStyle w:val="Heading1"/>
@@ -4018,8 +4113,8 @@
         <w:t xml:space="preserve">context modelling rather than a single global score.</w:t>
       </w:r>
     </w:p>
-    <w:bookmarkEnd w:id="22"/>
-    <w:bookmarkStart w:id="23" w:name="future-directions-ranked"/>
+    <w:bookmarkEnd w:id="26"/>
+    <w:bookmarkStart w:id="27" w:name="future-directions-ranked"/>
     <w:p>
       <w:pPr>
         <w:pStyle w:val="Heading1"/>
@@ -4301,8 +4396,8 @@
         <w:t xml:space="preserve">top-k enrichment — the measurement stick for every other improvement.</w:t>
       </w:r>
     </w:p>
-    <w:bookmarkEnd w:id="23"/>
-    <w:bookmarkStart w:id="24" w:name="recommended-roadmap-v2.0"/>
+    <w:bookmarkEnd w:id="27"/>
+    <w:bookmarkStart w:id="28" w:name="recommended-roadmap-v2.0"/>
     <w:p>
       <w:pPr>
         <w:pStyle w:val="Heading1"/>
@@ -4371,8 +4466,8 @@
         <w:t xml:space="preserve">DNA-LLM / cross-species (stretch).</w:t>
       </w:r>
     </w:p>
-    <w:bookmarkEnd w:id="24"/>
-    <w:bookmarkStart w:id="25" w:name="X857ac6d28bb025a3947393e3e79a0bba371abe5"/>
+    <w:bookmarkEnd w:id="28"/>
+    <w:bookmarkStart w:id="29" w:name="X857ac6d28bb025a3947393e3e79a0bba371abe5"/>
     <w:p>
       <w:pPr>
         <w:pStyle w:val="Heading1"/>
@@ -4553,8 +4648,8 @@
         <w:t xml:space="preserve">| L1000 / CMAP | perturbational signatures | clue.io |</w:t>
       </w:r>
     </w:p>
-    <w:bookmarkEnd w:id="25"/>
-    <w:bookmarkStart w:id="31" w:name="references"/>
+    <w:bookmarkEnd w:id="29"/>
+    <w:bookmarkStart w:id="35" w:name="references"/>
     <w:p>
       <w:pPr>
         <w:pStyle w:val="Heading1"/>
@@ -4563,7 +4658,7 @@
         <w:t xml:space="preserve">References</w:t>
       </w:r>
     </w:p>
-    <w:bookmarkStart w:id="26" w:name="benchmarks-functional-essentiality"/>
+    <w:bookmarkStart w:id="30" w:name="benchmarks-functional-essentiality"/>
     <w:p>
       <w:pPr>
         <w:pStyle w:val="Heading2"/>
@@ -4864,8 +4959,8 @@
         <w:t xml:space="preserve">2017. DOI:10.1016/j.cell.2017.10.049.</w:t>
       </w:r>
     </w:p>
-    <w:bookmarkEnd w:id="26"/>
-    <w:bookmarkStart w:id="27" w:name="inference-models"/>
+    <w:bookmarkEnd w:id="30"/>
+    <w:bookmarkStart w:id="31" w:name="inference-models"/>
     <w:p>
       <w:pPr>
         <w:pStyle w:val="Heading2"/>
@@ -4992,8 +5087,8 @@
         <w:t xml:space="preserve">DOI:10.15302/j-qb-022-0299.</w:t>
       </w:r>
     </w:p>
-    <w:bookmarkEnd w:id="27"/>
-    <w:bookmarkStart w:id="28" w:name="generative-sccrispr"/>
+    <w:bookmarkEnd w:id="31"/>
+    <w:bookmarkStart w:id="32" w:name="generative-sccrispr"/>
     <w:p>
       <w:pPr>
         <w:pStyle w:val="Heading2"/>
@@ -5058,8 +5153,8 @@
         <w:t xml:space="preserve">2025. DOI:10.1038/s44320-025-00131-3.</w:t>
       </w:r>
     </w:p>
-    <w:bookmarkEnd w:id="28"/>
-    <w:bookmarkStart w:id="29" w:name="deep-learning-predictors-arxiv-verified"/>
+    <w:bookmarkEnd w:id="32"/>
+    <w:bookmarkStart w:id="33" w:name="deep-learning-predictors-arxiv-verified"/>
     <w:p>
       <w:pPr>
         <w:pStyle w:val="Heading2"/>
@@ -5376,8 +5471,8 @@
         <w:t xml:space="preserve">(2026).</w:t>
       </w:r>
     </w:p>
-    <w:bookmarkEnd w:id="29"/>
-    <w:bookmarkStart w:id="30" w:name="others-from-direct-search"/>
+    <w:bookmarkEnd w:id="33"/>
+    <w:bookmarkStart w:id="34" w:name="others-from-direct-search"/>
     <w:p>
       <w:pPr>
         <w:pStyle w:val="Heading2"/>
@@ -5538,8 +5633,8 @@
         <w:t xml:space="preserve">DOI:10.1038/s41598-024-67023-8.</w:t>
       </w:r>
     </w:p>
-    <w:bookmarkEnd w:id="30"/>
-    <w:bookmarkEnd w:id="31"/>
+    <w:bookmarkEnd w:id="34"/>
+    <w:bookmarkEnd w:id="35"/>
     <w:sectPr>
       <w:footnotePr>
         <w:numRestart w:val="eachSect"/>

</xml_diff>

<commit_message>
Finalize DEGAS/scEVE/CHNet verification: document name collisions, exclude unverifiable citations (EN+ZH)
</commit_message>
<xml_diff>
--- a/manuscript_review.docx
+++ b/manuscript_review.docx
@@ -2945,7 +2945,7 @@
           <w:b/>
           <w:bCs/>
         </w:rPr>
-        <w:t xml:space="preserve">Verification note.</w:t>
+        <w:t xml:space="preserve">Verification note (2026-08-20).</w:t>
       </w:r>
       <w:r>
         <w:t xml:space="preserve"> </w:t>
@@ -2970,25 +2970,25 @@
         <w:t xml:space="preserve">(</w:t>
       </w:r>
       <w:r>
-        <w:t xml:space="preserve">“A deep generative model of</w:t>
-      </w:r>
-      <w:r>
-        <w:t xml:space="preserve"> </w:t>
-      </w:r>
-      <w:r>
-        <w:t xml:space="preserve">gene essentiality from single-cell CRISPR screens,”</w:t>
-      </w:r>
-      <w:r>
-        <w:t xml:space="preserve"> </w:t>
-      </w:r>
-      <w:r>
-        <w:t xml:space="preserve">attributed to Lorbeer, Tan,</w:t>
-      </w:r>
-      <w:r>
-        <w:t xml:space="preserve"> </w:t>
-      </w:r>
-      <w:r>
-        <w:t xml:space="preserve">et al., Nat Commun 2023) could</w:t>
+        <w:t xml:space="preserve">“A deep generative</w:t>
+      </w:r>
+      <w:r>
+        <w:t xml:space="preserve"> </w:t>
+      </w:r>
+      <w:r>
+        <w:t xml:space="preserve">model of gene essentiality from single-cell CRISPR screens,”</w:t>
+      </w:r>
+      <w:r>
+        <w:t xml:space="preserve"> </w:t>
+      </w:r>
+      <w:r>
+        <w:t xml:space="preserve">attributed to Lorbeer,</w:t>
+      </w:r>
+      <w:r>
+        <w:t xml:space="preserve"> </w:t>
+      </w:r>
+      <w:r>
+        <w:t xml:space="preserve">Tan, et al., Nat Commun 2023) could</w:t>
       </w:r>
       <w:r>
         <w:t xml:space="preserve"> </w:t>
@@ -3004,19 +3004,65 @@
         <w:t xml:space="preserve"> </w:t>
       </w:r>
       <w:r>
-        <w:t xml:space="preserve">through PubMed, Crossref,</w:t>
-      </w:r>
-      <w:r>
-        <w:t xml:space="preserve"> </w:t>
-      </w:r>
-      <w:r>
-        <w:t xml:space="preserve">Europe PMC, or arXiv title/name searches performed for this review, and no</w:t>
-      </w:r>
-      <w:r>
-        <w:t xml:space="preserve"> </w:t>
-      </w:r>
-      <w:r>
-        <w:t xml:space="preserve">canonical public repository was found. It is therefore</w:t>
+        <w:t xml:space="preserve">through any bibliographic</w:t>
+      </w:r>
+      <w:r>
+        <w:t xml:space="preserve"> </w:t>
+      </w:r>
+      <w:r>
+        <w:t xml:space="preserve">index used in this review (PubMed, Crossref, Europe PMC, OpenAlex, arXiv); no such</w:t>
+      </w:r>
+      <w:r>
+        <w:t xml:space="preserve"> </w:t>
+      </w:r>
+      <w:r>
+        <w:t xml:space="preserve">paper exists in these indices, and no Lorbeer/Tan Nat Commun 2023 record was found.</w:t>
+      </w:r>
+      <w:r>
+        <w:t xml:space="preserve"> </w:t>
+      </w:r>
+      <w:r>
+        <w:t xml:space="preserve">The acronym</w:t>
+      </w:r>
+      <w:r>
+        <w:t xml:space="preserve"> </w:t>
+      </w:r>
+      <w:r>
+        <w:t xml:space="preserve">“DEGAS”</w:t>
+      </w:r>
+      <w:r>
+        <w:t xml:space="preserve"> </w:t>
+      </w:r>
+      <w:r>
+        <w:t xml:space="preserve">instead resolves to an unrelated disease-cell transfer-learning</w:t>
+      </w:r>
+      <w:r>
+        <w:t xml:space="preserve"> </w:t>
+      </w:r>
+      <w:r>
+        <w:t xml:space="preserve">framework (Johnson et al.,</w:t>
+      </w:r>
+      <w:r>
+        <w:t xml:space="preserve"> </w:t>
+      </w:r>
+      <w:r>
+        <w:rPr>
+          <w:i/>
+          <w:iCs/>
+        </w:rPr>
+        <w:t xml:space="preserve">Genome Medicine</w:t>
+      </w:r>
+      <w:r>
+        <w:t xml:space="preserve"> </w:t>
+      </w:r>
+      <w:r>
+        <w:t xml:space="preserve">2022, DOI 10.1186/s13073-022-01012-2).</w:t>
+      </w:r>
+      <w:r>
+        <w:t xml:space="preserve"> </w:t>
+      </w:r>
+      <w:r>
+        <w:t xml:space="preserve">Accordingly, DEGAS is</w:t>
       </w:r>
       <w:r>
         <w:t xml:space="preserve"> </w:t>
@@ -3026,25 +3072,19 @@
           <w:b/>
           <w:bCs/>
         </w:rPr>
-        <w:t xml:space="preserve">not</w:t>
-      </w:r>
-      <w:r>
-        <w:t xml:space="preserve"> </w:t>
-      </w:r>
-      <w:r>
-        <w:t xml:space="preserve">included in the</w:t>
-      </w:r>
-      <w:r>
-        <w:t xml:space="preserve"> </w:t>
-      </w:r>
-      <w:r>
-        <w:t xml:space="preserve">verified table above; if it is to be cited, its DOI and authorship must be</w:t>
-      </w:r>
-      <w:r>
-        <w:t xml:space="preserve"> </w:t>
-      </w:r>
-      <w:r>
-        <w:t xml:space="preserve">confirmed from the original publication before submission. The same applies to</w:t>
+        <w:t xml:space="preserve">excluded</w:t>
+      </w:r>
+      <w:r>
+        <w:t xml:space="preserve"> </w:t>
+      </w:r>
+      <w:r>
+        <w:t xml:space="preserve">from this review and any DOI for it would be</w:t>
+      </w:r>
+      <w:r>
+        <w:t xml:space="preserve"> </w:t>
+      </w:r>
+      <w:r>
+        <w:t xml:space="preserve">fabricated. The same applies to</w:t>
       </w:r>
       <w:r>
         <w:t xml:space="preserve"> </w:t>
@@ -3073,23 +3113,59 @@
         <w:t xml:space="preserve">CHNet</w:t>
       </w:r>
       <w:r>
-        <w:t xml:space="preserve">, which appear in the essentiality literature but could not</w:t>
-      </w:r>
-      <w:r>
-        <w:t xml:space="preserve"> </w:t>
-      </w:r>
-      <w:r>
-        <w:t xml:space="preserve">be verified against public APIs or a canonical repository.</w:t>
+        <w:t xml:space="preserve">: scEVE resolves to an</w:t>
+      </w:r>
+      <w:r>
+        <w:t xml:space="preserve"> </w:t>
+      </w:r>
+      <w:r>
+        <w:t xml:space="preserve">unrelated single-cell clustering algorithm (Asloudj et al.,</w:t>
+      </w:r>
+      <w:r>
+        <w:t xml:space="preserve"> </w:t>
+      </w:r>
+      <w:r>
+        <w:rPr>
+          <w:i/>
+          <w:iCs/>
+        </w:rPr>
+        <w:t xml:space="preserve">NAR Genomics</w:t>
+      </w:r>
+      <w:r>
+        <w:rPr>
+          <w:i/>
+          <w:iCs/>
+        </w:rPr>
+        <w:t xml:space="preserve"> </w:t>
+      </w:r>
+      <w:r>
+        <w:rPr>
+          <w:i/>
+          <w:iCs/>
+        </w:rPr>
+        <w:t xml:space="preserve">Bioinformatics</w:t>
+      </w:r>
+      <w:r>
+        <w:t xml:space="preserve"> </w:t>
+      </w:r>
+      <w:r>
+        <w:t xml:space="preserve">2025, DOI 10.1093/nargab/lqaf073), and CHNet could not be verified.</w:t>
+      </w:r>
+      <w:r>
+        <w:t xml:space="preserve"> </w:t>
+      </w:r>
+      <w:r>
+        <w:t xml:space="preserve">Readers should confirm primary sources directly before citing these names.</w:t>
       </w:r>
     </w:p>
     <w:bookmarkEnd w:id="16"/>
-    <w:bookmarkStart w:id="17" w:name="Xc688dba9e5b163f075bcc68997f2c16654b2e23"/>
+    <w:bookmarkStart w:id="17" w:name="Xbdd3ca2f6f45f59d842be0f487f80c8c5c5cdb5"/>
     <w:p>
       <w:pPr>
         <w:pStyle w:val="Heading2"/>
       </w:pPr>
       <w:r>
-        <w:t xml:space="preserve">3.5 Methods with no canonical public repository</w:t>
+        <w:t xml:space="preserve">3.5 Methods with no canonical public repository / unverified citations</w:t>
       </w:r>
     </w:p>
     <w:p>
@@ -3133,25 +3209,77 @@
         <w:t xml:space="preserve"> </w:t>
       </w:r>
       <w:r>
-        <w:t xml:space="preserve">appear in the literature but could not be</w:t>
-      </w:r>
-      <w:r>
-        <w:t xml:space="preserve"> </w:t>
-      </w:r>
-      <w:r>
-        <w:t xml:space="preserve">verified in this survey (neither a canonical GitHub repository nor a resolvable</w:t>
-      </w:r>
-      <w:r>
-        <w:t xml:space="preserve"> </w:t>
-      </w:r>
-      <w:r>
-        <w:t xml:space="preserve">DOI via PubMed/Crossref/Europe PMC/arXiv). They should be sourced directly from</w:t>
-      </w:r>
-      <w:r>
-        <w:t xml:space="preserve"> </w:t>
-      </w:r>
-      <w:r>
-        <w:t xml:space="preserve">their papers, with DOI and authorship confirmed, before being cited.</w:t>
+        <w:t xml:space="preserve">are names that appear in secondary sources but</w:t>
+      </w:r>
+      <w:r>
+        <w:t xml:space="preserve"> </w:t>
+      </w:r>
+      <w:r>
+        <w:t xml:space="preserve">could not be verified as gene-essentiality methods in any bibliographic index</w:t>
+      </w:r>
+      <w:r>
+        <w:t xml:space="preserve"> </w:t>
+      </w:r>
+      <w:r>
+        <w:t xml:space="preserve">(PubMed, Crossref, Europe PMC, OpenAlex, arXiv). In each case the acronym resolves</w:t>
+      </w:r>
+      <w:r>
+        <w:t xml:space="preserve"> </w:t>
+      </w:r>
+      <w:r>
+        <w:t xml:space="preserve">to an unrelated tool: DEGAS → disease-cell transfer learning (Johnson et al. 2022);</w:t>
+      </w:r>
+      <w:r>
+        <w:t xml:space="preserve"> </w:t>
+      </w:r>
+      <w:r>
+        <w:t xml:space="preserve">scEVE → ensemble clustering (Asloudj et al. 2025); CHNet → unverifiable. These are</w:t>
+      </w:r>
+      <w:r>
+        <w:t xml:space="preserve"> </w:t>
+      </w:r>
+      <w:r>
+        <w:t xml:space="preserve">therefore</w:t>
+      </w:r>
+      <w:r>
+        <w:t xml:space="preserve"> </w:t>
+      </w:r>
+      <w:r>
+        <w:rPr>
+          <w:b/>
+          <w:bCs/>
+        </w:rPr>
+        <w:t xml:space="preserve">excluded</w:t>
+      </w:r>
+      <w:r>
+        <w:t xml:space="preserve"> </w:t>
+      </w:r>
+      <w:r>
+        <w:t xml:space="preserve">from the verified survey, and no citation is provided for</w:t>
+      </w:r>
+      <w:r>
+        <w:t xml:space="preserve"> </w:t>
+      </w:r>
+      <w:r>
+        <w:t xml:space="preserve">them. If the intended</w:t>
+      </w:r>
+      <w:r>
+        <w:t xml:space="preserve"> </w:t>
+      </w:r>
+      <w:r>
+        <w:t xml:space="preserve">“DEGAS gene-essentiality”</w:t>
+      </w:r>
+      <w:r>
+        <w:t xml:space="preserve"> </w:t>
+      </w:r>
+      <w:r>
+        <w:t xml:space="preserve">paper genuinely exists, its details</w:t>
+      </w:r>
+      <w:r>
+        <w:t xml:space="preserve"> </w:t>
+      </w:r>
+      <w:r>
+        <w:t xml:space="preserve">must be obtained from a primary source before citation.</w:t>
       </w:r>
     </w:p>
     <w:bookmarkEnd w:id="17"/>

</xml_diff>